<commit_message>
Power Query Cleaning and Transformation
</commit_message>
<xml_diff>
--- a/Report.docx
+++ b/Report.docx
@@ -3,32 +3,34 @@
 <w:document xmlns:wpc="http://schemas.microsoft.com/office/word/2010/wordprocessingCanvas" xmlns:cx="http://schemas.microsoft.com/office/drawing/2014/chartex" xmlns:cx1="http://schemas.microsoft.com/office/drawing/2015/9/8/chartex" xmlns:cx2="http://schemas.microsoft.com/office/drawing/2015/10/21/chartex" xmlns:cx3="http://schemas.microsoft.com/office/drawing/2016/5/9/chartex" xmlns:cx4="http://schemas.microsoft.com/office/drawing/2016/5/10/chartex" xmlns:cx5="http://schemas.microsoft.com/office/drawing/2016/5/11/chartex" xmlns:cx6="http://schemas.microsoft.com/office/drawing/2016/5/12/chartex" xmlns:cx7="http://schemas.microsoft.com/office/drawing/2016/5/13/chartex" xmlns:cx8="http://schemas.microsoft.com/office/drawing/2016/5/14/chartex" xmlns:mc="http://schemas.openxmlformats.org/markup-compatibility/2006" xmlns:aink="http://schemas.microsoft.com/office/drawing/2016/ink" xmlns:am3d="http://schemas.microsoft.com/office/drawing/2017/model3d" xmlns:o="urn:schemas-microsoft-com:office:office" xmlns:oel="http://schemas.microsoft.com/office/2019/extlst" xmlns:r="http://schemas.openxmlformats.org/officeDocument/2006/relationships" xmlns:m="http://schemas.openxmlformats.org/officeDocument/2006/math" xmlns:v="urn:schemas-microsoft-com:vml" xmlns:wp14="http://schemas.microsoft.com/office/word/2010/wordprocessingDrawing" xmlns:wp="http://schemas.openxmlformats.org/drawingml/2006/wordprocessingDrawing" xmlns:w10="urn:schemas-microsoft-com:office:word" xmlns:w="http://schemas.openxmlformats.org/wordprocessingml/2006/main" xmlns:w14="http://schemas.microsoft.com/office/word/2010/wordml" xmlns:w15="http://schemas.microsoft.com/office/word/2012/wordml" xmlns:w16cex="http://schemas.microsoft.com/office/word/2018/wordml/cex" xmlns:w16cid="http://schemas.microsoft.com/office/word/2016/wordml/cid" xmlns:w16="http://schemas.microsoft.com/office/word/2018/wordml" xmlns:w16du="http://schemas.microsoft.com/office/word/2023/wordml/word16du" xmlns:w16sdtdh="http://schemas.microsoft.com/office/word/2020/wordml/sdtdatahash" xmlns:w16sdtfl="http://schemas.microsoft.com/office/word/2024/wordml/sdtformatlock" xmlns:w16se="http://schemas.microsoft.com/office/word/2015/wordml/symex" xmlns:wpg="http://schemas.microsoft.com/office/word/2010/wordprocessingGroup" xmlns:wpi="http://schemas.microsoft.com/office/word/2010/wordprocessingInk" xmlns:wne="http://schemas.microsoft.com/office/word/2006/wordml" xmlns:wps="http://schemas.microsoft.com/office/word/2010/wordprocessingShape" mc:Ignorable="w14 w15 w16se w16cid w16 w16cex w16sdtdh w16sdtfl w16du wp14">
   <w:body>
     <w:p>
-      <w:r>
-        <w:t>Domain: E-commerce Analytics</w:t>
+      <w:pPr>
+        <w:jc w:val="center"/>
+      </w:pPr>
+      <w:r>
+        <w:rPr>
+          <w:b/>
+          <w:bCs/>
+        </w:rPr>
+        <w:t>E-commerce Analytics</w:t>
       </w:r>
       <w:r>
         <w:br/>
-        <w:t xml:space="preserve">Source: Kaggle — Brazilian E-Commerce Public Dataset by </w:t>
-      </w:r>
-      <w:proofErr w:type="spellStart"/>
-      <w:r>
-        <w:t>Olist</w:t>
-      </w:r>
-      <w:proofErr w:type="spellEnd"/>
+      </w:r>
+      <w:r>
+        <w:rPr>
+          <w:b/>
+          <w:bCs/>
+        </w:rPr>
+        <w:t>Brazilian E-Commerce Public Dataset by Olist</w:t>
+      </w:r>
+    </w:p>
+    <w:p>
       <w:r>
         <w:br/>
       </w:r>
       <w:r>
         <w:br/>
-        <w:t>Business problem: </w:t>
-      </w:r>
-      <w:proofErr w:type="spellStart"/>
-      <w:r>
-        <w:t>Olist</w:t>
-      </w:r>
-      <w:proofErr w:type="spellEnd"/>
-      <w:r>
-        <w:t xml:space="preserve"> management needs visibility into sales performance, delivery efficiency, customer satisfaction, and product category trends across Brazil (2016–2018) to make data-driven decisions on logistics investment, product strategy, and regional market expansion.</w:t>
+        <w:t>Business problem: Olist management needs visibility into sales performance, delivery efficiency, customer satisfaction, and product category trends across Brazil (2016–2018) to make data-driven decisions on logistics investment, product strategy, and regional market expansion.</w:t>
       </w:r>
     </w:p>
     <w:p>
@@ -49,7 +51,7 @@
                     <pic:cNvPicPr/>
                   </pic:nvPicPr>
                   <pic:blipFill>
-                    <a:blip r:embed="rId4"/>
+                    <a:blip r:embed="rId5"/>
                     <a:stretch>
                       <a:fillRect/>
                     </a:stretch>
@@ -74,40 +76,12 @@
       <w:r>
         <w:t>URL: </w:t>
       </w:r>
-      <w:hyperlink r:id="rId5" w:history="1">
+      <w:hyperlink r:id="rId6" w:history="1">
         <w:r>
           <w:rPr>
             <w:rStyle w:val="Hyperlink"/>
           </w:rPr>
-          <w:t>kaggle.com/datasets/</w:t>
-        </w:r>
-        <w:proofErr w:type="spellStart"/>
-        <w:r>
-          <w:rPr>
-            <w:rStyle w:val="Hyperlink"/>
-          </w:rPr>
-          <w:t>olistbr</w:t>
-        </w:r>
-        <w:proofErr w:type="spellEnd"/>
-        <w:r>
-          <w:rPr>
-            <w:rStyle w:val="Hyperlink"/>
-          </w:rPr>
-          <w:t>/</w:t>
-        </w:r>
-        <w:proofErr w:type="spellStart"/>
-        <w:r>
-          <w:rPr>
-            <w:rStyle w:val="Hyperlink"/>
-          </w:rPr>
-          <w:t>brazilian</w:t>
-        </w:r>
-        <w:proofErr w:type="spellEnd"/>
-        <w:r>
-          <w:rPr>
-            <w:rStyle w:val="Hyperlink"/>
-          </w:rPr>
-          <w:t>-ecommerce</w:t>
+          <w:t>kaggle.com/datasets/olistbr/brazilian-ecommerce</w:t>
         </w:r>
       </w:hyperlink>
       <w:r>
@@ -117,107 +91,3619 @@
     </w:p>
     <w:p/>
     <w:p>
-      <w:r>
-        <w:t xml:space="preserve">The </w:t>
-      </w:r>
-      <w:proofErr w:type="spellStart"/>
-      <w:r>
-        <w:t>Olist</w:t>
-      </w:r>
-      <w:proofErr w:type="spellEnd"/>
-      <w:r>
-        <w:t xml:space="preserve"> dataset satisfies all advanced analysis requirements: it contains 6 related tables linked by shared keys (</w:t>
-      </w:r>
-      <w:proofErr w:type="spellStart"/>
-      <w:r>
-        <w:t>order_id</w:t>
-      </w:r>
-      <w:proofErr w:type="spellEnd"/>
+      <w:pPr>
+        <w:rPr>
+          <w:b/>
+          <w:bCs/>
+          <w:lang w:val="en-KE"/>
+        </w:rPr>
+      </w:pPr>
+      <w:r>
+        <w:rPr>
+          <w:b/>
+          <w:bCs/>
+          <w:lang w:val="en-KE"/>
+        </w:rPr>
+        <w:t xml:space="preserve">Why this dataset is suitable </w:t>
+      </w:r>
+    </w:p>
+    <w:p>
+      <w:pPr>
+        <w:rPr>
+          <w:lang w:val="en-KE"/>
+        </w:rPr>
+      </w:pPr>
+      <w:r>
+        <w:rPr>
+          <w:lang w:val="en-KE"/>
+        </w:rPr>
+        <w:t>The Olist dataset satisfies all advanced analysis requirements. It contains 8 related tables linked by shared keys (order_id, customer_id, product_id, geolocation_zip_code_prefix) enabling a proper star schema. The main orders table has 99,441 rows, far exceeding the 9,000 minimum. It contains both categorical variables (order_status, payment_type, customer_state, product_category, delivery_status) and numerical variables (price, freight_value, review_score, payment_installments, latitude, longitude). The order_purchase_timestamp field spans September 2016 to October 2018 enabling full time-intelligence analysis. The geolocation dataset adds real latitude and longitude coordinates enabling precise geographic mapping at zip code level — a significant analytical capability beyond simple state-level analysis.</w:t>
+      </w:r>
+    </w:p>
+    <w:p/>
+    <w:p>
+      <w:pPr>
+        <w:rPr>
+          <w:b/>
+          <w:bCs/>
+        </w:rPr>
+      </w:pPr>
+      <w:r>
+        <w:rPr>
+          <w:b/>
+          <w:bCs/>
+        </w:rPr>
+        <w:t>CSV files</w:t>
+      </w:r>
+      <w:r>
+        <w:rPr>
+          <w:b/>
+          <w:bCs/>
+        </w:rPr>
+        <w:t>:</w:t>
+      </w:r>
+    </w:p>
+    <w:p>
+      <w:pPr>
+        <w:rPr>
+          <w:b/>
+          <w:bCs/>
+          <w:lang w:val="en-KE"/>
+        </w:rPr>
+      </w:pPr>
+      <w:r>
+        <w:rPr>
+          <w:b/>
+          <w:bCs/>
+          <w:lang w:val="en-KE"/>
+        </w:rPr>
+        <w:t>olist_orders_dataset.csv</w:t>
+      </w:r>
+    </w:p>
+    <w:p>
+      <w:pPr>
+        <w:rPr>
+          <w:b/>
+          <w:bCs/>
+          <w:lang w:val="en-KE"/>
+        </w:rPr>
+      </w:pPr>
+      <w:r>
+        <w:rPr>
+          <w:b/>
+          <w:bCs/>
+          <w:lang w:val="en-KE"/>
+        </w:rPr>
+        <w:drawing>
+          <wp:inline distT="0" distB="0" distL="0" distR="0" wp14:anchorId="59279651" wp14:editId="5ADBCBD6">
+            <wp:extent cx="5731510" cy="546100"/>
+            <wp:effectExtent l="0" t="0" r="2540" b="6350"/>
+            <wp:docPr id="240763881" name="Picture 1"/>
+            <wp:cNvGraphicFramePr>
+              <a:graphicFrameLocks xmlns:a="http://schemas.openxmlformats.org/drawingml/2006/main" noChangeAspect="1"/>
+            </wp:cNvGraphicFramePr>
+            <a:graphic xmlns:a="http://schemas.openxmlformats.org/drawingml/2006/main">
+              <a:graphicData uri="http://schemas.openxmlformats.org/drawingml/2006/picture">
+                <pic:pic xmlns:pic="http://schemas.openxmlformats.org/drawingml/2006/picture">
+                  <pic:nvPicPr>
+                    <pic:cNvPr id="240763881" name=""/>
+                    <pic:cNvPicPr/>
+                  </pic:nvPicPr>
+                  <pic:blipFill>
+                    <a:blip r:embed="rId7"/>
+                    <a:stretch>
+                      <a:fillRect/>
+                    </a:stretch>
+                  </pic:blipFill>
+                  <pic:spPr>
+                    <a:xfrm>
+                      <a:off x="0" y="0"/>
+                      <a:ext cx="5731510" cy="546100"/>
+                    </a:xfrm>
+                    <a:prstGeom prst="rect">
+                      <a:avLst/>
+                    </a:prstGeom>
+                  </pic:spPr>
+                </pic:pic>
+              </a:graphicData>
+            </a:graphic>
+          </wp:inline>
+        </w:drawing>
+      </w:r>
+    </w:p>
+    <w:p>
+      <w:pPr>
+        <w:rPr>
+          <w:b/>
+          <w:bCs/>
+          <w:lang w:val="en-KE"/>
+        </w:rPr>
+      </w:pPr>
+      <w:r>
+        <w:rPr>
+          <w:b/>
+          <w:bCs/>
+          <w:lang w:val="en-KE"/>
+        </w:rPr>
+        <w:t>olist_order_items_dataset.csv</w:t>
+      </w:r>
+      <w:r>
+        <w:rPr>
+          <w:b/>
+          <w:bCs/>
+          <w:lang w:val="en-KE"/>
+        </w:rPr>
+        <w:t xml:space="preserve">  </w:t>
+      </w:r>
+    </w:p>
+    <w:p>
+      <w:pPr>
+        <w:rPr>
+          <w:b/>
+          <w:bCs/>
+          <w:lang w:val="en-KE"/>
+        </w:rPr>
+      </w:pPr>
+      <w:r>
+        <w:rPr>
+          <w:b/>
+          <w:bCs/>
+          <w:lang w:val="en-KE"/>
+        </w:rPr>
+        <w:lastRenderedPageBreak/>
+        <w:drawing>
+          <wp:inline distT="0" distB="0" distL="0" distR="0" wp14:anchorId="25352C60" wp14:editId="3671E5E0">
+            <wp:extent cx="5731510" cy="927735"/>
+            <wp:effectExtent l="0" t="0" r="2540" b="5715"/>
+            <wp:docPr id="2095308858" name="Picture 1"/>
+            <wp:cNvGraphicFramePr>
+              <a:graphicFrameLocks xmlns:a="http://schemas.openxmlformats.org/drawingml/2006/main" noChangeAspect="1"/>
+            </wp:cNvGraphicFramePr>
+            <a:graphic xmlns:a="http://schemas.openxmlformats.org/drawingml/2006/main">
+              <a:graphicData uri="http://schemas.openxmlformats.org/drawingml/2006/picture">
+                <pic:pic xmlns:pic="http://schemas.openxmlformats.org/drawingml/2006/picture">
+                  <pic:nvPicPr>
+                    <pic:cNvPr id="2095308858" name=""/>
+                    <pic:cNvPicPr/>
+                  </pic:nvPicPr>
+                  <pic:blipFill>
+                    <a:blip r:embed="rId8"/>
+                    <a:stretch>
+                      <a:fillRect/>
+                    </a:stretch>
+                  </pic:blipFill>
+                  <pic:spPr>
+                    <a:xfrm>
+                      <a:off x="0" y="0"/>
+                      <a:ext cx="5731510" cy="927735"/>
+                    </a:xfrm>
+                    <a:prstGeom prst="rect">
+                      <a:avLst/>
+                    </a:prstGeom>
+                  </pic:spPr>
+                </pic:pic>
+              </a:graphicData>
+            </a:graphic>
+          </wp:inline>
+        </w:drawing>
+      </w:r>
+    </w:p>
+    <w:p>
+      <w:pPr>
+        <w:rPr>
+          <w:b/>
+          <w:bCs/>
+          <w:lang w:val="en-KE"/>
+        </w:rPr>
+      </w:pPr>
+      <w:r>
+        <w:rPr>
+          <w:b/>
+          <w:bCs/>
+          <w:lang w:val="en-KE"/>
+        </w:rPr>
+        <w:t>olist_order_payments_dataset.</w:t>
+      </w:r>
+      <w:r>
+        <w:rPr>
+          <w:b/>
+          <w:bCs/>
+          <w:lang w:val="en-KE"/>
+        </w:rPr>
+        <w:t>csv</w:t>
+      </w:r>
+    </w:p>
+    <w:p>
+      <w:pPr>
+        <w:rPr>
+          <w:b/>
+          <w:bCs/>
+          <w:lang w:val="en-KE"/>
+        </w:rPr>
+      </w:pPr>
+      <w:r>
+        <w:rPr>
+          <w:b/>
+          <w:bCs/>
+          <w:lang w:val="en-KE"/>
+        </w:rPr>
+        <w:drawing>
+          <wp:inline distT="0" distB="0" distL="0" distR="0" wp14:anchorId="0F97F632" wp14:editId="1D2E8EFE">
+            <wp:extent cx="3990975" cy="981162"/>
+            <wp:effectExtent l="0" t="0" r="0" b="9525"/>
+            <wp:docPr id="466478893" name="Picture 1"/>
+            <wp:cNvGraphicFramePr>
+              <a:graphicFrameLocks xmlns:a="http://schemas.openxmlformats.org/drawingml/2006/main" noChangeAspect="1"/>
+            </wp:cNvGraphicFramePr>
+            <a:graphic xmlns:a="http://schemas.openxmlformats.org/drawingml/2006/main">
+              <a:graphicData uri="http://schemas.openxmlformats.org/drawingml/2006/picture">
+                <pic:pic xmlns:pic="http://schemas.openxmlformats.org/drawingml/2006/picture">
+                  <pic:nvPicPr>
+                    <pic:cNvPr id="466478893" name=""/>
+                    <pic:cNvPicPr/>
+                  </pic:nvPicPr>
+                  <pic:blipFill>
+                    <a:blip r:embed="rId9"/>
+                    <a:stretch>
+                      <a:fillRect/>
+                    </a:stretch>
+                  </pic:blipFill>
+                  <pic:spPr>
+                    <a:xfrm>
+                      <a:off x="0" y="0"/>
+                      <a:ext cx="4040311" cy="993291"/>
+                    </a:xfrm>
+                    <a:prstGeom prst="rect">
+                      <a:avLst/>
+                    </a:prstGeom>
+                  </pic:spPr>
+                </pic:pic>
+              </a:graphicData>
+            </a:graphic>
+          </wp:inline>
+        </w:drawing>
+      </w:r>
+    </w:p>
+    <w:p>
+      <w:pPr>
+        <w:rPr>
+          <w:b/>
+          <w:bCs/>
+          <w:lang w:val="en-KE"/>
+        </w:rPr>
+      </w:pPr>
+      <w:r>
+        <w:rPr>
+          <w:b/>
+          <w:bCs/>
+          <w:lang w:val="en-KE"/>
+        </w:rPr>
+        <w:t>olist_order_reviews_dataset.csv</w:t>
+      </w:r>
+      <w:r>
+        <w:rPr>
+          <w:b/>
+          <w:bCs/>
+          <w:lang w:val="en-KE"/>
+        </w:rPr>
+        <w:t xml:space="preserve"> </w:t>
+      </w:r>
+    </w:p>
+    <w:p>
+      <w:pPr>
+        <w:rPr>
+          <w:b/>
+          <w:bCs/>
+          <w:lang w:val="en-KE"/>
+        </w:rPr>
+      </w:pPr>
+      <w:r>
+        <w:rPr>
+          <w:b/>
+          <w:bCs/>
+          <w:lang w:val="en-KE"/>
+        </w:rPr>
+        <w:drawing>
+          <wp:inline distT="0" distB="0" distL="0" distR="0" wp14:anchorId="64E6FED9" wp14:editId="6F980456">
+            <wp:extent cx="5731510" cy="728345"/>
+            <wp:effectExtent l="0" t="0" r="2540" b="0"/>
+            <wp:docPr id="833116778" name="Picture 1"/>
+            <wp:cNvGraphicFramePr>
+              <a:graphicFrameLocks xmlns:a="http://schemas.openxmlformats.org/drawingml/2006/main" noChangeAspect="1"/>
+            </wp:cNvGraphicFramePr>
+            <a:graphic xmlns:a="http://schemas.openxmlformats.org/drawingml/2006/main">
+              <a:graphicData uri="http://schemas.openxmlformats.org/drawingml/2006/picture">
+                <pic:pic xmlns:pic="http://schemas.openxmlformats.org/drawingml/2006/picture">
+                  <pic:nvPicPr>
+                    <pic:cNvPr id="833116778" name=""/>
+                    <pic:cNvPicPr/>
+                  </pic:nvPicPr>
+                  <pic:blipFill>
+                    <a:blip r:embed="rId10"/>
+                    <a:stretch>
+                      <a:fillRect/>
+                    </a:stretch>
+                  </pic:blipFill>
+                  <pic:spPr>
+                    <a:xfrm>
+                      <a:off x="0" y="0"/>
+                      <a:ext cx="5731510" cy="728345"/>
+                    </a:xfrm>
+                    <a:prstGeom prst="rect">
+                      <a:avLst/>
+                    </a:prstGeom>
+                  </pic:spPr>
+                </pic:pic>
+              </a:graphicData>
+            </a:graphic>
+          </wp:inline>
+        </w:drawing>
+      </w:r>
+    </w:p>
+    <w:p>
+      <w:pPr>
+        <w:rPr>
+          <w:b/>
+          <w:bCs/>
+          <w:lang w:val="en-KE"/>
+        </w:rPr>
+      </w:pPr>
+      <w:r>
+        <w:rPr>
+          <w:b/>
+          <w:bCs/>
+          <w:lang w:val="en-KE"/>
+        </w:rPr>
+        <w:t>olist_products_dataset.csv</w:t>
+      </w:r>
+      <w:r>
+        <w:rPr>
+          <w:b/>
+          <w:bCs/>
+          <w:lang w:val="en-KE"/>
+        </w:rPr>
+        <w:t xml:space="preserve"> </w:t>
+      </w:r>
+    </w:p>
+    <w:p>
+      <w:pPr>
+        <w:rPr>
+          <w:b/>
+          <w:bCs/>
+          <w:lang w:val="en-KE"/>
+        </w:rPr>
+      </w:pPr>
+      <w:r>
+        <w:rPr>
+          <w:b/>
+          <w:bCs/>
+          <w:lang w:val="en-KE"/>
+        </w:rPr>
+        <w:drawing>
+          <wp:inline distT="0" distB="0" distL="0" distR="0" wp14:anchorId="6567EE1F" wp14:editId="0E008E7B">
+            <wp:extent cx="5731510" cy="941705"/>
+            <wp:effectExtent l="0" t="0" r="2540" b="0"/>
+            <wp:docPr id="698783556" name="Picture 1"/>
+            <wp:cNvGraphicFramePr>
+              <a:graphicFrameLocks xmlns:a="http://schemas.openxmlformats.org/drawingml/2006/main" noChangeAspect="1"/>
+            </wp:cNvGraphicFramePr>
+            <a:graphic xmlns:a="http://schemas.openxmlformats.org/drawingml/2006/main">
+              <a:graphicData uri="http://schemas.openxmlformats.org/drawingml/2006/picture">
+                <pic:pic xmlns:pic="http://schemas.openxmlformats.org/drawingml/2006/picture">
+                  <pic:nvPicPr>
+                    <pic:cNvPr id="698783556" name=""/>
+                    <pic:cNvPicPr/>
+                  </pic:nvPicPr>
+                  <pic:blipFill>
+                    <a:blip r:embed="rId11"/>
+                    <a:stretch>
+                      <a:fillRect/>
+                    </a:stretch>
+                  </pic:blipFill>
+                  <pic:spPr>
+                    <a:xfrm>
+                      <a:off x="0" y="0"/>
+                      <a:ext cx="5731510" cy="941705"/>
+                    </a:xfrm>
+                    <a:prstGeom prst="rect">
+                      <a:avLst/>
+                    </a:prstGeom>
+                  </pic:spPr>
+                </pic:pic>
+              </a:graphicData>
+            </a:graphic>
+          </wp:inline>
+        </w:drawing>
+      </w:r>
+    </w:p>
+    <w:p>
+      <w:pPr>
+        <w:rPr>
+          <w:b/>
+          <w:bCs/>
+          <w:lang w:val="en-KE"/>
+        </w:rPr>
+      </w:pPr>
+      <w:r>
+        <w:rPr>
+          <w:b/>
+          <w:bCs/>
+          <w:lang w:val="en-KE"/>
+        </w:rPr>
+        <w:t>olist_customers_dataset.csv</w:t>
+      </w:r>
+    </w:p>
+    <w:p>
+      <w:pPr>
+        <w:rPr>
+          <w:b/>
+          <w:bCs/>
+          <w:lang w:val="en-KE"/>
+        </w:rPr>
+      </w:pPr>
+      <w:r>
+        <w:rPr>
+          <w:b/>
+          <w:bCs/>
+          <w:lang w:val="en-KE"/>
+        </w:rPr>
+        <w:drawing>
+          <wp:inline distT="0" distB="0" distL="0" distR="0" wp14:anchorId="3662BBF0" wp14:editId="5C08E9A6">
+            <wp:extent cx="5731510" cy="885825"/>
+            <wp:effectExtent l="0" t="0" r="2540" b="9525"/>
+            <wp:docPr id="1181047189" name="Picture 1"/>
+            <wp:cNvGraphicFramePr>
+              <a:graphicFrameLocks xmlns:a="http://schemas.openxmlformats.org/drawingml/2006/main" noChangeAspect="1"/>
+            </wp:cNvGraphicFramePr>
+            <a:graphic xmlns:a="http://schemas.openxmlformats.org/drawingml/2006/main">
+              <a:graphicData uri="http://schemas.openxmlformats.org/drawingml/2006/picture">
+                <pic:pic xmlns:pic="http://schemas.openxmlformats.org/drawingml/2006/picture">
+                  <pic:nvPicPr>
+                    <pic:cNvPr id="1181047189" name=""/>
+                    <pic:cNvPicPr/>
+                  </pic:nvPicPr>
+                  <pic:blipFill>
+                    <a:blip r:embed="rId12"/>
+                    <a:stretch>
+                      <a:fillRect/>
+                    </a:stretch>
+                  </pic:blipFill>
+                  <pic:spPr>
+                    <a:xfrm>
+                      <a:off x="0" y="0"/>
+                      <a:ext cx="5731510" cy="885825"/>
+                    </a:xfrm>
+                    <a:prstGeom prst="rect">
+                      <a:avLst/>
+                    </a:prstGeom>
+                  </pic:spPr>
+                </pic:pic>
+              </a:graphicData>
+            </a:graphic>
+          </wp:inline>
+        </w:drawing>
+      </w:r>
+    </w:p>
+    <w:p>
+      <w:pPr>
+        <w:rPr>
+          <w:b/>
+          <w:bCs/>
+          <w:lang w:val="en-KE"/>
+        </w:rPr>
+      </w:pPr>
+      <w:r>
+        <w:rPr>
+          <w:b/>
+          <w:bCs/>
+          <w:lang w:val="en-KE"/>
+        </w:rPr>
+        <w:t>product_category_name_translation.csv</w:t>
+      </w:r>
+      <w:r>
+        <w:rPr>
+          <w:b/>
+          <w:bCs/>
+          <w:lang w:val="en-KE"/>
+        </w:rPr>
+        <w:t xml:space="preserve"> </w:t>
+      </w:r>
+    </w:p>
+    <w:p>
+      <w:pPr>
+        <w:rPr>
+          <w:b/>
+          <w:bCs/>
+        </w:rPr>
+      </w:pPr>
+      <w:r>
+        <w:rPr>
+          <w:b/>
+          <w:bCs/>
+        </w:rPr>
+        <w:drawing>
+          <wp:inline distT="0" distB="0" distL="0" distR="0" wp14:anchorId="2A197760" wp14:editId="74479D18">
+            <wp:extent cx="3152775" cy="962982"/>
+            <wp:effectExtent l="0" t="0" r="0" b="8890"/>
+            <wp:docPr id="1805676049" name="Picture 1"/>
+            <wp:cNvGraphicFramePr>
+              <a:graphicFrameLocks xmlns:a="http://schemas.openxmlformats.org/drawingml/2006/main" noChangeAspect="1"/>
+            </wp:cNvGraphicFramePr>
+            <a:graphic xmlns:a="http://schemas.openxmlformats.org/drawingml/2006/main">
+              <a:graphicData uri="http://schemas.openxmlformats.org/drawingml/2006/picture">
+                <pic:pic xmlns:pic="http://schemas.openxmlformats.org/drawingml/2006/picture">
+                  <pic:nvPicPr>
+                    <pic:cNvPr id="1805676049" name=""/>
+                    <pic:cNvPicPr/>
+                  </pic:nvPicPr>
+                  <pic:blipFill>
+                    <a:blip r:embed="rId13"/>
+                    <a:stretch>
+                      <a:fillRect/>
+                    </a:stretch>
+                  </pic:blipFill>
+                  <pic:spPr>
+                    <a:xfrm>
+                      <a:off x="0" y="0"/>
+                      <a:ext cx="3181894" cy="971876"/>
+                    </a:xfrm>
+                    <a:prstGeom prst="rect">
+                      <a:avLst/>
+                    </a:prstGeom>
+                  </pic:spPr>
+                </pic:pic>
+              </a:graphicData>
+            </a:graphic>
+          </wp:inline>
+        </w:drawing>
+      </w:r>
+    </w:p>
+    <w:p>
+      <w:pPr>
+        <w:rPr>
+          <w:b/>
+          <w:bCs/>
+        </w:rPr>
+      </w:pPr>
+      <w:r>
+        <w:rPr>
+          <w:b/>
+          <w:bCs/>
+        </w:rPr>
+        <w:t>olist_geolocation_dataset.csv</w:t>
+      </w:r>
+    </w:p>
+    <w:p>
+      <w:pPr>
+        <w:rPr>
+          <w:b/>
+          <w:bCs/>
+        </w:rPr>
+      </w:pPr>
+      <w:r>
+        <w:rPr>
+          <w:b/>
+          <w:bCs/>
+        </w:rPr>
+        <w:drawing>
+          <wp:inline distT="0" distB="0" distL="0" distR="0" wp14:anchorId="43E68EDF" wp14:editId="2E21DFB9">
+            <wp:extent cx="4857750" cy="895557"/>
+            <wp:effectExtent l="0" t="0" r="0" b="0"/>
+            <wp:docPr id="182328515" name="Picture 1"/>
+            <wp:cNvGraphicFramePr>
+              <a:graphicFrameLocks xmlns:a="http://schemas.openxmlformats.org/drawingml/2006/main" noChangeAspect="1"/>
+            </wp:cNvGraphicFramePr>
+            <a:graphic xmlns:a="http://schemas.openxmlformats.org/drawingml/2006/main">
+              <a:graphicData uri="http://schemas.openxmlformats.org/drawingml/2006/picture">
+                <pic:pic xmlns:pic="http://schemas.openxmlformats.org/drawingml/2006/picture">
+                  <pic:nvPicPr>
+                    <pic:cNvPr id="182328515" name=""/>
+                    <pic:cNvPicPr/>
+                  </pic:nvPicPr>
+                  <pic:blipFill>
+                    <a:blip r:embed="rId14"/>
+                    <a:stretch>
+                      <a:fillRect/>
+                    </a:stretch>
+                  </pic:blipFill>
+                  <pic:spPr>
+                    <a:xfrm>
+                      <a:off x="0" y="0"/>
+                      <a:ext cx="4867163" cy="897292"/>
+                    </a:xfrm>
+                    <a:prstGeom prst="rect">
+                      <a:avLst/>
+                    </a:prstGeom>
+                  </pic:spPr>
+                </pic:pic>
+              </a:graphicData>
+            </a:graphic>
+          </wp:inline>
+        </w:drawing>
+      </w:r>
+    </w:p>
+    <w:p>
+      <w:pPr>
+        <w:rPr>
+          <w:b/>
+          <w:bCs/>
+        </w:rPr>
+      </w:pPr>
+    </w:p>
+    <w:p>
+      <w:pPr>
+        <w:jc w:val="center"/>
+        <w:rPr>
+          <w:b/>
+          <w:bCs/>
+        </w:rPr>
+      </w:pPr>
+      <w:r>
+        <w:rPr>
+          <w:b/>
+          <w:bCs/>
+        </w:rPr>
+        <w:t>POWER QUERY CLEANING AND TRANFORMATION</w:t>
+      </w:r>
+    </w:p>
+    <w:p>
+      <w:pPr>
+        <w:rPr>
+          <w:b/>
+          <w:bCs/>
+        </w:rPr>
+      </w:pPr>
+      <w:r>
+        <w:rPr>
+          <w:b/>
+          <w:bCs/>
+        </w:rPr>
+        <w:t>FactOrders</w:t>
+      </w:r>
+    </w:p>
+    <w:p>
+      <w:pPr>
+        <w:rPr>
+          <w:b/>
+          <w:bCs/>
+        </w:rPr>
+      </w:pPr>
+      <w:r>
+        <w:rPr>
+          <w:b/>
+          <w:bCs/>
+        </w:rPr>
+        <w:t>Steps Pane:</w:t>
+      </w:r>
+    </w:p>
+    <w:p>
+      <w:pPr>
+        <w:rPr>
+          <w:b/>
+          <w:bCs/>
+        </w:rPr>
+      </w:pPr>
+      <w:r>
+        <w:rPr>
+          <w:b/>
+          <w:bCs/>
+        </w:rPr>
+        <w:drawing>
+          <wp:inline distT="0" distB="0" distL="0" distR="0" wp14:anchorId="5AC7C981" wp14:editId="4AFB281A">
+            <wp:extent cx="1223460" cy="1166884"/>
+            <wp:effectExtent l="0" t="0" r="0" b="0"/>
+            <wp:docPr id="578184895" name="Picture 1"/>
+            <wp:cNvGraphicFramePr>
+              <a:graphicFrameLocks xmlns:a="http://schemas.openxmlformats.org/drawingml/2006/main" noChangeAspect="1"/>
+            </wp:cNvGraphicFramePr>
+            <a:graphic xmlns:a="http://schemas.openxmlformats.org/drawingml/2006/main">
+              <a:graphicData uri="http://schemas.openxmlformats.org/drawingml/2006/picture">
+                <pic:pic xmlns:pic="http://schemas.openxmlformats.org/drawingml/2006/picture">
+                  <pic:nvPicPr>
+                    <pic:cNvPr id="578184895" name=""/>
+                    <pic:cNvPicPr/>
+                  </pic:nvPicPr>
+                  <pic:blipFill>
+                    <a:blip r:embed="rId15"/>
+                    <a:stretch>
+                      <a:fillRect/>
+                    </a:stretch>
+                  </pic:blipFill>
+                  <pic:spPr>
+                    <a:xfrm>
+                      <a:off x="0" y="0"/>
+                      <a:ext cx="1229423" cy="1172571"/>
+                    </a:xfrm>
+                    <a:prstGeom prst="rect">
+                      <a:avLst/>
+                    </a:prstGeom>
+                  </pic:spPr>
+                </pic:pic>
+              </a:graphicData>
+            </a:graphic>
+          </wp:inline>
+        </w:drawing>
+      </w:r>
+    </w:p>
+    <w:p>
+      <w:pPr>
+        <w:rPr>
+          <w:b/>
+          <w:bCs/>
+        </w:rPr>
+      </w:pPr>
+      <w:r>
+        <w:rPr>
+          <w:b/>
+          <w:bCs/>
+        </w:rPr>
+        <w:t xml:space="preserve">Before: </w:t>
+      </w:r>
+    </w:p>
+    <w:p>
+      <w:pPr>
+        <w:rPr>
+          <w:b/>
+          <w:bCs/>
+        </w:rPr>
+      </w:pPr>
+      <w:r>
+        <w:rPr>
+          <w:b/>
+          <w:bCs/>
+        </w:rPr>
+        <w:drawing>
+          <wp:inline distT="0" distB="0" distL="0" distR="0" wp14:anchorId="496B0279" wp14:editId="371FF76D">
+            <wp:extent cx="3294378" cy="1476375"/>
+            <wp:effectExtent l="0" t="0" r="1905" b="0"/>
+            <wp:docPr id="2086304847" name="Picture 1"/>
+            <wp:cNvGraphicFramePr>
+              <a:graphicFrameLocks xmlns:a="http://schemas.openxmlformats.org/drawingml/2006/main" noChangeAspect="1"/>
+            </wp:cNvGraphicFramePr>
+            <a:graphic xmlns:a="http://schemas.openxmlformats.org/drawingml/2006/main">
+              <a:graphicData uri="http://schemas.openxmlformats.org/drawingml/2006/picture">
+                <pic:pic xmlns:pic="http://schemas.openxmlformats.org/drawingml/2006/picture">
+                  <pic:nvPicPr>
+                    <pic:cNvPr id="2086304847" name=""/>
+                    <pic:cNvPicPr/>
+                  </pic:nvPicPr>
+                  <pic:blipFill>
+                    <a:blip r:embed="rId16"/>
+                    <a:stretch>
+                      <a:fillRect/>
+                    </a:stretch>
+                  </pic:blipFill>
+                  <pic:spPr>
+                    <a:xfrm>
+                      <a:off x="0" y="0"/>
+                      <a:ext cx="3296355" cy="1477261"/>
+                    </a:xfrm>
+                    <a:prstGeom prst="rect">
+                      <a:avLst/>
+                    </a:prstGeom>
+                  </pic:spPr>
+                </pic:pic>
+              </a:graphicData>
+            </a:graphic>
+          </wp:inline>
+        </w:drawing>
+      </w:r>
+      <w:r>
+        <w:rPr>
+          <w:b/>
+          <w:bCs/>
+        </w:rPr>
+        <w:drawing>
+          <wp:inline distT="0" distB="0" distL="0" distR="0" wp14:anchorId="33D87838" wp14:editId="0EB22C64">
+            <wp:extent cx="2138078" cy="1474903"/>
+            <wp:effectExtent l="0" t="0" r="0" b="0"/>
+            <wp:docPr id="626186305" name="Picture 1"/>
+            <wp:cNvGraphicFramePr>
+              <a:graphicFrameLocks xmlns:a="http://schemas.openxmlformats.org/drawingml/2006/main" noChangeAspect="1"/>
+            </wp:cNvGraphicFramePr>
+            <a:graphic xmlns:a="http://schemas.openxmlformats.org/drawingml/2006/main">
+              <a:graphicData uri="http://schemas.openxmlformats.org/drawingml/2006/picture">
+                <pic:pic xmlns:pic="http://schemas.openxmlformats.org/drawingml/2006/picture">
+                  <pic:nvPicPr>
+                    <pic:cNvPr id="626186305" name=""/>
+                    <pic:cNvPicPr/>
+                  </pic:nvPicPr>
+                  <pic:blipFill rotWithShape="1">
+                    <a:blip r:embed="rId17"/>
+                    <a:srcRect l="83" t="-38" r="57" b="6442"/>
+                    <a:stretch>
+                      <a:fillRect/>
+                    </a:stretch>
+                  </pic:blipFill>
+                  <pic:spPr bwMode="auto">
+                    <a:xfrm>
+                      <a:off x="0" y="0"/>
+                      <a:ext cx="2158172" cy="1488764"/>
+                    </a:xfrm>
+                    <a:prstGeom prst="rect">
+                      <a:avLst/>
+                    </a:prstGeom>
+                    <a:ln>
+                      <a:noFill/>
+                    </a:ln>
+                    <a:extLst>
+                      <a:ext uri="{53640926-AAD7-44D8-BBD7-CCE9431645EC}">
+                        <a14:shadowObscured xmlns:a14="http://schemas.microsoft.com/office/drawing/2010/main"/>
+                      </a:ext>
+                    </a:extLst>
+                  </pic:spPr>
+                </pic:pic>
+              </a:graphicData>
+            </a:graphic>
+          </wp:inline>
+        </w:drawing>
+      </w:r>
+    </w:p>
+    <w:p>
+      <w:pPr>
+        <w:rPr>
+          <w:b/>
+          <w:bCs/>
+        </w:rPr>
+      </w:pPr>
+      <w:r>
+        <w:rPr>
+          <w:b/>
+          <w:bCs/>
+        </w:rPr>
+        <w:t xml:space="preserve">After: </w:t>
+      </w:r>
+    </w:p>
+    <w:p>
+      <w:pPr>
+        <w:rPr>
+          <w:b/>
+          <w:bCs/>
+        </w:rPr>
+      </w:pPr>
+      <w:r>
+        <w:rPr>
+          <w:b/>
+          <w:bCs/>
+        </w:rPr>
+        <w:drawing>
+          <wp:inline distT="0" distB="0" distL="0" distR="0" wp14:anchorId="1D952FAF" wp14:editId="6CFAEFCA">
+            <wp:extent cx="2592998" cy="1234734"/>
+            <wp:effectExtent l="0" t="0" r="0" b="3810"/>
+            <wp:docPr id="1987026008" name="Picture 1"/>
+            <wp:cNvGraphicFramePr>
+              <a:graphicFrameLocks xmlns:a="http://schemas.openxmlformats.org/drawingml/2006/main" noChangeAspect="1"/>
+            </wp:cNvGraphicFramePr>
+            <a:graphic xmlns:a="http://schemas.openxmlformats.org/drawingml/2006/main">
+              <a:graphicData uri="http://schemas.openxmlformats.org/drawingml/2006/picture">
+                <pic:pic xmlns:pic="http://schemas.openxmlformats.org/drawingml/2006/picture">
+                  <pic:nvPicPr>
+                    <pic:cNvPr id="1987026008" name=""/>
+                    <pic:cNvPicPr/>
+                  </pic:nvPicPr>
+                  <pic:blipFill>
+                    <a:blip r:embed="rId18"/>
+                    <a:stretch>
+                      <a:fillRect/>
+                    </a:stretch>
+                  </pic:blipFill>
+                  <pic:spPr>
+                    <a:xfrm>
+                      <a:off x="0" y="0"/>
+                      <a:ext cx="2642869" cy="1258482"/>
+                    </a:xfrm>
+                    <a:prstGeom prst="rect">
+                      <a:avLst/>
+                    </a:prstGeom>
+                  </pic:spPr>
+                </pic:pic>
+              </a:graphicData>
+            </a:graphic>
+          </wp:inline>
+        </w:drawing>
+      </w:r>
+      <w:r>
+        <w:rPr>
+          <w:b/>
+          <w:bCs/>
+        </w:rPr>
+        <w:drawing>
+          <wp:inline distT="0" distB="0" distL="0" distR="0" wp14:anchorId="52507D38" wp14:editId="2EFBECBC">
+            <wp:extent cx="3043295" cy="1231008"/>
+            <wp:effectExtent l="0" t="0" r="5080" b="7620"/>
+            <wp:docPr id="1657054150" name="Picture 1"/>
+            <wp:cNvGraphicFramePr>
+              <a:graphicFrameLocks xmlns:a="http://schemas.openxmlformats.org/drawingml/2006/main" noChangeAspect="1"/>
+            </wp:cNvGraphicFramePr>
+            <a:graphic xmlns:a="http://schemas.openxmlformats.org/drawingml/2006/main">
+              <a:graphicData uri="http://schemas.openxmlformats.org/drawingml/2006/picture">
+                <pic:pic xmlns:pic="http://schemas.openxmlformats.org/drawingml/2006/picture">
+                  <pic:nvPicPr>
+                    <pic:cNvPr id="1657054150" name=""/>
+                    <pic:cNvPicPr/>
+                  </pic:nvPicPr>
+                  <pic:blipFill>
+                    <a:blip r:embed="rId19"/>
+                    <a:stretch>
+                      <a:fillRect/>
+                    </a:stretch>
+                  </pic:blipFill>
+                  <pic:spPr>
+                    <a:xfrm>
+                      <a:off x="0" y="0"/>
+                      <a:ext cx="3061904" cy="1238535"/>
+                    </a:xfrm>
+                    <a:prstGeom prst="rect">
+                      <a:avLst/>
+                    </a:prstGeom>
+                  </pic:spPr>
+                </pic:pic>
+              </a:graphicData>
+            </a:graphic>
+          </wp:inline>
+        </w:drawing>
+      </w:r>
+    </w:p>
+    <w:p>
+      <w:pPr>
+        <w:rPr>
+          <w:b/>
+          <w:bCs/>
+        </w:rPr>
+      </w:pPr>
+    </w:p>
+    <w:p>
+      <w:pPr>
+        <w:pStyle w:val="ListParagraph"/>
+        <w:numPr>
+          <w:ilvl w:val="0"/>
+          <w:numId w:val="1"/>
+        </w:numPr>
+        <w:rPr>
+          <w:b/>
+          <w:bCs/>
+        </w:rPr>
+      </w:pPr>
+      <w:r>
+        <w:rPr>
+          <w:b/>
+          <w:bCs/>
+        </w:rPr>
+        <w:t>Remove unused columns from Orders</w:t>
+      </w:r>
+      <w:r>
+        <w:rPr>
+          <w:b/>
+          <w:bCs/>
+        </w:rPr>
+        <w:t xml:space="preserve">: </w:t>
+      </w:r>
+    </w:p>
+    <w:p>
+      <w:pPr>
+        <w:pStyle w:val="ListParagraph"/>
+      </w:pPr>
+      <w:r>
+        <w:t>These intermediate logistics timestamps are not needed</w:t>
+      </w:r>
+      <w:r>
+        <w:t>, removing them</w:t>
+      </w:r>
+      <w:r>
+        <w:t xml:space="preserve"> reduces model size and simplifies the schema.</w:t>
+      </w:r>
+    </w:p>
+    <w:p>
+      <w:pPr>
+        <w:pStyle w:val="ListParagraph"/>
+        <w:ind w:left="1440"/>
+        <w:rPr>
+          <w:b/>
+          <w:bCs/>
+        </w:rPr>
+      </w:pPr>
+      <w:r>
+        <w:rPr>
+          <w:b/>
+          <w:bCs/>
+        </w:rPr>
+        <w:t>order_approved_at and order_delivered_carrier_date</w:t>
+      </w:r>
+    </w:p>
+    <w:p>
+      <w:pPr>
+        <w:pStyle w:val="ListParagraph"/>
+        <w:ind w:left="1440"/>
+        <w:rPr>
+          <w:b/>
+          <w:bCs/>
+        </w:rPr>
+      </w:pPr>
+    </w:p>
+    <w:p>
+      <w:pPr>
+        <w:pStyle w:val="ListParagraph"/>
+        <w:ind w:left="1440"/>
+        <w:rPr>
+          <w:b/>
+          <w:bCs/>
+        </w:rPr>
+      </w:pPr>
+      <w:r>
+        <w:rPr>
+          <w:b/>
+          <w:bCs/>
+        </w:rPr>
+        <w:drawing>
+          <wp:inline distT="0" distB="0" distL="0" distR="0" wp14:anchorId="5B2AD13D" wp14:editId="4927263E">
+            <wp:extent cx="4876800" cy="208018"/>
+            <wp:effectExtent l="0" t="0" r="0" b="1905"/>
+            <wp:docPr id="990300245" name="Picture 1"/>
+            <wp:cNvGraphicFramePr>
+              <a:graphicFrameLocks xmlns:a="http://schemas.openxmlformats.org/drawingml/2006/main" noChangeAspect="1"/>
+            </wp:cNvGraphicFramePr>
+            <a:graphic xmlns:a="http://schemas.openxmlformats.org/drawingml/2006/main">
+              <a:graphicData uri="http://schemas.openxmlformats.org/drawingml/2006/picture">
+                <pic:pic xmlns:pic="http://schemas.openxmlformats.org/drawingml/2006/picture">
+                  <pic:nvPicPr>
+                    <pic:cNvPr id="990300245" name=""/>
+                    <pic:cNvPicPr/>
+                  </pic:nvPicPr>
+                  <pic:blipFill>
+                    <a:blip r:embed="rId20"/>
+                    <a:stretch>
+                      <a:fillRect/>
+                    </a:stretch>
+                  </pic:blipFill>
+                  <pic:spPr>
+                    <a:xfrm>
+                      <a:off x="0" y="0"/>
+                      <a:ext cx="4980844" cy="212456"/>
+                    </a:xfrm>
+                    <a:prstGeom prst="rect">
+                      <a:avLst/>
+                    </a:prstGeom>
+                  </pic:spPr>
+                </pic:pic>
+              </a:graphicData>
+            </a:graphic>
+          </wp:inline>
+        </w:drawing>
+      </w:r>
+    </w:p>
+    <w:p>
+      <w:pPr>
+        <w:pStyle w:val="ListParagraph"/>
+        <w:ind w:left="1440"/>
+        <w:rPr>
+          <w:b/>
+          <w:bCs/>
+        </w:rPr>
+      </w:pPr>
+    </w:p>
+    <w:p>
+      <w:pPr>
+        <w:pStyle w:val="ListParagraph"/>
+        <w:ind w:left="1440"/>
+        <w:rPr>
+          <w:b/>
+          <w:bCs/>
+        </w:rPr>
+      </w:pPr>
+    </w:p>
+    <w:p>
+      <w:pPr>
+        <w:pStyle w:val="ListParagraph"/>
+        <w:numPr>
+          <w:ilvl w:val="0"/>
+          <w:numId w:val="1"/>
+        </w:numPr>
+        <w:rPr>
+          <w:b/>
+          <w:bCs/>
+        </w:rPr>
+      </w:pPr>
+      <w:r>
+        <w:rPr>
+          <w:b/>
+          <w:bCs/>
+        </w:rPr>
+        <w:t>Change data types</w:t>
+      </w:r>
+    </w:p>
+    <w:p>
+      <w:pPr>
+        <w:pStyle w:val="ListParagraph"/>
+        <w:rPr>
+          <w:b/>
+          <w:bCs/>
+        </w:rPr>
+      </w:pPr>
+      <w:r>
+        <w:rPr>
+          <w:b/>
+          <w:bCs/>
+        </w:rPr>
+        <w:drawing>
+          <wp:inline distT="0" distB="0" distL="0" distR="0" wp14:anchorId="1911887F" wp14:editId="6711B63E">
+            <wp:extent cx="5731510" cy="507365"/>
+            <wp:effectExtent l="0" t="0" r="2540" b="6985"/>
+            <wp:docPr id="436054758" name="Picture 1"/>
+            <wp:cNvGraphicFramePr>
+              <a:graphicFrameLocks xmlns:a="http://schemas.openxmlformats.org/drawingml/2006/main" noChangeAspect="1"/>
+            </wp:cNvGraphicFramePr>
+            <a:graphic xmlns:a="http://schemas.openxmlformats.org/drawingml/2006/main">
+              <a:graphicData uri="http://schemas.openxmlformats.org/drawingml/2006/picture">
+                <pic:pic xmlns:pic="http://schemas.openxmlformats.org/drawingml/2006/picture">
+                  <pic:nvPicPr>
+                    <pic:cNvPr id="436054758" name=""/>
+                    <pic:cNvPicPr/>
+                  </pic:nvPicPr>
+                  <pic:blipFill>
+                    <a:blip r:embed="rId21"/>
+                    <a:stretch>
+                      <a:fillRect/>
+                    </a:stretch>
+                  </pic:blipFill>
+                  <pic:spPr>
+                    <a:xfrm>
+                      <a:off x="0" y="0"/>
+                      <a:ext cx="5731510" cy="507365"/>
+                    </a:xfrm>
+                    <a:prstGeom prst="rect">
+                      <a:avLst/>
+                    </a:prstGeom>
+                  </pic:spPr>
+                </pic:pic>
+              </a:graphicData>
+            </a:graphic>
+          </wp:inline>
+        </w:drawing>
+      </w:r>
+    </w:p>
+    <w:p>
+      <w:pPr>
+        <w:pStyle w:val="ListParagraph"/>
+        <w:rPr>
+          <w:b/>
+          <w:bCs/>
+        </w:rPr>
+      </w:pPr>
+    </w:p>
+    <w:p>
+      <w:pPr>
+        <w:pStyle w:val="ListParagraph"/>
+        <w:numPr>
+          <w:ilvl w:val="0"/>
+          <w:numId w:val="1"/>
+        </w:numPr>
+      </w:pPr>
+      <w:r>
+        <w:rPr>
+          <w:b/>
+          <w:bCs/>
+        </w:rPr>
+        <w:t>Remove rows with null delivery date </w:t>
+      </w:r>
+    </w:p>
+    <w:p>
+      <w:pPr>
+        <w:pStyle w:val="ListParagraph"/>
+      </w:pPr>
+      <w:r>
+        <w:lastRenderedPageBreak/>
+        <w:t>A small number of "delivered" rows still have a null delivery date</w:t>
+      </w:r>
       <w:r>
         <w:t xml:space="preserve">, </w:t>
       </w:r>
-      <w:proofErr w:type="spellStart"/>
-      <w:r>
-        <w:t>customer_id</w:t>
-      </w:r>
-      <w:proofErr w:type="spellEnd"/>
+      <w:r>
+        <w:t xml:space="preserve"> data entry errors. These prevent DeliveryDays from calculating.</w:t>
+      </w:r>
+    </w:p>
+    <w:p>
+      <w:pPr>
+        <w:pStyle w:val="ListParagraph"/>
+      </w:pPr>
+    </w:p>
+    <w:p>
+      <w:pPr>
+        <w:pStyle w:val="ListParagraph"/>
+      </w:pPr>
+      <w:r>
+        <w:drawing>
+          <wp:inline distT="0" distB="0" distL="0" distR="0" wp14:anchorId="7AF93454" wp14:editId="04110E28">
+            <wp:extent cx="5731510" cy="309245"/>
+            <wp:effectExtent l="0" t="0" r="2540" b="0"/>
+            <wp:docPr id="855218464" name="Picture 1"/>
+            <wp:cNvGraphicFramePr>
+              <a:graphicFrameLocks xmlns:a="http://schemas.openxmlformats.org/drawingml/2006/main" noChangeAspect="1"/>
+            </wp:cNvGraphicFramePr>
+            <a:graphic xmlns:a="http://schemas.openxmlformats.org/drawingml/2006/main">
+              <a:graphicData uri="http://schemas.openxmlformats.org/drawingml/2006/picture">
+                <pic:pic xmlns:pic="http://schemas.openxmlformats.org/drawingml/2006/picture">
+                  <pic:nvPicPr>
+                    <pic:cNvPr id="855218464" name=""/>
+                    <pic:cNvPicPr/>
+                  </pic:nvPicPr>
+                  <pic:blipFill>
+                    <a:blip r:embed="rId22"/>
+                    <a:stretch>
+                      <a:fillRect/>
+                    </a:stretch>
+                  </pic:blipFill>
+                  <pic:spPr>
+                    <a:xfrm>
+                      <a:off x="0" y="0"/>
+                      <a:ext cx="5731510" cy="309245"/>
+                    </a:xfrm>
+                    <a:prstGeom prst="rect">
+                      <a:avLst/>
+                    </a:prstGeom>
+                  </pic:spPr>
+                </pic:pic>
+              </a:graphicData>
+            </a:graphic>
+          </wp:inline>
+        </w:drawing>
+      </w:r>
+    </w:p>
+    <w:p>
+      <w:pPr>
+        <w:pStyle w:val="ListParagraph"/>
+      </w:pPr>
+    </w:p>
+    <w:p>
+      <w:pPr>
+        <w:pStyle w:val="ListParagraph"/>
+        <w:numPr>
+          <w:ilvl w:val="0"/>
+          <w:numId w:val="1"/>
+        </w:numPr>
+        <w:rPr>
+          <w:b/>
+          <w:bCs/>
+        </w:rPr>
+      </w:pPr>
+      <w:r>
+        <w:rPr>
+          <w:b/>
+          <w:bCs/>
+        </w:rPr>
+        <w:t> Create DeliveryDays custom column</w:t>
+      </w:r>
+    </w:p>
+    <w:p>
+      <w:pPr>
+        <w:pStyle w:val="ListParagraph"/>
+      </w:pPr>
+      <w:r>
+        <w:t>Core metric for delivery performance analysis. Converts two timestamps into a single interpretable integer.</w:t>
+      </w:r>
+    </w:p>
+    <w:p>
+      <w:pPr>
+        <w:pStyle w:val="ListParagraph"/>
+        <w:rPr>
+          <w:b/>
+          <w:bCs/>
+        </w:rPr>
+      </w:pPr>
+      <w:r>
+        <w:rPr>
+          <w:b/>
+          <w:bCs/>
+        </w:rPr>
+        <w:drawing>
+          <wp:inline distT="0" distB="0" distL="0" distR="0" wp14:anchorId="5520270D" wp14:editId="2616124D">
+            <wp:extent cx="5731510" cy="383540"/>
+            <wp:effectExtent l="0" t="0" r="2540" b="0"/>
+            <wp:docPr id="1590771330" name="Picture 1"/>
+            <wp:cNvGraphicFramePr>
+              <a:graphicFrameLocks xmlns:a="http://schemas.openxmlformats.org/drawingml/2006/main" noChangeAspect="1"/>
+            </wp:cNvGraphicFramePr>
+            <a:graphic xmlns:a="http://schemas.openxmlformats.org/drawingml/2006/main">
+              <a:graphicData uri="http://schemas.openxmlformats.org/drawingml/2006/picture">
+                <pic:pic xmlns:pic="http://schemas.openxmlformats.org/drawingml/2006/picture">
+                  <pic:nvPicPr>
+                    <pic:cNvPr id="1590771330" name=""/>
+                    <pic:cNvPicPr/>
+                  </pic:nvPicPr>
+                  <pic:blipFill>
+                    <a:blip r:embed="rId23"/>
+                    <a:stretch>
+                      <a:fillRect/>
+                    </a:stretch>
+                  </pic:blipFill>
+                  <pic:spPr>
+                    <a:xfrm>
+                      <a:off x="0" y="0"/>
+                      <a:ext cx="5731510" cy="383540"/>
+                    </a:xfrm>
+                    <a:prstGeom prst="rect">
+                      <a:avLst/>
+                    </a:prstGeom>
+                  </pic:spPr>
+                </pic:pic>
+              </a:graphicData>
+            </a:graphic>
+          </wp:inline>
+        </w:drawing>
+      </w:r>
+    </w:p>
+    <w:p>
+      <w:pPr>
+        <w:pStyle w:val="ListParagraph"/>
+        <w:rPr>
+          <w:b/>
+          <w:bCs/>
+        </w:rPr>
+      </w:pPr>
+    </w:p>
+    <w:p>
+      <w:pPr>
+        <w:pStyle w:val="ListParagraph"/>
+        <w:numPr>
+          <w:ilvl w:val="0"/>
+          <w:numId w:val="1"/>
+        </w:numPr>
+        <w:rPr>
+          <w:b/>
+          <w:bCs/>
+        </w:rPr>
+      </w:pPr>
+      <w:r>
+        <w:rPr>
+          <w:b/>
+          <w:bCs/>
+        </w:rPr>
+        <w:t>Create DeliveryStatus conditional column</w:t>
+      </w:r>
+    </w:p>
+    <w:p>
+      <w:pPr>
+        <w:pStyle w:val="ListParagraph"/>
+      </w:pPr>
+      <w:r>
+        <w:rPr>
+          <w:b/>
+          <w:bCs/>
+        </w:rPr>
+        <w:t xml:space="preserve"> </w:t>
+      </w:r>
+      <w:r>
+        <w:t>Converts continuous number to categorical label. Enables slicers, scatter chart legends, and percentage-of-category DAX filtering.</w:t>
+      </w:r>
+    </w:p>
+    <w:p>
+      <w:pPr>
+        <w:pStyle w:val="ListParagraph"/>
+        <w:rPr>
+          <w:b/>
+          <w:bCs/>
+        </w:rPr>
+      </w:pPr>
+      <w:r>
+        <w:rPr>
+          <w:b/>
+          <w:bCs/>
+        </w:rPr>
+        <w:drawing>
+          <wp:inline distT="0" distB="0" distL="0" distR="0" wp14:anchorId="57E158AD" wp14:editId="07388042">
+            <wp:extent cx="5731510" cy="494665"/>
+            <wp:effectExtent l="0" t="0" r="2540" b="635"/>
+            <wp:docPr id="2122164209" name="Picture 1"/>
+            <wp:cNvGraphicFramePr>
+              <a:graphicFrameLocks xmlns:a="http://schemas.openxmlformats.org/drawingml/2006/main" noChangeAspect="1"/>
+            </wp:cNvGraphicFramePr>
+            <a:graphic xmlns:a="http://schemas.openxmlformats.org/drawingml/2006/main">
+              <a:graphicData uri="http://schemas.openxmlformats.org/drawingml/2006/picture">
+                <pic:pic xmlns:pic="http://schemas.openxmlformats.org/drawingml/2006/picture">
+                  <pic:nvPicPr>
+                    <pic:cNvPr id="2122164209" name=""/>
+                    <pic:cNvPicPr/>
+                  </pic:nvPicPr>
+                  <pic:blipFill>
+                    <a:blip r:embed="rId24"/>
+                    <a:stretch>
+                      <a:fillRect/>
+                    </a:stretch>
+                  </pic:blipFill>
+                  <pic:spPr>
+                    <a:xfrm>
+                      <a:off x="0" y="0"/>
+                      <a:ext cx="5731510" cy="494665"/>
+                    </a:xfrm>
+                    <a:prstGeom prst="rect">
+                      <a:avLst/>
+                    </a:prstGeom>
+                  </pic:spPr>
+                </pic:pic>
+              </a:graphicData>
+            </a:graphic>
+          </wp:inline>
+        </w:drawing>
+      </w:r>
+    </w:p>
+    <w:p>
+      <w:pPr>
+        <w:pStyle w:val="ListParagraph"/>
+        <w:rPr>
+          <w:b/>
+          <w:bCs/>
+        </w:rPr>
+      </w:pPr>
+    </w:p>
+    <w:p>
+      <w:pPr>
+        <w:pStyle w:val="ListParagraph"/>
+        <w:numPr>
+          <w:ilvl w:val="0"/>
+          <w:numId w:val="1"/>
+        </w:numPr>
+        <w:rPr>
+          <w:b/>
+          <w:bCs/>
+        </w:rPr>
+      </w:pPr>
+      <w:r>
+        <w:rPr>
+          <w:b/>
+          <w:bCs/>
+        </w:rPr>
+        <w:t>Extract PurchaseDate from timestamp</w:t>
+      </w:r>
+    </w:p>
+    <w:p>
+      <w:pPr>
+        <w:pStyle w:val="ListParagraph"/>
+      </w:pPr>
+      <w:r>
+        <w:t>DimDate contains Date values with no time component. The relationship requires both sides to be the same type</w:t>
+      </w:r>
       <w:r>
         <w:t xml:space="preserve">, </w:t>
       </w:r>
-      <w:proofErr w:type="spellStart"/>
-      <w:r>
-        <w:t>product_id</w:t>
-      </w:r>
-      <w:proofErr w:type="spellEnd"/>
-      <w:r>
-        <w:t>) enabling a proper star schema; the main orders table has 99,441 rows exceeding the 9,000 minimum; it contains both categorical variables (</w:t>
-      </w:r>
-      <w:proofErr w:type="spellStart"/>
-      <w:r>
-        <w:t>order_status</w:t>
-      </w:r>
-      <w:proofErr w:type="spellEnd"/>
-      <w:r>
-        <w:t xml:space="preserve">, </w:t>
-      </w:r>
-      <w:proofErr w:type="spellStart"/>
-      <w:r>
-        <w:t>payment_type</w:t>
-      </w:r>
-      <w:proofErr w:type="spellEnd"/>
-      <w:r>
-        <w:t xml:space="preserve">, </w:t>
-      </w:r>
-      <w:proofErr w:type="spellStart"/>
-      <w:r>
-        <w:t>customer_state</w:t>
-      </w:r>
-      <w:proofErr w:type="spellEnd"/>
-      <w:r>
-        <w:t xml:space="preserve">, </w:t>
-      </w:r>
-      <w:proofErr w:type="spellStart"/>
-      <w:r>
-        <w:t>product_category</w:t>
-      </w:r>
-      <w:proofErr w:type="spellEnd"/>
-      <w:r>
-        <w:t xml:space="preserve">) and numerical variables (price, </w:t>
-      </w:r>
-      <w:proofErr w:type="spellStart"/>
-      <w:r>
-        <w:t>freight_value</w:t>
-      </w:r>
-      <w:proofErr w:type="spellEnd"/>
-      <w:r>
-        <w:t xml:space="preserve">, </w:t>
-      </w:r>
-      <w:proofErr w:type="spellStart"/>
-      <w:r>
-        <w:t>review_score</w:t>
-      </w:r>
-      <w:proofErr w:type="spellEnd"/>
-      <w:r>
-        <w:t xml:space="preserve">, </w:t>
-      </w:r>
-      <w:proofErr w:type="spellStart"/>
-      <w:r>
-        <w:t>payment_installments</w:t>
-      </w:r>
-      <w:proofErr w:type="spellEnd"/>
-      <w:r>
-        <w:t xml:space="preserve">); and the </w:t>
-      </w:r>
-      <w:proofErr w:type="spellStart"/>
-      <w:r>
-        <w:t>order_purchase_timestamp</w:t>
-      </w:r>
-      <w:proofErr w:type="spellEnd"/>
-      <w:r>
-        <w:t xml:space="preserve"> field spans September 2016 to October 2018 enabling full time-intelligence analysis including year-over-year comparisons, YTD calculations, and monthly trend analysis.</w:t>
+      <w:r>
+        <w:t>Date.From strips the time part.</w:t>
+      </w:r>
+    </w:p>
+    <w:p>
+      <w:pPr>
+        <w:pStyle w:val="ListParagraph"/>
+        <w:rPr>
+          <w:b/>
+          <w:bCs/>
+        </w:rPr>
+      </w:pPr>
+      <w:r>
+        <w:rPr>
+          <w:b/>
+          <w:bCs/>
+        </w:rPr>
+        <w:drawing>
+          <wp:inline distT="0" distB="0" distL="0" distR="0" wp14:anchorId="4CB56456" wp14:editId="5C66F526">
+            <wp:extent cx="5731510" cy="302895"/>
+            <wp:effectExtent l="0" t="0" r="2540" b="1905"/>
+            <wp:docPr id="194628119" name="Picture 1"/>
+            <wp:cNvGraphicFramePr>
+              <a:graphicFrameLocks xmlns:a="http://schemas.openxmlformats.org/drawingml/2006/main" noChangeAspect="1"/>
+            </wp:cNvGraphicFramePr>
+            <a:graphic xmlns:a="http://schemas.openxmlformats.org/drawingml/2006/main">
+              <a:graphicData uri="http://schemas.openxmlformats.org/drawingml/2006/picture">
+                <pic:pic xmlns:pic="http://schemas.openxmlformats.org/drawingml/2006/picture">
+                  <pic:nvPicPr>
+                    <pic:cNvPr id="194628119" name=""/>
+                    <pic:cNvPicPr/>
+                  </pic:nvPicPr>
+                  <pic:blipFill>
+                    <a:blip r:embed="rId25"/>
+                    <a:stretch>
+                      <a:fillRect/>
+                    </a:stretch>
+                  </pic:blipFill>
+                  <pic:spPr>
+                    <a:xfrm>
+                      <a:off x="0" y="0"/>
+                      <a:ext cx="5731510" cy="302895"/>
+                    </a:xfrm>
+                    <a:prstGeom prst="rect">
+                      <a:avLst/>
+                    </a:prstGeom>
+                  </pic:spPr>
+                </pic:pic>
+              </a:graphicData>
+            </a:graphic>
+          </wp:inline>
+        </w:drawing>
       </w:r>
     </w:p>
     <w:p/>
+    <w:p>
+      <w:pPr>
+        <w:rPr>
+          <w:b/>
+          <w:bCs/>
+        </w:rPr>
+      </w:pPr>
+      <w:r>
+        <w:rPr>
+          <w:b/>
+          <w:bCs/>
+        </w:rPr>
+        <w:t>CategoryTranslation</w:t>
+      </w:r>
+    </w:p>
+    <w:p>
+      <w:pPr>
+        <w:rPr>
+          <w:b/>
+          <w:bCs/>
+        </w:rPr>
+      </w:pPr>
+      <w:r>
+        <w:rPr>
+          <w:b/>
+          <w:bCs/>
+        </w:rPr>
+        <w:t>Steps Pane:</w:t>
+      </w:r>
+    </w:p>
+    <w:p>
+      <w:pPr>
+        <w:rPr>
+          <w:b/>
+          <w:bCs/>
+        </w:rPr>
+      </w:pPr>
+      <w:r>
+        <w:rPr>
+          <w:b/>
+          <w:bCs/>
+        </w:rPr>
+        <w:drawing>
+          <wp:inline distT="0" distB="0" distL="0" distR="0" wp14:anchorId="6362E550" wp14:editId="3F7BB4A7">
+            <wp:extent cx="2019869" cy="696507"/>
+            <wp:effectExtent l="0" t="0" r="0" b="8890"/>
+            <wp:docPr id="1345355022" name="Picture 1"/>
+            <wp:cNvGraphicFramePr>
+              <a:graphicFrameLocks xmlns:a="http://schemas.openxmlformats.org/drawingml/2006/main" noChangeAspect="1"/>
+            </wp:cNvGraphicFramePr>
+            <a:graphic xmlns:a="http://schemas.openxmlformats.org/drawingml/2006/main">
+              <a:graphicData uri="http://schemas.openxmlformats.org/drawingml/2006/picture">
+                <pic:pic xmlns:pic="http://schemas.openxmlformats.org/drawingml/2006/picture">
+                  <pic:nvPicPr>
+                    <pic:cNvPr id="1345355022" name=""/>
+                    <pic:cNvPicPr/>
+                  </pic:nvPicPr>
+                  <pic:blipFill>
+                    <a:blip r:embed="rId26"/>
+                    <a:stretch>
+                      <a:fillRect/>
+                    </a:stretch>
+                  </pic:blipFill>
+                  <pic:spPr>
+                    <a:xfrm>
+                      <a:off x="0" y="0"/>
+                      <a:ext cx="2041926" cy="704113"/>
+                    </a:xfrm>
+                    <a:prstGeom prst="rect">
+                      <a:avLst/>
+                    </a:prstGeom>
+                  </pic:spPr>
+                </pic:pic>
+              </a:graphicData>
+            </a:graphic>
+          </wp:inline>
+        </w:drawing>
+      </w:r>
+    </w:p>
+    <w:p>
+      <w:pPr>
+        <w:rPr>
+          <w:b/>
+          <w:bCs/>
+        </w:rPr>
+      </w:pPr>
+      <w:r>
+        <w:rPr>
+          <w:b/>
+          <w:bCs/>
+        </w:rPr>
+        <w:t xml:space="preserve">Before: </w:t>
+      </w:r>
+    </w:p>
+    <w:p>
+      <w:pPr>
+        <w:rPr>
+          <w:b/>
+          <w:bCs/>
+        </w:rPr>
+      </w:pPr>
+      <w:r>
+        <w:rPr>
+          <w:b/>
+          <w:bCs/>
+        </w:rPr>
+        <w:drawing>
+          <wp:inline distT="0" distB="0" distL="0" distR="0" wp14:anchorId="54924199" wp14:editId="7D70B0F7">
+            <wp:extent cx="2606675" cy="1398895"/>
+            <wp:effectExtent l="0" t="0" r="3175" b="0"/>
+            <wp:docPr id="826870892" name="Picture 1"/>
+            <wp:cNvGraphicFramePr>
+              <a:graphicFrameLocks xmlns:a="http://schemas.openxmlformats.org/drawingml/2006/main" noChangeAspect="1"/>
+            </wp:cNvGraphicFramePr>
+            <a:graphic xmlns:a="http://schemas.openxmlformats.org/drawingml/2006/main">
+              <a:graphicData uri="http://schemas.openxmlformats.org/drawingml/2006/picture">
+                <pic:pic xmlns:pic="http://schemas.openxmlformats.org/drawingml/2006/picture">
+                  <pic:nvPicPr>
+                    <pic:cNvPr id="826870892" name=""/>
+                    <pic:cNvPicPr/>
+                  </pic:nvPicPr>
+                  <pic:blipFill rotWithShape="1">
+                    <a:blip r:embed="rId27"/>
+                    <a:srcRect r="-10" b="28241"/>
+                    <a:stretch>
+                      <a:fillRect/>
+                    </a:stretch>
+                  </pic:blipFill>
+                  <pic:spPr bwMode="auto">
+                    <a:xfrm>
+                      <a:off x="0" y="0"/>
+                      <a:ext cx="2621494" cy="1406848"/>
+                    </a:xfrm>
+                    <a:prstGeom prst="rect">
+                      <a:avLst/>
+                    </a:prstGeom>
+                    <a:ln>
+                      <a:noFill/>
+                    </a:ln>
+                    <a:extLst>
+                      <a:ext uri="{53640926-AAD7-44D8-BBD7-CCE9431645EC}">
+                        <a14:shadowObscured xmlns:a14="http://schemas.microsoft.com/office/drawing/2010/main"/>
+                      </a:ext>
+                    </a:extLst>
+                  </pic:spPr>
+                </pic:pic>
+              </a:graphicData>
+            </a:graphic>
+          </wp:inline>
+        </w:drawing>
+      </w:r>
+    </w:p>
+    <w:p>
+      <w:pPr>
+        <w:rPr>
+          <w:b/>
+          <w:bCs/>
+        </w:rPr>
+      </w:pPr>
+      <w:r>
+        <w:rPr>
+          <w:b/>
+          <w:bCs/>
+        </w:rPr>
+        <w:t>After:</w:t>
+      </w:r>
+    </w:p>
+    <w:p>
+      <w:r>
+        <w:lastRenderedPageBreak/>
+        <w:drawing>
+          <wp:inline distT="0" distB="0" distL="0" distR="0" wp14:anchorId="3C9CB3AC" wp14:editId="145ACCDD">
+            <wp:extent cx="2620370" cy="1399892"/>
+            <wp:effectExtent l="0" t="0" r="8890" b="0"/>
+            <wp:docPr id="847390120" name="Picture 1"/>
+            <wp:cNvGraphicFramePr>
+              <a:graphicFrameLocks xmlns:a="http://schemas.openxmlformats.org/drawingml/2006/main" noChangeAspect="1"/>
+            </wp:cNvGraphicFramePr>
+            <a:graphic xmlns:a="http://schemas.openxmlformats.org/drawingml/2006/main">
+              <a:graphicData uri="http://schemas.openxmlformats.org/drawingml/2006/picture">
+                <pic:pic xmlns:pic="http://schemas.openxmlformats.org/drawingml/2006/picture">
+                  <pic:nvPicPr>
+                    <pic:cNvPr id="847390120" name=""/>
+                    <pic:cNvPicPr/>
+                  </pic:nvPicPr>
+                  <pic:blipFill>
+                    <a:blip r:embed="rId28"/>
+                    <a:stretch>
+                      <a:fillRect/>
+                    </a:stretch>
+                  </pic:blipFill>
+                  <pic:spPr>
+                    <a:xfrm>
+                      <a:off x="0" y="0"/>
+                      <a:ext cx="2628174" cy="1404061"/>
+                    </a:xfrm>
+                    <a:prstGeom prst="rect">
+                      <a:avLst/>
+                    </a:prstGeom>
+                  </pic:spPr>
+                </pic:pic>
+              </a:graphicData>
+            </a:graphic>
+          </wp:inline>
+        </w:drawing>
+      </w:r>
+    </w:p>
+    <w:p>
+      <w:pPr>
+        <w:rPr>
+          <w:b/>
+          <w:bCs/>
+        </w:rPr>
+      </w:pPr>
+    </w:p>
+    <w:p>
+      <w:pPr>
+        <w:pStyle w:val="ListParagraph"/>
+        <w:numPr>
+          <w:ilvl w:val="0"/>
+          <w:numId w:val="2"/>
+        </w:numPr>
+        <w:rPr>
+          <w:b/>
+          <w:bCs/>
+        </w:rPr>
+      </w:pPr>
+      <w:r>
+        <w:rPr>
+          <w:b/>
+          <w:bCs/>
+        </w:rPr>
+        <w:t>Use First Row as Headers</w:t>
+      </w:r>
+    </w:p>
+    <w:p>
+      <w:pPr>
+        <w:rPr>
+          <w:b/>
+          <w:bCs/>
+        </w:rPr>
+      </w:pPr>
+      <w:r>
+        <w:rPr>
+          <w:b/>
+          <w:bCs/>
+        </w:rPr>
+        <w:drawing>
+          <wp:inline distT="0" distB="0" distL="0" distR="0" wp14:anchorId="4BF31FC5" wp14:editId="49169AD6">
+            <wp:extent cx="5731510" cy="442595"/>
+            <wp:effectExtent l="0" t="0" r="2540" b="0"/>
+            <wp:docPr id="388759000" name="Picture 1"/>
+            <wp:cNvGraphicFramePr>
+              <a:graphicFrameLocks xmlns:a="http://schemas.openxmlformats.org/drawingml/2006/main" noChangeAspect="1"/>
+            </wp:cNvGraphicFramePr>
+            <a:graphic xmlns:a="http://schemas.openxmlformats.org/drawingml/2006/main">
+              <a:graphicData uri="http://schemas.openxmlformats.org/drawingml/2006/picture">
+                <pic:pic xmlns:pic="http://schemas.openxmlformats.org/drawingml/2006/picture">
+                  <pic:nvPicPr>
+                    <pic:cNvPr id="388759000" name=""/>
+                    <pic:cNvPicPr/>
+                  </pic:nvPicPr>
+                  <pic:blipFill>
+                    <a:blip r:embed="rId29"/>
+                    <a:stretch>
+                      <a:fillRect/>
+                    </a:stretch>
+                  </pic:blipFill>
+                  <pic:spPr>
+                    <a:xfrm>
+                      <a:off x="0" y="0"/>
+                      <a:ext cx="5731510" cy="442595"/>
+                    </a:xfrm>
+                    <a:prstGeom prst="rect">
+                      <a:avLst/>
+                    </a:prstGeom>
+                  </pic:spPr>
+                </pic:pic>
+              </a:graphicData>
+            </a:graphic>
+          </wp:inline>
+        </w:drawing>
+      </w:r>
+    </w:p>
+    <w:p>
+      <w:pPr>
+        <w:rPr>
+          <w:b/>
+          <w:bCs/>
+        </w:rPr>
+      </w:pPr>
+    </w:p>
+    <w:p>
+      <w:pPr>
+        <w:rPr>
+          <w:b/>
+          <w:bCs/>
+        </w:rPr>
+      </w:pPr>
+      <w:r>
+        <w:rPr>
+          <w:b/>
+          <w:bCs/>
+        </w:rPr>
+        <w:t>DimProducts</w:t>
+      </w:r>
+    </w:p>
+    <w:p>
+      <w:pPr>
+        <w:rPr>
+          <w:b/>
+          <w:bCs/>
+        </w:rPr>
+      </w:pPr>
+      <w:r>
+        <w:rPr>
+          <w:b/>
+          <w:bCs/>
+        </w:rPr>
+        <w:t>Steps Pane:</w:t>
+      </w:r>
+    </w:p>
+    <w:p>
+      <w:pPr>
+        <w:rPr>
+          <w:b/>
+          <w:bCs/>
+        </w:rPr>
+      </w:pPr>
+      <w:r>
+        <w:rPr>
+          <w:b/>
+          <w:bCs/>
+        </w:rPr>
+        <w:drawing>
+          <wp:inline distT="0" distB="0" distL="0" distR="0" wp14:anchorId="7CF5AE39" wp14:editId="1E9873F6">
+            <wp:extent cx="1188312" cy="928048"/>
+            <wp:effectExtent l="0" t="0" r="0" b="5715"/>
+            <wp:docPr id="565745710" name="Picture 1"/>
+            <wp:cNvGraphicFramePr>
+              <a:graphicFrameLocks xmlns:a="http://schemas.openxmlformats.org/drawingml/2006/main" noChangeAspect="1"/>
+            </wp:cNvGraphicFramePr>
+            <a:graphic xmlns:a="http://schemas.openxmlformats.org/drawingml/2006/main">
+              <a:graphicData uri="http://schemas.openxmlformats.org/drawingml/2006/picture">
+                <pic:pic xmlns:pic="http://schemas.openxmlformats.org/drawingml/2006/picture">
+                  <pic:nvPicPr>
+                    <pic:cNvPr id="565745710" name=""/>
+                    <pic:cNvPicPr/>
+                  </pic:nvPicPr>
+                  <pic:blipFill>
+                    <a:blip r:embed="rId30"/>
+                    <a:stretch>
+                      <a:fillRect/>
+                    </a:stretch>
+                  </pic:blipFill>
+                  <pic:spPr>
+                    <a:xfrm>
+                      <a:off x="0" y="0"/>
+                      <a:ext cx="1195513" cy="933672"/>
+                    </a:xfrm>
+                    <a:prstGeom prst="rect">
+                      <a:avLst/>
+                    </a:prstGeom>
+                  </pic:spPr>
+                </pic:pic>
+              </a:graphicData>
+            </a:graphic>
+          </wp:inline>
+        </w:drawing>
+      </w:r>
+    </w:p>
+    <w:p>
+      <w:pPr>
+        <w:rPr>
+          <w:b/>
+          <w:bCs/>
+        </w:rPr>
+      </w:pPr>
+      <w:r>
+        <w:rPr>
+          <w:b/>
+          <w:bCs/>
+        </w:rPr>
+        <w:t>Before:</w:t>
+      </w:r>
+    </w:p>
+    <w:p>
+      <w:pPr>
+        <w:rPr>
+          <w:b/>
+          <w:bCs/>
+        </w:rPr>
+      </w:pPr>
+      <w:r>
+        <w:rPr>
+          <w:b/>
+          <w:bCs/>
+        </w:rPr>
+        <w:drawing>
+          <wp:inline distT="0" distB="0" distL="0" distR="0" wp14:anchorId="6745D5F1" wp14:editId="1795ED71">
+            <wp:extent cx="2444535" cy="1009934"/>
+            <wp:effectExtent l="0" t="0" r="0" b="0"/>
+            <wp:docPr id="295652819" name="Picture 1"/>
+            <wp:cNvGraphicFramePr>
+              <a:graphicFrameLocks xmlns:a="http://schemas.openxmlformats.org/drawingml/2006/main" noChangeAspect="1"/>
+            </wp:cNvGraphicFramePr>
+            <a:graphic xmlns:a="http://schemas.openxmlformats.org/drawingml/2006/main">
+              <a:graphicData uri="http://schemas.openxmlformats.org/drawingml/2006/picture">
+                <pic:pic xmlns:pic="http://schemas.openxmlformats.org/drawingml/2006/picture">
+                  <pic:nvPicPr>
+                    <pic:cNvPr id="295652819" name=""/>
+                    <pic:cNvPicPr/>
+                  </pic:nvPicPr>
+                  <pic:blipFill>
+                    <a:blip r:embed="rId31"/>
+                    <a:stretch>
+                      <a:fillRect/>
+                    </a:stretch>
+                  </pic:blipFill>
+                  <pic:spPr>
+                    <a:xfrm>
+                      <a:off x="0" y="0"/>
+                      <a:ext cx="2452535" cy="1013239"/>
+                    </a:xfrm>
+                    <a:prstGeom prst="rect">
+                      <a:avLst/>
+                    </a:prstGeom>
+                  </pic:spPr>
+                </pic:pic>
+              </a:graphicData>
+            </a:graphic>
+          </wp:inline>
+        </w:drawing>
+      </w:r>
+      <w:r>
+        <w:rPr>
+          <w:b/>
+          <w:bCs/>
+        </w:rPr>
+        <w:drawing>
+          <wp:inline distT="0" distB="0" distL="0" distR="0" wp14:anchorId="01CEDC12" wp14:editId="719D710C">
+            <wp:extent cx="2580244" cy="1003110"/>
+            <wp:effectExtent l="0" t="0" r="0" b="6985"/>
+            <wp:docPr id="1618189387" name="Picture 1"/>
+            <wp:cNvGraphicFramePr>
+              <a:graphicFrameLocks xmlns:a="http://schemas.openxmlformats.org/drawingml/2006/main" noChangeAspect="1"/>
+            </wp:cNvGraphicFramePr>
+            <a:graphic xmlns:a="http://schemas.openxmlformats.org/drawingml/2006/main">
+              <a:graphicData uri="http://schemas.openxmlformats.org/drawingml/2006/picture">
+                <pic:pic xmlns:pic="http://schemas.openxmlformats.org/drawingml/2006/picture">
+                  <pic:nvPicPr>
+                    <pic:cNvPr id="1618189387" name=""/>
+                    <pic:cNvPicPr/>
+                  </pic:nvPicPr>
+                  <pic:blipFill>
+                    <a:blip r:embed="rId32"/>
+                    <a:stretch>
+                      <a:fillRect/>
+                    </a:stretch>
+                  </pic:blipFill>
+                  <pic:spPr>
+                    <a:xfrm>
+                      <a:off x="0" y="0"/>
+                      <a:ext cx="2610656" cy="1014933"/>
+                    </a:xfrm>
+                    <a:prstGeom prst="rect">
+                      <a:avLst/>
+                    </a:prstGeom>
+                  </pic:spPr>
+                </pic:pic>
+              </a:graphicData>
+            </a:graphic>
+          </wp:inline>
+        </w:drawing>
+      </w:r>
+    </w:p>
+    <w:p>
+      <w:pPr>
+        <w:rPr>
+          <w:b/>
+          <w:bCs/>
+        </w:rPr>
+      </w:pPr>
+      <w:r>
+        <w:rPr>
+          <w:b/>
+          <w:bCs/>
+        </w:rPr>
+        <w:t>After:</w:t>
+      </w:r>
+    </w:p>
+    <w:p>
+      <w:pPr>
+        <w:rPr>
+          <w:b/>
+          <w:bCs/>
+        </w:rPr>
+      </w:pPr>
+      <w:r>
+        <w:rPr>
+          <w:b/>
+          <w:bCs/>
+        </w:rPr>
+        <w:drawing>
+          <wp:inline distT="0" distB="0" distL="0" distR="0" wp14:anchorId="697F9498" wp14:editId="7E94484D">
+            <wp:extent cx="2444115" cy="938544"/>
+            <wp:effectExtent l="0" t="0" r="0" b="0"/>
+            <wp:docPr id="987484066" name="Picture 1"/>
+            <wp:cNvGraphicFramePr>
+              <a:graphicFrameLocks xmlns:a="http://schemas.openxmlformats.org/drawingml/2006/main" noChangeAspect="1"/>
+            </wp:cNvGraphicFramePr>
+            <a:graphic xmlns:a="http://schemas.openxmlformats.org/drawingml/2006/main">
+              <a:graphicData uri="http://schemas.openxmlformats.org/drawingml/2006/picture">
+                <pic:pic xmlns:pic="http://schemas.openxmlformats.org/drawingml/2006/picture">
+                  <pic:nvPicPr>
+                    <pic:cNvPr id="987484066" name=""/>
+                    <pic:cNvPicPr/>
+                  </pic:nvPicPr>
+                  <pic:blipFill>
+                    <a:blip r:embed="rId33"/>
+                    <a:stretch>
+                      <a:fillRect/>
+                    </a:stretch>
+                  </pic:blipFill>
+                  <pic:spPr>
+                    <a:xfrm>
+                      <a:off x="0" y="0"/>
+                      <a:ext cx="2468365" cy="947856"/>
+                    </a:xfrm>
+                    <a:prstGeom prst="rect">
+                      <a:avLst/>
+                    </a:prstGeom>
+                  </pic:spPr>
+                </pic:pic>
+              </a:graphicData>
+            </a:graphic>
+          </wp:inline>
+        </w:drawing>
+      </w:r>
+      <w:r>
+        <w:rPr>
+          <w:b/>
+          <w:bCs/>
+        </w:rPr>
+        <w:drawing>
+          <wp:inline distT="0" distB="0" distL="0" distR="0" wp14:anchorId="740E29F3" wp14:editId="6CF506AE">
+            <wp:extent cx="1950582" cy="927748"/>
+            <wp:effectExtent l="0" t="0" r="0" b="5715"/>
+            <wp:docPr id="682570808" name="Picture 1"/>
+            <wp:cNvGraphicFramePr>
+              <a:graphicFrameLocks xmlns:a="http://schemas.openxmlformats.org/drawingml/2006/main" noChangeAspect="1"/>
+            </wp:cNvGraphicFramePr>
+            <a:graphic xmlns:a="http://schemas.openxmlformats.org/drawingml/2006/main">
+              <a:graphicData uri="http://schemas.openxmlformats.org/drawingml/2006/picture">
+                <pic:pic xmlns:pic="http://schemas.openxmlformats.org/drawingml/2006/picture">
+                  <pic:nvPicPr>
+                    <pic:cNvPr id="682570808" name=""/>
+                    <pic:cNvPicPr/>
+                  </pic:nvPicPr>
+                  <pic:blipFill>
+                    <a:blip r:embed="rId34"/>
+                    <a:stretch>
+                      <a:fillRect/>
+                    </a:stretch>
+                  </pic:blipFill>
+                  <pic:spPr>
+                    <a:xfrm>
+                      <a:off x="0" y="0"/>
+                      <a:ext cx="2006316" cy="954257"/>
+                    </a:xfrm>
+                    <a:prstGeom prst="rect">
+                      <a:avLst/>
+                    </a:prstGeom>
+                  </pic:spPr>
+                </pic:pic>
+              </a:graphicData>
+            </a:graphic>
+          </wp:inline>
+        </w:drawing>
+      </w:r>
+      <w:r>
+        <w:rPr>
+          <w:b/>
+          <w:bCs/>
+        </w:rPr>
+        <w:drawing>
+          <wp:inline distT="0" distB="0" distL="0" distR="0" wp14:anchorId="397B3FAE" wp14:editId="6DCEB5FD">
+            <wp:extent cx="966463" cy="928048"/>
+            <wp:effectExtent l="0" t="0" r="5715" b="5715"/>
+            <wp:docPr id="1203734166" name="Picture 1"/>
+            <wp:cNvGraphicFramePr>
+              <a:graphicFrameLocks xmlns:a="http://schemas.openxmlformats.org/drawingml/2006/main" noChangeAspect="1"/>
+            </wp:cNvGraphicFramePr>
+            <a:graphic xmlns:a="http://schemas.openxmlformats.org/drawingml/2006/main">
+              <a:graphicData uri="http://schemas.openxmlformats.org/drawingml/2006/picture">
+                <pic:pic xmlns:pic="http://schemas.openxmlformats.org/drawingml/2006/picture">
+                  <pic:nvPicPr>
+                    <pic:cNvPr id="1203734166" name=""/>
+                    <pic:cNvPicPr/>
+                  </pic:nvPicPr>
+                  <pic:blipFill>
+                    <a:blip r:embed="rId35"/>
+                    <a:stretch>
+                      <a:fillRect/>
+                    </a:stretch>
+                  </pic:blipFill>
+                  <pic:spPr>
+                    <a:xfrm>
+                      <a:off x="0" y="0"/>
+                      <a:ext cx="985431" cy="946262"/>
+                    </a:xfrm>
+                    <a:prstGeom prst="rect">
+                      <a:avLst/>
+                    </a:prstGeom>
+                  </pic:spPr>
+                </pic:pic>
+              </a:graphicData>
+            </a:graphic>
+          </wp:inline>
+        </w:drawing>
+      </w:r>
+    </w:p>
+    <w:p>
+      <w:pPr>
+        <w:pStyle w:val="ListParagraph"/>
+        <w:rPr>
+          <w:b/>
+          <w:bCs/>
+        </w:rPr>
+      </w:pPr>
+    </w:p>
+    <w:p>
+      <w:pPr>
+        <w:pStyle w:val="ListParagraph"/>
+        <w:numPr>
+          <w:ilvl w:val="0"/>
+          <w:numId w:val="3"/>
+        </w:numPr>
+        <w:rPr>
+          <w:b/>
+          <w:bCs/>
+        </w:rPr>
+      </w:pPr>
+      <w:r>
+        <w:rPr>
+          <w:b/>
+          <w:bCs/>
+        </w:rPr>
+        <w:t>Remove Empty Rows</w:t>
+      </w:r>
+    </w:p>
+    <w:p>
+      <w:pPr>
+        <w:pStyle w:val="ListParagraph"/>
+        <w:rPr>
+          <w:b/>
+          <w:bCs/>
+        </w:rPr>
+      </w:pPr>
+      <w:r>
+        <w:rPr>
+          <w:b/>
+          <w:bCs/>
+        </w:rPr>
+        <w:drawing>
+          <wp:inline distT="0" distB="0" distL="0" distR="0" wp14:anchorId="158DFC28" wp14:editId="14FA2967">
+            <wp:extent cx="5731510" cy="245745"/>
+            <wp:effectExtent l="0" t="0" r="2540" b="1905"/>
+            <wp:docPr id="1793649761" name="Picture 1"/>
+            <wp:cNvGraphicFramePr>
+              <a:graphicFrameLocks xmlns:a="http://schemas.openxmlformats.org/drawingml/2006/main" noChangeAspect="1"/>
+            </wp:cNvGraphicFramePr>
+            <a:graphic xmlns:a="http://schemas.openxmlformats.org/drawingml/2006/main">
+              <a:graphicData uri="http://schemas.openxmlformats.org/drawingml/2006/picture">
+                <pic:pic xmlns:pic="http://schemas.openxmlformats.org/drawingml/2006/picture">
+                  <pic:nvPicPr>
+                    <pic:cNvPr id="1793649761" name=""/>
+                    <pic:cNvPicPr/>
+                  </pic:nvPicPr>
+                  <pic:blipFill>
+                    <a:blip r:embed="rId36"/>
+                    <a:stretch>
+                      <a:fillRect/>
+                    </a:stretch>
+                  </pic:blipFill>
+                  <pic:spPr>
+                    <a:xfrm>
+                      <a:off x="0" y="0"/>
+                      <a:ext cx="5731510" cy="245745"/>
+                    </a:xfrm>
+                    <a:prstGeom prst="rect">
+                      <a:avLst/>
+                    </a:prstGeom>
+                  </pic:spPr>
+                </pic:pic>
+              </a:graphicData>
+            </a:graphic>
+          </wp:inline>
+        </w:drawing>
+      </w:r>
+    </w:p>
+    <w:p>
+      <w:pPr>
+        <w:pStyle w:val="ListParagraph"/>
+        <w:numPr>
+          <w:ilvl w:val="0"/>
+          <w:numId w:val="3"/>
+        </w:numPr>
+        <w:rPr>
+          <w:b/>
+          <w:bCs/>
+        </w:rPr>
+      </w:pPr>
+      <w:r>
+        <w:rPr>
+          <w:b/>
+          <w:bCs/>
+        </w:rPr>
+        <w:t>Change Data Types</w:t>
+      </w:r>
+    </w:p>
+    <w:p>
+      <w:pPr>
+        <w:pStyle w:val="ListParagraph"/>
+        <w:rPr>
+          <w:b/>
+          <w:bCs/>
+        </w:rPr>
+      </w:pPr>
+      <w:r>
+        <w:rPr>
+          <w:b/>
+          <w:bCs/>
+        </w:rPr>
+        <w:drawing>
+          <wp:inline distT="0" distB="0" distL="0" distR="0" wp14:anchorId="33AA94D5" wp14:editId="296ADDAA">
+            <wp:extent cx="5731510" cy="440690"/>
+            <wp:effectExtent l="0" t="0" r="2540" b="0"/>
+            <wp:docPr id="1614866000" name="Picture 1"/>
+            <wp:cNvGraphicFramePr>
+              <a:graphicFrameLocks xmlns:a="http://schemas.openxmlformats.org/drawingml/2006/main" noChangeAspect="1"/>
+            </wp:cNvGraphicFramePr>
+            <a:graphic xmlns:a="http://schemas.openxmlformats.org/drawingml/2006/main">
+              <a:graphicData uri="http://schemas.openxmlformats.org/drawingml/2006/picture">
+                <pic:pic xmlns:pic="http://schemas.openxmlformats.org/drawingml/2006/picture">
+                  <pic:nvPicPr>
+                    <pic:cNvPr id="1614866000" name=""/>
+                    <pic:cNvPicPr/>
+                  </pic:nvPicPr>
+                  <pic:blipFill>
+                    <a:blip r:embed="rId37"/>
+                    <a:stretch>
+                      <a:fillRect/>
+                    </a:stretch>
+                  </pic:blipFill>
+                  <pic:spPr>
+                    <a:xfrm>
+                      <a:off x="0" y="0"/>
+                      <a:ext cx="5731510" cy="440690"/>
+                    </a:xfrm>
+                    <a:prstGeom prst="rect">
+                      <a:avLst/>
+                    </a:prstGeom>
+                  </pic:spPr>
+                </pic:pic>
+              </a:graphicData>
+            </a:graphic>
+          </wp:inline>
+        </w:drawing>
+      </w:r>
+    </w:p>
+    <w:p>
+      <w:pPr>
+        <w:pStyle w:val="ListParagraph"/>
+        <w:rPr>
+          <w:b/>
+          <w:bCs/>
+        </w:rPr>
+      </w:pPr>
+    </w:p>
+    <w:p>
+      <w:pPr>
+        <w:pStyle w:val="ListParagraph"/>
+        <w:numPr>
+          <w:ilvl w:val="0"/>
+          <w:numId w:val="3"/>
+        </w:numPr>
+        <w:rPr>
+          <w:b/>
+          <w:bCs/>
+        </w:rPr>
+      </w:pPr>
+      <w:r>
+        <w:rPr>
+          <w:b/>
+          <w:bCs/>
+        </w:rPr>
+        <w:lastRenderedPageBreak/>
+        <w:t>Merge CategoryTranslation into Products </w:t>
+      </w:r>
+    </w:p>
+    <w:p>
+      <w:pPr>
+        <w:pStyle w:val="ListParagraph"/>
+      </w:pPr>
+      <w:r>
+        <w:t>All category names are in Portuguese. English names are required for readable dashboard visuals. Null replacement prevents blank chart labels.</w:t>
+      </w:r>
+    </w:p>
+    <w:p>
+      <w:pPr>
+        <w:pStyle w:val="ListParagraph"/>
+        <w:numPr>
+          <w:ilvl w:val="1"/>
+          <w:numId w:val="3"/>
+        </w:numPr>
+        <w:rPr>
+          <w:b/>
+          <w:bCs/>
+        </w:rPr>
+      </w:pPr>
+      <w:r>
+        <w:rPr>
+          <w:b/>
+          <w:bCs/>
+        </w:rPr>
+        <w:t>Merge tables</w:t>
+      </w:r>
+    </w:p>
+    <w:p>
+      <w:pPr>
+        <w:pStyle w:val="ListParagraph"/>
+        <w:ind w:left="1440"/>
+        <w:rPr>
+          <w:b/>
+          <w:bCs/>
+        </w:rPr>
+      </w:pPr>
+      <w:r>
+        <w:rPr>
+          <w:b/>
+          <w:bCs/>
+        </w:rPr>
+        <w:drawing>
+          <wp:inline distT="0" distB="0" distL="0" distR="0" wp14:anchorId="3E84B8B3" wp14:editId="5B9FD523">
+            <wp:extent cx="5731510" cy="381635"/>
+            <wp:effectExtent l="0" t="0" r="2540" b="0"/>
+            <wp:docPr id="564149476" name="Picture 1"/>
+            <wp:cNvGraphicFramePr>
+              <a:graphicFrameLocks xmlns:a="http://schemas.openxmlformats.org/drawingml/2006/main" noChangeAspect="1"/>
+            </wp:cNvGraphicFramePr>
+            <a:graphic xmlns:a="http://schemas.openxmlformats.org/drawingml/2006/main">
+              <a:graphicData uri="http://schemas.openxmlformats.org/drawingml/2006/picture">
+                <pic:pic xmlns:pic="http://schemas.openxmlformats.org/drawingml/2006/picture">
+                  <pic:nvPicPr>
+                    <pic:cNvPr id="564149476" name=""/>
+                    <pic:cNvPicPr/>
+                  </pic:nvPicPr>
+                  <pic:blipFill>
+                    <a:blip r:embed="rId38"/>
+                    <a:stretch>
+                      <a:fillRect/>
+                    </a:stretch>
+                  </pic:blipFill>
+                  <pic:spPr>
+                    <a:xfrm>
+                      <a:off x="0" y="0"/>
+                      <a:ext cx="5731510" cy="381635"/>
+                    </a:xfrm>
+                    <a:prstGeom prst="rect">
+                      <a:avLst/>
+                    </a:prstGeom>
+                  </pic:spPr>
+                </pic:pic>
+              </a:graphicData>
+            </a:graphic>
+          </wp:inline>
+        </w:drawing>
+      </w:r>
+    </w:p>
+    <w:p>
+      <w:pPr>
+        <w:pStyle w:val="ListParagraph"/>
+        <w:numPr>
+          <w:ilvl w:val="1"/>
+          <w:numId w:val="3"/>
+        </w:numPr>
+        <w:rPr>
+          <w:b/>
+          <w:bCs/>
+        </w:rPr>
+      </w:pPr>
+      <w:r>
+        <w:rPr>
+          <w:b/>
+          <w:bCs/>
+        </w:rPr>
+        <w:t>Expand Merged Columns</w:t>
+      </w:r>
+    </w:p>
+    <w:p>
+      <w:pPr>
+        <w:pStyle w:val="ListParagraph"/>
+        <w:ind w:left="1440"/>
+        <w:rPr>
+          <w:b/>
+          <w:bCs/>
+        </w:rPr>
+      </w:pPr>
+      <w:r>
+        <w:rPr>
+          <w:b/>
+          <w:bCs/>
+        </w:rPr>
+        <w:drawing>
+          <wp:inline distT="0" distB="0" distL="0" distR="0" wp14:anchorId="40361285" wp14:editId="6D917681">
+            <wp:extent cx="5731510" cy="384175"/>
+            <wp:effectExtent l="0" t="0" r="2540" b="0"/>
+            <wp:docPr id="33805983" name="Picture 1"/>
+            <wp:cNvGraphicFramePr>
+              <a:graphicFrameLocks xmlns:a="http://schemas.openxmlformats.org/drawingml/2006/main" noChangeAspect="1"/>
+            </wp:cNvGraphicFramePr>
+            <a:graphic xmlns:a="http://schemas.openxmlformats.org/drawingml/2006/main">
+              <a:graphicData uri="http://schemas.openxmlformats.org/drawingml/2006/picture">
+                <pic:pic xmlns:pic="http://schemas.openxmlformats.org/drawingml/2006/picture">
+                  <pic:nvPicPr>
+                    <pic:cNvPr id="33805983" name=""/>
+                    <pic:cNvPicPr/>
+                  </pic:nvPicPr>
+                  <pic:blipFill>
+                    <a:blip r:embed="rId39"/>
+                    <a:stretch>
+                      <a:fillRect/>
+                    </a:stretch>
+                  </pic:blipFill>
+                  <pic:spPr>
+                    <a:xfrm>
+                      <a:off x="0" y="0"/>
+                      <a:ext cx="5731510" cy="384175"/>
+                    </a:xfrm>
+                    <a:prstGeom prst="rect">
+                      <a:avLst/>
+                    </a:prstGeom>
+                  </pic:spPr>
+                </pic:pic>
+              </a:graphicData>
+            </a:graphic>
+          </wp:inline>
+        </w:drawing>
+      </w:r>
+    </w:p>
+    <w:p>
+      <w:pPr>
+        <w:rPr>
+          <w:b/>
+          <w:bCs/>
+        </w:rPr>
+      </w:pPr>
+    </w:p>
+    <w:p>
+      <w:pPr>
+        <w:rPr>
+          <w:b/>
+          <w:bCs/>
+        </w:rPr>
+      </w:pPr>
+      <w:r>
+        <w:rPr>
+          <w:b/>
+          <w:bCs/>
+        </w:rPr>
+        <w:t>DimGeoLocation</w:t>
+      </w:r>
+    </w:p>
+    <w:p>
+      <w:pPr>
+        <w:rPr>
+          <w:b/>
+          <w:bCs/>
+        </w:rPr>
+      </w:pPr>
+      <w:r>
+        <w:rPr>
+          <w:b/>
+          <w:bCs/>
+        </w:rPr>
+        <w:t>Steps Pane:</w:t>
+      </w:r>
+    </w:p>
+    <w:p>
+      <w:pPr>
+        <w:rPr>
+          <w:b/>
+          <w:bCs/>
+        </w:rPr>
+      </w:pPr>
+      <w:r>
+        <w:rPr>
+          <w:b/>
+          <w:bCs/>
+        </w:rPr>
+        <w:drawing>
+          <wp:inline distT="0" distB="0" distL="0" distR="0" wp14:anchorId="062CE393" wp14:editId="5F0B1796">
+            <wp:extent cx="2088107" cy="906046"/>
+            <wp:effectExtent l="0" t="0" r="7620" b="8890"/>
+            <wp:docPr id="376073883" name="Picture 1"/>
+            <wp:cNvGraphicFramePr>
+              <a:graphicFrameLocks xmlns:a="http://schemas.openxmlformats.org/drawingml/2006/main" noChangeAspect="1"/>
+            </wp:cNvGraphicFramePr>
+            <a:graphic xmlns:a="http://schemas.openxmlformats.org/drawingml/2006/main">
+              <a:graphicData uri="http://schemas.openxmlformats.org/drawingml/2006/picture">
+                <pic:pic xmlns:pic="http://schemas.openxmlformats.org/drawingml/2006/picture">
+                  <pic:nvPicPr>
+                    <pic:cNvPr id="376073883" name=""/>
+                    <pic:cNvPicPr/>
+                  </pic:nvPicPr>
+                  <pic:blipFill>
+                    <a:blip r:embed="rId40"/>
+                    <a:stretch>
+                      <a:fillRect/>
+                    </a:stretch>
+                  </pic:blipFill>
+                  <pic:spPr>
+                    <a:xfrm>
+                      <a:off x="0" y="0"/>
+                      <a:ext cx="2098173" cy="910414"/>
+                    </a:xfrm>
+                    <a:prstGeom prst="rect">
+                      <a:avLst/>
+                    </a:prstGeom>
+                  </pic:spPr>
+                </pic:pic>
+              </a:graphicData>
+            </a:graphic>
+          </wp:inline>
+        </w:drawing>
+      </w:r>
+    </w:p>
+    <w:p>
+      <w:pPr>
+        <w:rPr>
+          <w:b/>
+          <w:bCs/>
+        </w:rPr>
+      </w:pPr>
+      <w:r>
+        <w:rPr>
+          <w:b/>
+          <w:bCs/>
+        </w:rPr>
+        <w:t>Before:</w:t>
+      </w:r>
+    </w:p>
+    <w:p>
+      <w:pPr>
+        <w:rPr>
+          <w:b/>
+          <w:bCs/>
+        </w:rPr>
+      </w:pPr>
+      <w:r>
+        <w:rPr>
+          <w:b/>
+          <w:bCs/>
+        </w:rPr>
+        <w:drawing>
+          <wp:inline distT="0" distB="0" distL="0" distR="0" wp14:anchorId="0F710BF2" wp14:editId="7AC43754">
+            <wp:extent cx="3070746" cy="1172368"/>
+            <wp:effectExtent l="0" t="0" r="0" b="8890"/>
+            <wp:docPr id="1893638321" name="Picture 1"/>
+            <wp:cNvGraphicFramePr>
+              <a:graphicFrameLocks xmlns:a="http://schemas.openxmlformats.org/drawingml/2006/main" noChangeAspect="1"/>
+            </wp:cNvGraphicFramePr>
+            <a:graphic xmlns:a="http://schemas.openxmlformats.org/drawingml/2006/main">
+              <a:graphicData uri="http://schemas.openxmlformats.org/drawingml/2006/picture">
+                <pic:pic xmlns:pic="http://schemas.openxmlformats.org/drawingml/2006/picture">
+                  <pic:nvPicPr>
+                    <pic:cNvPr id="1893638321" name=""/>
+                    <pic:cNvPicPr/>
+                  </pic:nvPicPr>
+                  <pic:blipFill>
+                    <a:blip r:embed="rId41"/>
+                    <a:stretch>
+                      <a:fillRect/>
+                    </a:stretch>
+                  </pic:blipFill>
+                  <pic:spPr>
+                    <a:xfrm>
+                      <a:off x="0" y="0"/>
+                      <a:ext cx="3085222" cy="1177895"/>
+                    </a:xfrm>
+                    <a:prstGeom prst="rect">
+                      <a:avLst/>
+                    </a:prstGeom>
+                  </pic:spPr>
+                </pic:pic>
+              </a:graphicData>
+            </a:graphic>
+          </wp:inline>
+        </w:drawing>
+      </w:r>
+    </w:p>
+    <w:p>
+      <w:pPr>
+        <w:rPr>
+          <w:b/>
+          <w:bCs/>
+        </w:rPr>
+      </w:pPr>
+      <w:r>
+        <w:rPr>
+          <w:b/>
+          <w:bCs/>
+        </w:rPr>
+        <w:t>After:</w:t>
+      </w:r>
+    </w:p>
+    <w:p>
+      <w:pPr>
+        <w:rPr>
+          <w:b/>
+          <w:bCs/>
+        </w:rPr>
+      </w:pPr>
+      <w:r>
+        <w:rPr>
+          <w:b/>
+          <w:bCs/>
+        </w:rPr>
+        <w:drawing>
+          <wp:inline distT="0" distB="0" distL="0" distR="0" wp14:anchorId="736777FF" wp14:editId="0D9D710B">
+            <wp:extent cx="2863390" cy="1658203"/>
+            <wp:effectExtent l="0" t="0" r="0" b="0"/>
+            <wp:docPr id="278772635" name="Picture 1"/>
+            <wp:cNvGraphicFramePr>
+              <a:graphicFrameLocks xmlns:a="http://schemas.openxmlformats.org/drawingml/2006/main" noChangeAspect="1"/>
+            </wp:cNvGraphicFramePr>
+            <a:graphic xmlns:a="http://schemas.openxmlformats.org/drawingml/2006/main">
+              <a:graphicData uri="http://schemas.openxmlformats.org/drawingml/2006/picture">
+                <pic:pic xmlns:pic="http://schemas.openxmlformats.org/drawingml/2006/picture">
+                  <pic:nvPicPr>
+                    <pic:cNvPr id="278772635" name=""/>
+                    <pic:cNvPicPr/>
+                  </pic:nvPicPr>
+                  <pic:blipFill>
+                    <a:blip r:embed="rId42"/>
+                    <a:stretch>
+                      <a:fillRect/>
+                    </a:stretch>
+                  </pic:blipFill>
+                  <pic:spPr>
+                    <a:xfrm>
+                      <a:off x="0" y="0"/>
+                      <a:ext cx="2866082" cy="1659762"/>
+                    </a:xfrm>
+                    <a:prstGeom prst="rect">
+                      <a:avLst/>
+                    </a:prstGeom>
+                  </pic:spPr>
+                </pic:pic>
+              </a:graphicData>
+            </a:graphic>
+          </wp:inline>
+        </w:drawing>
+      </w:r>
+    </w:p>
+    <w:p>
+      <w:pPr>
+        <w:rPr>
+          <w:b/>
+          <w:bCs/>
+        </w:rPr>
+      </w:pPr>
+    </w:p>
+    <w:p>
+      <w:pPr>
+        <w:pStyle w:val="ListParagraph"/>
+        <w:numPr>
+          <w:ilvl w:val="0"/>
+          <w:numId w:val="7"/>
+        </w:numPr>
+        <w:rPr>
+          <w:b/>
+          <w:bCs/>
+        </w:rPr>
+      </w:pPr>
+      <w:r>
+        <w:rPr>
+          <w:b/>
+          <w:bCs/>
+        </w:rPr>
+        <w:t>Deduplicate Geolocation on zip code </w:t>
+      </w:r>
+    </w:p>
+    <w:p>
+      <w:pPr>
+        <w:pStyle w:val="ListParagraph"/>
+        <w:rPr>
+          <w:b/>
+          <w:bCs/>
+        </w:rPr>
+      </w:pPr>
+      <w:r>
+        <w:rPr>
+          <w:b/>
+          <w:bCs/>
+        </w:rPr>
+        <w:drawing>
+          <wp:inline distT="0" distB="0" distL="0" distR="0" wp14:anchorId="44A8726E" wp14:editId="79020F4A">
+            <wp:extent cx="5731510" cy="338455"/>
+            <wp:effectExtent l="0" t="0" r="2540" b="4445"/>
+            <wp:docPr id="1886696018" name="Picture 1"/>
+            <wp:cNvGraphicFramePr>
+              <a:graphicFrameLocks xmlns:a="http://schemas.openxmlformats.org/drawingml/2006/main" noChangeAspect="1"/>
+            </wp:cNvGraphicFramePr>
+            <a:graphic xmlns:a="http://schemas.openxmlformats.org/drawingml/2006/main">
+              <a:graphicData uri="http://schemas.openxmlformats.org/drawingml/2006/picture">
+                <pic:pic xmlns:pic="http://schemas.openxmlformats.org/drawingml/2006/picture">
+                  <pic:nvPicPr>
+                    <pic:cNvPr id="1886696018" name=""/>
+                    <pic:cNvPicPr/>
+                  </pic:nvPicPr>
+                  <pic:blipFill>
+                    <a:blip r:embed="rId43"/>
+                    <a:stretch>
+                      <a:fillRect/>
+                    </a:stretch>
+                  </pic:blipFill>
+                  <pic:spPr>
+                    <a:xfrm>
+                      <a:off x="0" y="0"/>
+                      <a:ext cx="5731510" cy="338455"/>
+                    </a:xfrm>
+                    <a:prstGeom prst="rect">
+                      <a:avLst/>
+                    </a:prstGeom>
+                  </pic:spPr>
+                </pic:pic>
+              </a:graphicData>
+            </a:graphic>
+          </wp:inline>
+        </w:drawing>
+      </w:r>
+    </w:p>
+    <w:p>
+      <w:pPr>
+        <w:pStyle w:val="ListParagraph"/>
+        <w:rPr>
+          <w:b/>
+          <w:bCs/>
+        </w:rPr>
+      </w:pPr>
+      <w:r>
+        <w:rPr>
+          <w:b/>
+          <w:bCs/>
+        </w:rPr>
+        <w:drawing>
+          <wp:inline distT="0" distB="0" distL="0" distR="0" wp14:anchorId="16132B5D" wp14:editId="1E217546">
+            <wp:extent cx="4924425" cy="290250"/>
+            <wp:effectExtent l="0" t="0" r="0" b="0"/>
+            <wp:docPr id="1533638546" name="Picture 1"/>
+            <wp:cNvGraphicFramePr>
+              <a:graphicFrameLocks xmlns:a="http://schemas.openxmlformats.org/drawingml/2006/main" noChangeAspect="1"/>
+            </wp:cNvGraphicFramePr>
+            <a:graphic xmlns:a="http://schemas.openxmlformats.org/drawingml/2006/main">
+              <a:graphicData uri="http://schemas.openxmlformats.org/drawingml/2006/picture">
+                <pic:pic xmlns:pic="http://schemas.openxmlformats.org/drawingml/2006/picture">
+                  <pic:nvPicPr>
+                    <pic:cNvPr id="1533638546" name=""/>
+                    <pic:cNvPicPr/>
+                  </pic:nvPicPr>
+                  <pic:blipFill>
+                    <a:blip r:embed="rId44"/>
+                    <a:stretch>
+                      <a:fillRect/>
+                    </a:stretch>
+                  </pic:blipFill>
+                  <pic:spPr>
+                    <a:xfrm>
+                      <a:off x="0" y="0"/>
+                      <a:ext cx="5039036" cy="297005"/>
+                    </a:xfrm>
+                    <a:prstGeom prst="rect">
+                      <a:avLst/>
+                    </a:prstGeom>
+                  </pic:spPr>
+                </pic:pic>
+              </a:graphicData>
+            </a:graphic>
+          </wp:inline>
+        </w:drawing>
+      </w:r>
+    </w:p>
+    <w:p>
+      <w:pPr>
+        <w:rPr>
+          <w:b/>
+          <w:bCs/>
+        </w:rPr>
+      </w:pPr>
+    </w:p>
+    <w:p>
+      <w:pPr>
+        <w:rPr>
+          <w:b/>
+          <w:bCs/>
+        </w:rPr>
+      </w:pPr>
+      <w:r>
+        <w:rPr>
+          <w:b/>
+          <w:bCs/>
+        </w:rPr>
+        <w:lastRenderedPageBreak/>
+        <w:t>DimOrderPayments</w:t>
+      </w:r>
+    </w:p>
+    <w:p>
+      <w:pPr>
+        <w:rPr>
+          <w:b/>
+          <w:bCs/>
+        </w:rPr>
+      </w:pPr>
+      <w:r>
+        <w:rPr>
+          <w:b/>
+          <w:bCs/>
+        </w:rPr>
+        <w:t>Steps Pane:</w:t>
+      </w:r>
+    </w:p>
+    <w:p>
+      <w:pPr>
+        <w:rPr>
+          <w:b/>
+          <w:bCs/>
+        </w:rPr>
+      </w:pPr>
+      <w:r>
+        <w:rPr>
+          <w:b/>
+          <w:bCs/>
+        </w:rPr>
+        <w:drawing>
+          <wp:inline distT="0" distB="0" distL="0" distR="0" wp14:anchorId="283BCEBC" wp14:editId="69343954">
+            <wp:extent cx="1501254" cy="583345"/>
+            <wp:effectExtent l="0" t="0" r="3810" b="7620"/>
+            <wp:docPr id="158749495" name="Picture 1"/>
+            <wp:cNvGraphicFramePr>
+              <a:graphicFrameLocks xmlns:a="http://schemas.openxmlformats.org/drawingml/2006/main" noChangeAspect="1"/>
+            </wp:cNvGraphicFramePr>
+            <a:graphic xmlns:a="http://schemas.openxmlformats.org/drawingml/2006/main">
+              <a:graphicData uri="http://schemas.openxmlformats.org/drawingml/2006/picture">
+                <pic:pic xmlns:pic="http://schemas.openxmlformats.org/drawingml/2006/picture">
+                  <pic:nvPicPr>
+                    <pic:cNvPr id="158749495" name=""/>
+                    <pic:cNvPicPr/>
+                  </pic:nvPicPr>
+                  <pic:blipFill>
+                    <a:blip r:embed="rId45"/>
+                    <a:stretch>
+                      <a:fillRect/>
+                    </a:stretch>
+                  </pic:blipFill>
+                  <pic:spPr>
+                    <a:xfrm>
+                      <a:off x="0" y="0"/>
+                      <a:ext cx="1515295" cy="588801"/>
+                    </a:xfrm>
+                    <a:prstGeom prst="rect">
+                      <a:avLst/>
+                    </a:prstGeom>
+                  </pic:spPr>
+                </pic:pic>
+              </a:graphicData>
+            </a:graphic>
+          </wp:inline>
+        </w:drawing>
+      </w:r>
+    </w:p>
+    <w:p>
+      <w:pPr>
+        <w:rPr>
+          <w:b/>
+          <w:bCs/>
+        </w:rPr>
+      </w:pPr>
+      <w:r>
+        <w:rPr>
+          <w:b/>
+          <w:bCs/>
+        </w:rPr>
+        <w:t>Before:</w:t>
+      </w:r>
+    </w:p>
+    <w:p>
+      <w:pPr>
+        <w:rPr>
+          <w:b/>
+          <w:bCs/>
+        </w:rPr>
+      </w:pPr>
+      <w:r>
+        <w:rPr>
+          <w:b/>
+          <w:bCs/>
+        </w:rPr>
+        <w:drawing>
+          <wp:inline distT="0" distB="0" distL="0" distR="0" wp14:anchorId="55348058" wp14:editId="7A799D65">
+            <wp:extent cx="3725839" cy="1442287"/>
+            <wp:effectExtent l="0" t="0" r="8255" b="5715"/>
+            <wp:docPr id="479847130" name="Picture 1"/>
+            <wp:cNvGraphicFramePr>
+              <a:graphicFrameLocks xmlns:a="http://schemas.openxmlformats.org/drawingml/2006/main" noChangeAspect="1"/>
+            </wp:cNvGraphicFramePr>
+            <a:graphic xmlns:a="http://schemas.openxmlformats.org/drawingml/2006/main">
+              <a:graphicData uri="http://schemas.openxmlformats.org/drawingml/2006/picture">
+                <pic:pic xmlns:pic="http://schemas.openxmlformats.org/drawingml/2006/picture">
+                  <pic:nvPicPr>
+                    <pic:cNvPr id="479847130" name=""/>
+                    <pic:cNvPicPr/>
+                  </pic:nvPicPr>
+                  <pic:blipFill>
+                    <a:blip r:embed="rId46"/>
+                    <a:stretch>
+                      <a:fillRect/>
+                    </a:stretch>
+                  </pic:blipFill>
+                  <pic:spPr>
+                    <a:xfrm>
+                      <a:off x="0" y="0"/>
+                      <a:ext cx="3741542" cy="1448366"/>
+                    </a:xfrm>
+                    <a:prstGeom prst="rect">
+                      <a:avLst/>
+                    </a:prstGeom>
+                  </pic:spPr>
+                </pic:pic>
+              </a:graphicData>
+            </a:graphic>
+          </wp:inline>
+        </w:drawing>
+      </w:r>
+    </w:p>
+    <w:p>
+      <w:pPr>
+        <w:rPr>
+          <w:b/>
+          <w:bCs/>
+        </w:rPr>
+      </w:pPr>
+      <w:r>
+        <w:rPr>
+          <w:b/>
+          <w:bCs/>
+        </w:rPr>
+        <w:t>After:</w:t>
+      </w:r>
+    </w:p>
+    <w:p>
+      <w:pPr>
+        <w:rPr>
+          <w:b/>
+          <w:bCs/>
+        </w:rPr>
+      </w:pPr>
+      <w:r>
+        <w:rPr>
+          <w:b/>
+          <w:bCs/>
+        </w:rPr>
+        <w:drawing>
+          <wp:inline distT="0" distB="0" distL="0" distR="0" wp14:anchorId="41B747B5" wp14:editId="5EEFA1E7">
+            <wp:extent cx="3787281" cy="1712794"/>
+            <wp:effectExtent l="0" t="0" r="3810" b="1905"/>
+            <wp:docPr id="835358917" name="Picture 1"/>
+            <wp:cNvGraphicFramePr>
+              <a:graphicFrameLocks xmlns:a="http://schemas.openxmlformats.org/drawingml/2006/main" noChangeAspect="1"/>
+            </wp:cNvGraphicFramePr>
+            <a:graphic xmlns:a="http://schemas.openxmlformats.org/drawingml/2006/main">
+              <a:graphicData uri="http://schemas.openxmlformats.org/drawingml/2006/picture">
+                <pic:pic xmlns:pic="http://schemas.openxmlformats.org/drawingml/2006/picture">
+                  <pic:nvPicPr>
+                    <pic:cNvPr id="835358917" name=""/>
+                    <pic:cNvPicPr/>
+                  </pic:nvPicPr>
+                  <pic:blipFill>
+                    <a:blip r:embed="rId47"/>
+                    <a:stretch>
+                      <a:fillRect/>
+                    </a:stretch>
+                  </pic:blipFill>
+                  <pic:spPr>
+                    <a:xfrm>
+                      <a:off x="0" y="0"/>
+                      <a:ext cx="3793369" cy="1715547"/>
+                    </a:xfrm>
+                    <a:prstGeom prst="rect">
+                      <a:avLst/>
+                    </a:prstGeom>
+                  </pic:spPr>
+                </pic:pic>
+              </a:graphicData>
+            </a:graphic>
+          </wp:inline>
+        </w:drawing>
+      </w:r>
+    </w:p>
+    <w:p>
+      <w:pPr>
+        <w:rPr>
+          <w:b/>
+          <w:bCs/>
+        </w:rPr>
+      </w:pPr>
+    </w:p>
+    <w:p>
+      <w:pPr>
+        <w:pStyle w:val="ListParagraph"/>
+        <w:numPr>
+          <w:ilvl w:val="0"/>
+          <w:numId w:val="6"/>
+        </w:numPr>
+        <w:rPr>
+          <w:b/>
+          <w:bCs/>
+        </w:rPr>
+      </w:pPr>
+      <w:r>
+        <w:rPr>
+          <w:b/>
+          <w:bCs/>
+        </w:rPr>
+        <w:t>Aggregate Payments to one row per order</w:t>
+      </w:r>
+    </w:p>
+    <w:p>
+      <w:pPr>
+        <w:pStyle w:val="ListParagraph"/>
+      </w:pPr>
+      <w:r>
+        <w:rPr>
+          <w:b/>
+          <w:bCs/>
+        </w:rPr>
+        <w:t> </w:t>
+      </w:r>
+      <w:r>
+        <w:t>The Payments table has multiple rows per order_id. Without aggregation the relationship to Orders would be many-to-many, corrupting all payment measures.</w:t>
+      </w:r>
+    </w:p>
+    <w:p>
+      <w:pPr>
+        <w:pStyle w:val="ListParagraph"/>
+      </w:pPr>
+    </w:p>
+    <w:p>
+      <w:pPr>
+        <w:pStyle w:val="ListParagraph"/>
+        <w:rPr>
+          <w:b/>
+          <w:bCs/>
+        </w:rPr>
+      </w:pPr>
+      <w:r>
+        <w:rPr>
+          <w:b/>
+          <w:bCs/>
+        </w:rPr>
+        <w:drawing>
+          <wp:inline distT="0" distB="0" distL="0" distR="0" wp14:anchorId="2B0B265C" wp14:editId="2AAB612C">
+            <wp:extent cx="5731510" cy="365760"/>
+            <wp:effectExtent l="0" t="0" r="2540" b="0"/>
+            <wp:docPr id="283286322" name="Picture 1"/>
+            <wp:cNvGraphicFramePr>
+              <a:graphicFrameLocks xmlns:a="http://schemas.openxmlformats.org/drawingml/2006/main" noChangeAspect="1"/>
+            </wp:cNvGraphicFramePr>
+            <a:graphic xmlns:a="http://schemas.openxmlformats.org/drawingml/2006/main">
+              <a:graphicData uri="http://schemas.openxmlformats.org/drawingml/2006/picture">
+                <pic:pic xmlns:pic="http://schemas.openxmlformats.org/drawingml/2006/picture">
+                  <pic:nvPicPr>
+                    <pic:cNvPr id="283286322" name=""/>
+                    <pic:cNvPicPr/>
+                  </pic:nvPicPr>
+                  <pic:blipFill>
+                    <a:blip r:embed="rId48"/>
+                    <a:stretch>
+                      <a:fillRect/>
+                    </a:stretch>
+                  </pic:blipFill>
+                  <pic:spPr>
+                    <a:xfrm>
+                      <a:off x="0" y="0"/>
+                      <a:ext cx="5731510" cy="365760"/>
+                    </a:xfrm>
+                    <a:prstGeom prst="rect">
+                      <a:avLst/>
+                    </a:prstGeom>
+                  </pic:spPr>
+                </pic:pic>
+              </a:graphicData>
+            </a:graphic>
+          </wp:inline>
+        </w:drawing>
+      </w:r>
+    </w:p>
+    <w:p>
+      <w:pPr>
+        <w:rPr>
+          <w:b/>
+          <w:bCs/>
+        </w:rPr>
+      </w:pPr>
+    </w:p>
+    <w:p>
+      <w:pPr>
+        <w:rPr>
+          <w:b/>
+          <w:bCs/>
+        </w:rPr>
+      </w:pPr>
+      <w:r>
+        <w:rPr>
+          <w:b/>
+          <w:bCs/>
+        </w:rPr>
+        <w:t>DimOrderReviews</w:t>
+      </w:r>
+    </w:p>
+    <w:p>
+      <w:pPr>
+        <w:rPr>
+          <w:b/>
+          <w:bCs/>
+        </w:rPr>
+      </w:pPr>
+      <w:r>
+        <w:rPr>
+          <w:b/>
+          <w:bCs/>
+        </w:rPr>
+        <w:t>Steps Pane:</w:t>
+      </w:r>
+    </w:p>
+    <w:p>
+      <w:pPr>
+        <w:rPr>
+          <w:b/>
+          <w:bCs/>
+        </w:rPr>
+      </w:pPr>
+      <w:r>
+        <w:rPr>
+          <w:b/>
+          <w:bCs/>
+        </w:rPr>
+        <w:drawing>
+          <wp:inline distT="0" distB="0" distL="0" distR="0" wp14:anchorId="12107A98" wp14:editId="7E8482D9">
+            <wp:extent cx="1960474" cy="968839"/>
+            <wp:effectExtent l="0" t="0" r="1905" b="3175"/>
+            <wp:docPr id="1330752673" name="Picture 1"/>
+            <wp:cNvGraphicFramePr>
+              <a:graphicFrameLocks xmlns:a="http://schemas.openxmlformats.org/drawingml/2006/main" noChangeAspect="1"/>
+            </wp:cNvGraphicFramePr>
+            <a:graphic xmlns:a="http://schemas.openxmlformats.org/drawingml/2006/main">
+              <a:graphicData uri="http://schemas.openxmlformats.org/drawingml/2006/picture">
+                <pic:pic xmlns:pic="http://schemas.openxmlformats.org/drawingml/2006/picture">
+                  <pic:nvPicPr>
+                    <pic:cNvPr id="1330752673" name=""/>
+                    <pic:cNvPicPr/>
+                  </pic:nvPicPr>
+                  <pic:blipFill>
+                    <a:blip r:embed="rId49"/>
+                    <a:stretch>
+                      <a:fillRect/>
+                    </a:stretch>
+                  </pic:blipFill>
+                  <pic:spPr>
+                    <a:xfrm>
+                      <a:off x="0" y="0"/>
+                      <a:ext cx="1967116" cy="972122"/>
+                    </a:xfrm>
+                    <a:prstGeom prst="rect">
+                      <a:avLst/>
+                    </a:prstGeom>
+                  </pic:spPr>
+                </pic:pic>
+              </a:graphicData>
+            </a:graphic>
+          </wp:inline>
+        </w:drawing>
+      </w:r>
+    </w:p>
+    <w:p>
+      <w:pPr>
+        <w:rPr>
+          <w:b/>
+          <w:bCs/>
+        </w:rPr>
+      </w:pPr>
+      <w:r>
+        <w:rPr>
+          <w:b/>
+          <w:bCs/>
+        </w:rPr>
+        <w:t>Before:</w:t>
+      </w:r>
+    </w:p>
+    <w:p>
+      <w:pPr>
+        <w:rPr>
+          <w:b/>
+          <w:bCs/>
+        </w:rPr>
+      </w:pPr>
+      <w:r>
+        <w:rPr>
+          <w:b/>
+          <w:bCs/>
+        </w:rPr>
+        <w:lastRenderedPageBreak/>
+        <w:drawing>
+          <wp:inline distT="0" distB="0" distL="0" distR="0" wp14:anchorId="122F0751" wp14:editId="4B2D5D4C">
+            <wp:extent cx="2801722" cy="1215239"/>
+            <wp:effectExtent l="0" t="0" r="0" b="4445"/>
+            <wp:docPr id="558272951" name="Picture 1"/>
+            <wp:cNvGraphicFramePr>
+              <a:graphicFrameLocks xmlns:a="http://schemas.openxmlformats.org/drawingml/2006/main" noChangeAspect="1"/>
+            </wp:cNvGraphicFramePr>
+            <a:graphic xmlns:a="http://schemas.openxmlformats.org/drawingml/2006/main">
+              <a:graphicData uri="http://schemas.openxmlformats.org/drawingml/2006/picture">
+                <pic:pic xmlns:pic="http://schemas.openxmlformats.org/drawingml/2006/picture">
+                  <pic:nvPicPr>
+                    <pic:cNvPr id="558272951" name=""/>
+                    <pic:cNvPicPr/>
+                  </pic:nvPicPr>
+                  <pic:blipFill>
+                    <a:blip r:embed="rId50"/>
+                    <a:stretch>
+                      <a:fillRect/>
+                    </a:stretch>
+                  </pic:blipFill>
+                  <pic:spPr>
+                    <a:xfrm>
+                      <a:off x="0" y="0"/>
+                      <a:ext cx="2825563" cy="1225580"/>
+                    </a:xfrm>
+                    <a:prstGeom prst="rect">
+                      <a:avLst/>
+                    </a:prstGeom>
+                  </pic:spPr>
+                </pic:pic>
+              </a:graphicData>
+            </a:graphic>
+          </wp:inline>
+        </w:drawing>
+      </w:r>
+      <w:r>
+        <w:rPr>
+          <w:b/>
+          <w:bCs/>
+        </w:rPr>
+        <w:drawing>
+          <wp:inline distT="0" distB="0" distL="0" distR="0" wp14:anchorId="4687CDD4" wp14:editId="5D0F67CD">
+            <wp:extent cx="2710604" cy="1221511"/>
+            <wp:effectExtent l="0" t="0" r="0" b="0"/>
+            <wp:docPr id="1843048263" name="Picture 1"/>
+            <wp:cNvGraphicFramePr>
+              <a:graphicFrameLocks xmlns:a="http://schemas.openxmlformats.org/drawingml/2006/main" noChangeAspect="1"/>
+            </wp:cNvGraphicFramePr>
+            <a:graphic xmlns:a="http://schemas.openxmlformats.org/drawingml/2006/main">
+              <a:graphicData uri="http://schemas.openxmlformats.org/drawingml/2006/picture">
+                <pic:pic xmlns:pic="http://schemas.openxmlformats.org/drawingml/2006/picture">
+                  <pic:nvPicPr>
+                    <pic:cNvPr id="1843048263" name=""/>
+                    <pic:cNvPicPr/>
+                  </pic:nvPicPr>
+                  <pic:blipFill rotWithShape="1">
+                    <a:blip r:embed="rId51"/>
+                    <a:srcRect b="16701"/>
+                    <a:stretch>
+                      <a:fillRect/>
+                    </a:stretch>
+                  </pic:blipFill>
+                  <pic:spPr bwMode="auto">
+                    <a:xfrm>
+                      <a:off x="0" y="0"/>
+                      <a:ext cx="2726023" cy="1228459"/>
+                    </a:xfrm>
+                    <a:prstGeom prst="rect">
+                      <a:avLst/>
+                    </a:prstGeom>
+                    <a:ln>
+                      <a:noFill/>
+                    </a:ln>
+                    <a:extLst>
+                      <a:ext uri="{53640926-AAD7-44D8-BBD7-CCE9431645EC}">
+                        <a14:shadowObscured xmlns:a14="http://schemas.microsoft.com/office/drawing/2010/main"/>
+                      </a:ext>
+                    </a:extLst>
+                  </pic:spPr>
+                </pic:pic>
+              </a:graphicData>
+            </a:graphic>
+          </wp:inline>
+        </w:drawing>
+      </w:r>
+    </w:p>
+    <w:p>
+      <w:pPr>
+        <w:rPr>
+          <w:b/>
+          <w:bCs/>
+        </w:rPr>
+      </w:pPr>
+      <w:r>
+        <w:rPr>
+          <w:b/>
+          <w:bCs/>
+        </w:rPr>
+        <w:t>After:</w:t>
+      </w:r>
+    </w:p>
+    <w:p>
+      <w:pPr>
+        <w:rPr>
+          <w:b/>
+          <w:bCs/>
+        </w:rPr>
+      </w:pPr>
+      <w:r>
+        <w:rPr>
+          <w:b/>
+          <w:bCs/>
+        </w:rPr>
+        <w:drawing>
+          <wp:inline distT="0" distB="0" distL="0" distR="0" wp14:anchorId="4666712D" wp14:editId="108D7C73">
+            <wp:extent cx="2890121" cy="1470356"/>
+            <wp:effectExtent l="0" t="0" r="5715" b="0"/>
+            <wp:docPr id="1965932817" name="Picture 1"/>
+            <wp:cNvGraphicFramePr>
+              <a:graphicFrameLocks xmlns:a="http://schemas.openxmlformats.org/drawingml/2006/main" noChangeAspect="1"/>
+            </wp:cNvGraphicFramePr>
+            <a:graphic xmlns:a="http://schemas.openxmlformats.org/drawingml/2006/main">
+              <a:graphicData uri="http://schemas.openxmlformats.org/drawingml/2006/picture">
+                <pic:pic xmlns:pic="http://schemas.openxmlformats.org/drawingml/2006/picture">
+                  <pic:nvPicPr>
+                    <pic:cNvPr id="1965932817" name=""/>
+                    <pic:cNvPicPr/>
+                  </pic:nvPicPr>
+                  <pic:blipFill>
+                    <a:blip r:embed="rId52"/>
+                    <a:stretch>
+                      <a:fillRect/>
+                    </a:stretch>
+                  </pic:blipFill>
+                  <pic:spPr>
+                    <a:xfrm>
+                      <a:off x="0" y="0"/>
+                      <a:ext cx="2923760" cy="1487470"/>
+                    </a:xfrm>
+                    <a:prstGeom prst="rect">
+                      <a:avLst/>
+                    </a:prstGeom>
+                  </pic:spPr>
+                </pic:pic>
+              </a:graphicData>
+            </a:graphic>
+          </wp:inline>
+        </w:drawing>
+      </w:r>
+      <w:r>
+        <w:rPr>
+          <w:b/>
+          <w:bCs/>
+        </w:rPr>
+        <w:drawing>
+          <wp:inline distT="0" distB="0" distL="0" distR="0" wp14:anchorId="6E16DD22" wp14:editId="0EFF04AB">
+            <wp:extent cx="2452112" cy="1469746"/>
+            <wp:effectExtent l="0" t="0" r="5715" b="0"/>
+            <wp:docPr id="1064401397" name="Picture 1"/>
+            <wp:cNvGraphicFramePr>
+              <a:graphicFrameLocks xmlns:a="http://schemas.openxmlformats.org/drawingml/2006/main" noChangeAspect="1"/>
+            </wp:cNvGraphicFramePr>
+            <a:graphic xmlns:a="http://schemas.openxmlformats.org/drawingml/2006/main">
+              <a:graphicData uri="http://schemas.openxmlformats.org/drawingml/2006/picture">
+                <pic:pic xmlns:pic="http://schemas.openxmlformats.org/drawingml/2006/picture">
+                  <pic:nvPicPr>
+                    <pic:cNvPr id="1064401397" name=""/>
+                    <pic:cNvPicPr/>
+                  </pic:nvPicPr>
+                  <pic:blipFill>
+                    <a:blip r:embed="rId53"/>
+                    <a:stretch>
+                      <a:fillRect/>
+                    </a:stretch>
+                  </pic:blipFill>
+                  <pic:spPr>
+                    <a:xfrm>
+                      <a:off x="0" y="0"/>
+                      <a:ext cx="2467732" cy="1479108"/>
+                    </a:xfrm>
+                    <a:prstGeom prst="rect">
+                      <a:avLst/>
+                    </a:prstGeom>
+                  </pic:spPr>
+                </pic:pic>
+              </a:graphicData>
+            </a:graphic>
+          </wp:inline>
+        </w:drawing>
+      </w:r>
+    </w:p>
+    <w:p>
+      <w:pPr>
+        <w:rPr>
+          <w:b/>
+          <w:bCs/>
+        </w:rPr>
+      </w:pPr>
+    </w:p>
+    <w:p>
+      <w:pPr>
+        <w:pStyle w:val="ListParagraph"/>
+        <w:numPr>
+          <w:ilvl w:val="0"/>
+          <w:numId w:val="5"/>
+        </w:numPr>
+        <w:rPr>
+          <w:b/>
+          <w:bCs/>
+        </w:rPr>
+      </w:pPr>
+      <w:r>
+        <w:rPr>
+          <w:b/>
+          <w:bCs/>
+        </w:rPr>
+        <w:t>Replace Empty Cells</w:t>
+      </w:r>
+    </w:p>
+    <w:p>
+      <w:pPr>
+        <w:pStyle w:val="ListParagraph"/>
+        <w:numPr>
+          <w:ilvl w:val="1"/>
+          <w:numId w:val="5"/>
+        </w:numPr>
+        <w:rPr>
+          <w:b/>
+          <w:bCs/>
+        </w:rPr>
+      </w:pPr>
+      <w:r>
+        <w:rPr>
+          <w:b/>
+          <w:bCs/>
+        </w:rPr>
+        <w:t>Review Title</w:t>
+      </w:r>
+    </w:p>
+    <w:p>
+      <w:pPr>
+        <w:pStyle w:val="ListParagraph"/>
+        <w:ind w:left="1440"/>
+        <w:rPr>
+          <w:b/>
+          <w:bCs/>
+        </w:rPr>
+      </w:pPr>
+      <w:r>
+        <w:rPr>
+          <w:b/>
+          <w:bCs/>
+        </w:rPr>
+        <w:drawing>
+          <wp:inline distT="0" distB="0" distL="0" distR="0" wp14:anchorId="31C221EC" wp14:editId="455A7480">
+            <wp:extent cx="5731510" cy="285750"/>
+            <wp:effectExtent l="0" t="0" r="2540" b="0"/>
+            <wp:docPr id="693187892" name="Picture 1"/>
+            <wp:cNvGraphicFramePr>
+              <a:graphicFrameLocks xmlns:a="http://schemas.openxmlformats.org/drawingml/2006/main" noChangeAspect="1"/>
+            </wp:cNvGraphicFramePr>
+            <a:graphic xmlns:a="http://schemas.openxmlformats.org/drawingml/2006/main">
+              <a:graphicData uri="http://schemas.openxmlformats.org/drawingml/2006/picture">
+                <pic:pic xmlns:pic="http://schemas.openxmlformats.org/drawingml/2006/picture">
+                  <pic:nvPicPr>
+                    <pic:cNvPr id="693187892" name=""/>
+                    <pic:cNvPicPr/>
+                  </pic:nvPicPr>
+                  <pic:blipFill>
+                    <a:blip r:embed="rId54"/>
+                    <a:stretch>
+                      <a:fillRect/>
+                    </a:stretch>
+                  </pic:blipFill>
+                  <pic:spPr>
+                    <a:xfrm>
+                      <a:off x="0" y="0"/>
+                      <a:ext cx="5731510" cy="285750"/>
+                    </a:xfrm>
+                    <a:prstGeom prst="rect">
+                      <a:avLst/>
+                    </a:prstGeom>
+                  </pic:spPr>
+                </pic:pic>
+              </a:graphicData>
+            </a:graphic>
+          </wp:inline>
+        </w:drawing>
+      </w:r>
+    </w:p>
+    <w:p>
+      <w:pPr>
+        <w:pStyle w:val="ListParagraph"/>
+        <w:numPr>
+          <w:ilvl w:val="1"/>
+          <w:numId w:val="5"/>
+        </w:numPr>
+        <w:rPr>
+          <w:b/>
+          <w:bCs/>
+        </w:rPr>
+      </w:pPr>
+      <w:r>
+        <w:rPr>
+          <w:b/>
+          <w:bCs/>
+        </w:rPr>
+        <w:t>Review/Comment</w:t>
+      </w:r>
+    </w:p>
+    <w:p>
+      <w:pPr>
+        <w:pStyle w:val="ListParagraph"/>
+        <w:ind w:left="1440"/>
+        <w:rPr>
+          <w:b/>
+          <w:bCs/>
+        </w:rPr>
+      </w:pPr>
+      <w:r>
+        <w:rPr>
+          <w:b/>
+          <w:bCs/>
+        </w:rPr>
+        <w:drawing>
+          <wp:inline distT="0" distB="0" distL="0" distR="0" wp14:anchorId="427C29D4" wp14:editId="35DA2173">
+            <wp:extent cx="5731510" cy="231775"/>
+            <wp:effectExtent l="0" t="0" r="2540" b="0"/>
+            <wp:docPr id="1417021606" name="Picture 1"/>
+            <wp:cNvGraphicFramePr>
+              <a:graphicFrameLocks xmlns:a="http://schemas.openxmlformats.org/drawingml/2006/main" noChangeAspect="1"/>
+            </wp:cNvGraphicFramePr>
+            <a:graphic xmlns:a="http://schemas.openxmlformats.org/drawingml/2006/main">
+              <a:graphicData uri="http://schemas.openxmlformats.org/drawingml/2006/picture">
+                <pic:pic xmlns:pic="http://schemas.openxmlformats.org/drawingml/2006/picture">
+                  <pic:nvPicPr>
+                    <pic:cNvPr id="1417021606" name=""/>
+                    <pic:cNvPicPr/>
+                  </pic:nvPicPr>
+                  <pic:blipFill>
+                    <a:blip r:embed="rId55"/>
+                    <a:stretch>
+                      <a:fillRect/>
+                    </a:stretch>
+                  </pic:blipFill>
+                  <pic:spPr>
+                    <a:xfrm>
+                      <a:off x="0" y="0"/>
+                      <a:ext cx="5731510" cy="231775"/>
+                    </a:xfrm>
+                    <a:prstGeom prst="rect">
+                      <a:avLst/>
+                    </a:prstGeom>
+                  </pic:spPr>
+                </pic:pic>
+              </a:graphicData>
+            </a:graphic>
+          </wp:inline>
+        </w:drawing>
+      </w:r>
+    </w:p>
     <w:sectPr>
       <w:pgSz w:w="11906" w:h="16838"/>
       <w:pgMar w:top="1440" w:right="1440" w:bottom="1440" w:left="1440" w:header="708" w:footer="708" w:gutter="0"/>
@@ -226,6 +3712,655 @@
     </w:sectPr>
   </w:body>
 </w:document>
+</file>
+
+<file path=word/numbering.xml><?xml version="1.0" encoding="utf-8"?>
+<w:numbering xmlns:wpc="http://schemas.microsoft.com/office/word/2010/wordprocessingCanvas" xmlns:cx="http://schemas.microsoft.com/office/drawing/2014/chartex" xmlns:cx1="http://schemas.microsoft.com/office/drawing/2015/9/8/chartex" xmlns:cx2="http://schemas.microsoft.com/office/drawing/2015/10/21/chartex" xmlns:cx3="http://schemas.microsoft.com/office/drawing/2016/5/9/chartex" xmlns:cx4="http://schemas.microsoft.com/office/drawing/2016/5/10/chartex" xmlns:cx5="http://schemas.microsoft.com/office/drawing/2016/5/11/chartex" xmlns:cx6="http://schemas.microsoft.com/office/drawing/2016/5/12/chartex" xmlns:cx7="http://schemas.microsoft.com/office/drawing/2016/5/13/chartex" xmlns:cx8="http://schemas.microsoft.com/office/drawing/2016/5/14/chartex" xmlns:mc="http://schemas.openxmlformats.org/markup-compatibility/2006" xmlns:aink="http://schemas.microsoft.com/office/drawing/2016/ink" xmlns:am3d="http://schemas.microsoft.com/office/drawing/2017/model3d" xmlns:o="urn:schemas-microsoft-com:office:office" xmlns:oel="http://schemas.microsoft.com/office/2019/extlst" xmlns:r="http://schemas.openxmlformats.org/officeDocument/2006/relationships" xmlns:m="http://schemas.openxmlformats.org/officeDocument/2006/math" xmlns:v="urn:schemas-microsoft-com:vml" xmlns:wp14="http://schemas.microsoft.com/office/word/2010/wordprocessingDrawing" xmlns:wp="http://schemas.openxmlformats.org/drawingml/2006/wordprocessingDrawing" xmlns:w10="urn:schemas-microsoft-com:office:word" xmlns:w="http://schemas.openxmlformats.org/wordprocessingml/2006/main" xmlns:w14="http://schemas.microsoft.com/office/word/2010/wordml" xmlns:w15="http://schemas.microsoft.com/office/word/2012/wordml" xmlns:w16cex="http://schemas.microsoft.com/office/word/2018/wordml/cex" xmlns:w16cid="http://schemas.microsoft.com/office/word/2016/wordml/cid" xmlns:w16="http://schemas.microsoft.com/office/word/2018/wordml" xmlns:w16du="http://schemas.microsoft.com/office/word/2023/wordml/word16du" xmlns:w16sdtdh="http://schemas.microsoft.com/office/word/2020/wordml/sdtdatahash" xmlns:w16sdtfl="http://schemas.microsoft.com/office/word/2024/wordml/sdtformatlock" xmlns:w16se="http://schemas.microsoft.com/office/word/2015/wordml/symex" xmlns:wpg="http://schemas.microsoft.com/office/word/2010/wordprocessingGroup" xmlns:wpi="http://schemas.microsoft.com/office/word/2010/wordprocessingInk" xmlns:wne="http://schemas.microsoft.com/office/word/2006/wordml" xmlns:wps="http://schemas.microsoft.com/office/word/2010/wordprocessingShape" mc:Ignorable="w14 w15 w16se w16cid w16 w16cex w16sdtdh w16sdtfl w16du wp14">
+  <w:abstractNum w:abstractNumId="0" w15:restartNumberingAfterBreak="0">
+    <w:nsid w:val="0A4C3CB6"/>
+    <w:multiLevelType w:val="hybridMultilevel"/>
+    <w:tmpl w:val="2D161C04"/>
+    <w:lvl w:ilvl="0" w:tplc="2000000F">
+      <w:start w:val="1"/>
+      <w:numFmt w:val="decimal"/>
+      <w:lvlText w:val="%1."/>
+      <w:lvlJc w:val="left"/>
+      <w:pPr>
+        <w:ind w:left="720" w:hanging="360"/>
+      </w:pPr>
+      <w:rPr>
+        <w:rFonts w:hint="default"/>
+      </w:rPr>
+    </w:lvl>
+    <w:lvl w:ilvl="1" w:tplc="20000019" w:tentative="1">
+      <w:start w:val="1"/>
+      <w:numFmt w:val="lowerLetter"/>
+      <w:lvlText w:val="%2."/>
+      <w:lvlJc w:val="left"/>
+      <w:pPr>
+        <w:ind w:left="1440" w:hanging="360"/>
+      </w:pPr>
+    </w:lvl>
+    <w:lvl w:ilvl="2" w:tplc="2000001B" w:tentative="1">
+      <w:start w:val="1"/>
+      <w:numFmt w:val="lowerRoman"/>
+      <w:lvlText w:val="%3."/>
+      <w:lvlJc w:val="right"/>
+      <w:pPr>
+        <w:ind w:left="2160" w:hanging="180"/>
+      </w:pPr>
+    </w:lvl>
+    <w:lvl w:ilvl="3" w:tplc="2000000F" w:tentative="1">
+      <w:start w:val="1"/>
+      <w:numFmt w:val="decimal"/>
+      <w:lvlText w:val="%4."/>
+      <w:lvlJc w:val="left"/>
+      <w:pPr>
+        <w:ind w:left="2880" w:hanging="360"/>
+      </w:pPr>
+    </w:lvl>
+    <w:lvl w:ilvl="4" w:tplc="20000019" w:tentative="1">
+      <w:start w:val="1"/>
+      <w:numFmt w:val="lowerLetter"/>
+      <w:lvlText w:val="%5."/>
+      <w:lvlJc w:val="left"/>
+      <w:pPr>
+        <w:ind w:left="3600" w:hanging="360"/>
+      </w:pPr>
+    </w:lvl>
+    <w:lvl w:ilvl="5" w:tplc="2000001B" w:tentative="1">
+      <w:start w:val="1"/>
+      <w:numFmt w:val="lowerRoman"/>
+      <w:lvlText w:val="%6."/>
+      <w:lvlJc w:val="right"/>
+      <w:pPr>
+        <w:ind w:left="4320" w:hanging="180"/>
+      </w:pPr>
+    </w:lvl>
+    <w:lvl w:ilvl="6" w:tplc="2000000F" w:tentative="1">
+      <w:start w:val="1"/>
+      <w:numFmt w:val="decimal"/>
+      <w:lvlText w:val="%7."/>
+      <w:lvlJc w:val="left"/>
+      <w:pPr>
+        <w:ind w:left="5040" w:hanging="360"/>
+      </w:pPr>
+    </w:lvl>
+    <w:lvl w:ilvl="7" w:tplc="20000019" w:tentative="1">
+      <w:start w:val="1"/>
+      <w:numFmt w:val="lowerLetter"/>
+      <w:lvlText w:val="%8."/>
+      <w:lvlJc w:val="left"/>
+      <w:pPr>
+        <w:ind w:left="5760" w:hanging="360"/>
+      </w:pPr>
+    </w:lvl>
+    <w:lvl w:ilvl="8" w:tplc="2000001B" w:tentative="1">
+      <w:start w:val="1"/>
+      <w:numFmt w:val="lowerRoman"/>
+      <w:lvlText w:val="%9."/>
+      <w:lvlJc w:val="right"/>
+      <w:pPr>
+        <w:ind w:left="6480" w:hanging="180"/>
+      </w:pPr>
+    </w:lvl>
+  </w:abstractNum>
+  <w:abstractNum w:abstractNumId="1" w15:restartNumberingAfterBreak="0">
+    <w:nsid w:val="0F3C1341"/>
+    <w:multiLevelType w:val="hybridMultilevel"/>
+    <w:tmpl w:val="CC4887A2"/>
+    <w:lvl w:ilvl="0" w:tplc="2000000F">
+      <w:start w:val="1"/>
+      <w:numFmt w:val="decimal"/>
+      <w:lvlText w:val="%1."/>
+      <w:lvlJc w:val="left"/>
+      <w:pPr>
+        <w:ind w:left="720" w:hanging="360"/>
+      </w:pPr>
+      <w:rPr>
+        <w:rFonts w:hint="default"/>
+      </w:rPr>
+    </w:lvl>
+    <w:lvl w:ilvl="1" w:tplc="20000019">
+      <w:start w:val="1"/>
+      <w:numFmt w:val="lowerLetter"/>
+      <w:lvlText w:val="%2."/>
+      <w:lvlJc w:val="left"/>
+      <w:pPr>
+        <w:ind w:left="1440" w:hanging="360"/>
+      </w:pPr>
+    </w:lvl>
+    <w:lvl w:ilvl="2" w:tplc="2000001B" w:tentative="1">
+      <w:start w:val="1"/>
+      <w:numFmt w:val="lowerRoman"/>
+      <w:lvlText w:val="%3."/>
+      <w:lvlJc w:val="right"/>
+      <w:pPr>
+        <w:ind w:left="2160" w:hanging="180"/>
+      </w:pPr>
+    </w:lvl>
+    <w:lvl w:ilvl="3" w:tplc="2000000F" w:tentative="1">
+      <w:start w:val="1"/>
+      <w:numFmt w:val="decimal"/>
+      <w:lvlText w:val="%4."/>
+      <w:lvlJc w:val="left"/>
+      <w:pPr>
+        <w:ind w:left="2880" w:hanging="360"/>
+      </w:pPr>
+    </w:lvl>
+    <w:lvl w:ilvl="4" w:tplc="20000019" w:tentative="1">
+      <w:start w:val="1"/>
+      <w:numFmt w:val="lowerLetter"/>
+      <w:lvlText w:val="%5."/>
+      <w:lvlJc w:val="left"/>
+      <w:pPr>
+        <w:ind w:left="3600" w:hanging="360"/>
+      </w:pPr>
+    </w:lvl>
+    <w:lvl w:ilvl="5" w:tplc="2000001B" w:tentative="1">
+      <w:start w:val="1"/>
+      <w:numFmt w:val="lowerRoman"/>
+      <w:lvlText w:val="%6."/>
+      <w:lvlJc w:val="right"/>
+      <w:pPr>
+        <w:ind w:left="4320" w:hanging="180"/>
+      </w:pPr>
+    </w:lvl>
+    <w:lvl w:ilvl="6" w:tplc="2000000F" w:tentative="1">
+      <w:start w:val="1"/>
+      <w:numFmt w:val="decimal"/>
+      <w:lvlText w:val="%7."/>
+      <w:lvlJc w:val="left"/>
+      <w:pPr>
+        <w:ind w:left="5040" w:hanging="360"/>
+      </w:pPr>
+    </w:lvl>
+    <w:lvl w:ilvl="7" w:tplc="20000019" w:tentative="1">
+      <w:start w:val="1"/>
+      <w:numFmt w:val="lowerLetter"/>
+      <w:lvlText w:val="%8."/>
+      <w:lvlJc w:val="left"/>
+      <w:pPr>
+        <w:ind w:left="5760" w:hanging="360"/>
+      </w:pPr>
+    </w:lvl>
+    <w:lvl w:ilvl="8" w:tplc="2000001B" w:tentative="1">
+      <w:start w:val="1"/>
+      <w:numFmt w:val="lowerRoman"/>
+      <w:lvlText w:val="%9."/>
+      <w:lvlJc w:val="right"/>
+      <w:pPr>
+        <w:ind w:left="6480" w:hanging="180"/>
+      </w:pPr>
+    </w:lvl>
+  </w:abstractNum>
+  <w:abstractNum w:abstractNumId="2" w15:restartNumberingAfterBreak="0">
+    <w:nsid w:val="31E55AF8"/>
+    <w:multiLevelType w:val="hybridMultilevel"/>
+    <w:tmpl w:val="83B667BC"/>
+    <w:lvl w:ilvl="0" w:tplc="2000000F">
+      <w:start w:val="1"/>
+      <w:numFmt w:val="decimal"/>
+      <w:lvlText w:val="%1."/>
+      <w:lvlJc w:val="left"/>
+      <w:pPr>
+        <w:ind w:left="720" w:hanging="360"/>
+      </w:pPr>
+      <w:rPr>
+        <w:rFonts w:hint="default"/>
+      </w:rPr>
+    </w:lvl>
+    <w:lvl w:ilvl="1" w:tplc="20000019" w:tentative="1">
+      <w:start w:val="1"/>
+      <w:numFmt w:val="lowerLetter"/>
+      <w:lvlText w:val="%2."/>
+      <w:lvlJc w:val="left"/>
+      <w:pPr>
+        <w:ind w:left="1440" w:hanging="360"/>
+      </w:pPr>
+    </w:lvl>
+    <w:lvl w:ilvl="2" w:tplc="2000001B" w:tentative="1">
+      <w:start w:val="1"/>
+      <w:numFmt w:val="lowerRoman"/>
+      <w:lvlText w:val="%3."/>
+      <w:lvlJc w:val="right"/>
+      <w:pPr>
+        <w:ind w:left="2160" w:hanging="180"/>
+      </w:pPr>
+    </w:lvl>
+    <w:lvl w:ilvl="3" w:tplc="2000000F" w:tentative="1">
+      <w:start w:val="1"/>
+      <w:numFmt w:val="decimal"/>
+      <w:lvlText w:val="%4."/>
+      <w:lvlJc w:val="left"/>
+      <w:pPr>
+        <w:ind w:left="2880" w:hanging="360"/>
+      </w:pPr>
+    </w:lvl>
+    <w:lvl w:ilvl="4" w:tplc="20000019" w:tentative="1">
+      <w:start w:val="1"/>
+      <w:numFmt w:val="lowerLetter"/>
+      <w:lvlText w:val="%5."/>
+      <w:lvlJc w:val="left"/>
+      <w:pPr>
+        <w:ind w:left="3600" w:hanging="360"/>
+      </w:pPr>
+    </w:lvl>
+    <w:lvl w:ilvl="5" w:tplc="2000001B" w:tentative="1">
+      <w:start w:val="1"/>
+      <w:numFmt w:val="lowerRoman"/>
+      <w:lvlText w:val="%6."/>
+      <w:lvlJc w:val="right"/>
+      <w:pPr>
+        <w:ind w:left="4320" w:hanging="180"/>
+      </w:pPr>
+    </w:lvl>
+    <w:lvl w:ilvl="6" w:tplc="2000000F" w:tentative="1">
+      <w:start w:val="1"/>
+      <w:numFmt w:val="decimal"/>
+      <w:lvlText w:val="%7."/>
+      <w:lvlJc w:val="left"/>
+      <w:pPr>
+        <w:ind w:left="5040" w:hanging="360"/>
+      </w:pPr>
+    </w:lvl>
+    <w:lvl w:ilvl="7" w:tplc="20000019" w:tentative="1">
+      <w:start w:val="1"/>
+      <w:numFmt w:val="lowerLetter"/>
+      <w:lvlText w:val="%8."/>
+      <w:lvlJc w:val="left"/>
+      <w:pPr>
+        <w:ind w:left="5760" w:hanging="360"/>
+      </w:pPr>
+    </w:lvl>
+    <w:lvl w:ilvl="8" w:tplc="2000001B" w:tentative="1">
+      <w:start w:val="1"/>
+      <w:numFmt w:val="lowerRoman"/>
+      <w:lvlText w:val="%9."/>
+      <w:lvlJc w:val="right"/>
+      <w:pPr>
+        <w:ind w:left="6480" w:hanging="180"/>
+      </w:pPr>
+    </w:lvl>
+  </w:abstractNum>
+  <w:abstractNum w:abstractNumId="3" w15:restartNumberingAfterBreak="0">
+    <w:nsid w:val="3FEB53CC"/>
+    <w:multiLevelType w:val="hybridMultilevel"/>
+    <w:tmpl w:val="AF085D42"/>
+    <w:lvl w:ilvl="0" w:tplc="A9E0AB9A">
+      <w:start w:val="1"/>
+      <w:numFmt w:val="decimal"/>
+      <w:lvlText w:val="%1."/>
+      <w:lvlJc w:val="left"/>
+      <w:pPr>
+        <w:ind w:left="1440" w:hanging="360"/>
+      </w:pPr>
+      <w:rPr>
+        <w:rFonts w:hint="default"/>
+      </w:rPr>
+    </w:lvl>
+    <w:lvl w:ilvl="1" w:tplc="20000019">
+      <w:start w:val="1"/>
+      <w:numFmt w:val="lowerLetter"/>
+      <w:lvlText w:val="%2."/>
+      <w:lvlJc w:val="left"/>
+      <w:pPr>
+        <w:ind w:left="2160" w:hanging="360"/>
+      </w:pPr>
+    </w:lvl>
+    <w:lvl w:ilvl="2" w:tplc="2000001B" w:tentative="1">
+      <w:start w:val="1"/>
+      <w:numFmt w:val="lowerRoman"/>
+      <w:lvlText w:val="%3."/>
+      <w:lvlJc w:val="right"/>
+      <w:pPr>
+        <w:ind w:left="2880" w:hanging="180"/>
+      </w:pPr>
+    </w:lvl>
+    <w:lvl w:ilvl="3" w:tplc="2000000F" w:tentative="1">
+      <w:start w:val="1"/>
+      <w:numFmt w:val="decimal"/>
+      <w:lvlText w:val="%4."/>
+      <w:lvlJc w:val="left"/>
+      <w:pPr>
+        <w:ind w:left="3600" w:hanging="360"/>
+      </w:pPr>
+    </w:lvl>
+    <w:lvl w:ilvl="4" w:tplc="20000019" w:tentative="1">
+      <w:start w:val="1"/>
+      <w:numFmt w:val="lowerLetter"/>
+      <w:lvlText w:val="%5."/>
+      <w:lvlJc w:val="left"/>
+      <w:pPr>
+        <w:ind w:left="4320" w:hanging="360"/>
+      </w:pPr>
+    </w:lvl>
+    <w:lvl w:ilvl="5" w:tplc="2000001B" w:tentative="1">
+      <w:start w:val="1"/>
+      <w:numFmt w:val="lowerRoman"/>
+      <w:lvlText w:val="%6."/>
+      <w:lvlJc w:val="right"/>
+      <w:pPr>
+        <w:ind w:left="5040" w:hanging="180"/>
+      </w:pPr>
+    </w:lvl>
+    <w:lvl w:ilvl="6" w:tplc="2000000F" w:tentative="1">
+      <w:start w:val="1"/>
+      <w:numFmt w:val="decimal"/>
+      <w:lvlText w:val="%7."/>
+      <w:lvlJc w:val="left"/>
+      <w:pPr>
+        <w:ind w:left="5760" w:hanging="360"/>
+      </w:pPr>
+    </w:lvl>
+    <w:lvl w:ilvl="7" w:tplc="20000019" w:tentative="1">
+      <w:start w:val="1"/>
+      <w:numFmt w:val="lowerLetter"/>
+      <w:lvlText w:val="%8."/>
+      <w:lvlJc w:val="left"/>
+      <w:pPr>
+        <w:ind w:left="6480" w:hanging="360"/>
+      </w:pPr>
+    </w:lvl>
+    <w:lvl w:ilvl="8" w:tplc="2000001B" w:tentative="1">
+      <w:start w:val="1"/>
+      <w:numFmt w:val="lowerRoman"/>
+      <w:lvlText w:val="%9."/>
+      <w:lvlJc w:val="right"/>
+      <w:pPr>
+        <w:ind w:left="7200" w:hanging="180"/>
+      </w:pPr>
+    </w:lvl>
+  </w:abstractNum>
+  <w:abstractNum w:abstractNumId="4" w15:restartNumberingAfterBreak="0">
+    <w:nsid w:val="431364A8"/>
+    <w:multiLevelType w:val="hybridMultilevel"/>
+    <w:tmpl w:val="0868E178"/>
+    <w:lvl w:ilvl="0" w:tplc="2000000F">
+      <w:start w:val="1"/>
+      <w:numFmt w:val="decimal"/>
+      <w:lvlText w:val="%1."/>
+      <w:lvlJc w:val="left"/>
+      <w:pPr>
+        <w:ind w:left="720" w:hanging="360"/>
+      </w:pPr>
+      <w:rPr>
+        <w:rFonts w:hint="default"/>
+      </w:rPr>
+    </w:lvl>
+    <w:lvl w:ilvl="1" w:tplc="20000019">
+      <w:start w:val="1"/>
+      <w:numFmt w:val="lowerLetter"/>
+      <w:lvlText w:val="%2."/>
+      <w:lvlJc w:val="left"/>
+      <w:pPr>
+        <w:ind w:left="1440" w:hanging="360"/>
+      </w:pPr>
+    </w:lvl>
+    <w:lvl w:ilvl="2" w:tplc="2000001B" w:tentative="1">
+      <w:start w:val="1"/>
+      <w:numFmt w:val="lowerRoman"/>
+      <w:lvlText w:val="%3."/>
+      <w:lvlJc w:val="right"/>
+      <w:pPr>
+        <w:ind w:left="2160" w:hanging="180"/>
+      </w:pPr>
+    </w:lvl>
+    <w:lvl w:ilvl="3" w:tplc="2000000F" w:tentative="1">
+      <w:start w:val="1"/>
+      <w:numFmt w:val="decimal"/>
+      <w:lvlText w:val="%4."/>
+      <w:lvlJc w:val="left"/>
+      <w:pPr>
+        <w:ind w:left="2880" w:hanging="360"/>
+      </w:pPr>
+    </w:lvl>
+    <w:lvl w:ilvl="4" w:tplc="20000019" w:tentative="1">
+      <w:start w:val="1"/>
+      <w:numFmt w:val="lowerLetter"/>
+      <w:lvlText w:val="%5."/>
+      <w:lvlJc w:val="left"/>
+      <w:pPr>
+        <w:ind w:left="3600" w:hanging="360"/>
+      </w:pPr>
+    </w:lvl>
+    <w:lvl w:ilvl="5" w:tplc="2000001B" w:tentative="1">
+      <w:start w:val="1"/>
+      <w:numFmt w:val="lowerRoman"/>
+      <w:lvlText w:val="%6."/>
+      <w:lvlJc w:val="right"/>
+      <w:pPr>
+        <w:ind w:left="4320" w:hanging="180"/>
+      </w:pPr>
+    </w:lvl>
+    <w:lvl w:ilvl="6" w:tplc="2000000F" w:tentative="1">
+      <w:start w:val="1"/>
+      <w:numFmt w:val="decimal"/>
+      <w:lvlText w:val="%7."/>
+      <w:lvlJc w:val="left"/>
+      <w:pPr>
+        <w:ind w:left="5040" w:hanging="360"/>
+      </w:pPr>
+    </w:lvl>
+    <w:lvl w:ilvl="7" w:tplc="20000019" w:tentative="1">
+      <w:start w:val="1"/>
+      <w:numFmt w:val="lowerLetter"/>
+      <w:lvlText w:val="%8."/>
+      <w:lvlJc w:val="left"/>
+      <w:pPr>
+        <w:ind w:left="5760" w:hanging="360"/>
+      </w:pPr>
+    </w:lvl>
+    <w:lvl w:ilvl="8" w:tplc="2000001B" w:tentative="1">
+      <w:start w:val="1"/>
+      <w:numFmt w:val="lowerRoman"/>
+      <w:lvlText w:val="%9."/>
+      <w:lvlJc w:val="right"/>
+      <w:pPr>
+        <w:ind w:left="6480" w:hanging="180"/>
+      </w:pPr>
+    </w:lvl>
+  </w:abstractNum>
+  <w:abstractNum w:abstractNumId="5" w15:restartNumberingAfterBreak="0">
+    <w:nsid w:val="45800781"/>
+    <w:multiLevelType w:val="hybridMultilevel"/>
+    <w:tmpl w:val="4378A47C"/>
+    <w:lvl w:ilvl="0" w:tplc="2000000F">
+      <w:start w:val="1"/>
+      <w:numFmt w:val="decimal"/>
+      <w:lvlText w:val="%1."/>
+      <w:lvlJc w:val="left"/>
+      <w:pPr>
+        <w:ind w:left="720" w:hanging="360"/>
+      </w:pPr>
+      <w:rPr>
+        <w:rFonts w:hint="default"/>
+      </w:rPr>
+    </w:lvl>
+    <w:lvl w:ilvl="1" w:tplc="20000019">
+      <w:start w:val="1"/>
+      <w:numFmt w:val="lowerLetter"/>
+      <w:lvlText w:val="%2."/>
+      <w:lvlJc w:val="left"/>
+      <w:pPr>
+        <w:ind w:left="1440" w:hanging="360"/>
+      </w:pPr>
+    </w:lvl>
+    <w:lvl w:ilvl="2" w:tplc="2000001B" w:tentative="1">
+      <w:start w:val="1"/>
+      <w:numFmt w:val="lowerRoman"/>
+      <w:lvlText w:val="%3."/>
+      <w:lvlJc w:val="right"/>
+      <w:pPr>
+        <w:ind w:left="2160" w:hanging="180"/>
+      </w:pPr>
+    </w:lvl>
+    <w:lvl w:ilvl="3" w:tplc="2000000F" w:tentative="1">
+      <w:start w:val="1"/>
+      <w:numFmt w:val="decimal"/>
+      <w:lvlText w:val="%4."/>
+      <w:lvlJc w:val="left"/>
+      <w:pPr>
+        <w:ind w:left="2880" w:hanging="360"/>
+      </w:pPr>
+    </w:lvl>
+    <w:lvl w:ilvl="4" w:tplc="20000019" w:tentative="1">
+      <w:start w:val="1"/>
+      <w:numFmt w:val="lowerLetter"/>
+      <w:lvlText w:val="%5."/>
+      <w:lvlJc w:val="left"/>
+      <w:pPr>
+        <w:ind w:left="3600" w:hanging="360"/>
+      </w:pPr>
+    </w:lvl>
+    <w:lvl w:ilvl="5" w:tplc="2000001B" w:tentative="1">
+      <w:start w:val="1"/>
+      <w:numFmt w:val="lowerRoman"/>
+      <w:lvlText w:val="%6."/>
+      <w:lvlJc w:val="right"/>
+      <w:pPr>
+        <w:ind w:left="4320" w:hanging="180"/>
+      </w:pPr>
+    </w:lvl>
+    <w:lvl w:ilvl="6" w:tplc="2000000F" w:tentative="1">
+      <w:start w:val="1"/>
+      <w:numFmt w:val="decimal"/>
+      <w:lvlText w:val="%7."/>
+      <w:lvlJc w:val="left"/>
+      <w:pPr>
+        <w:ind w:left="5040" w:hanging="360"/>
+      </w:pPr>
+    </w:lvl>
+    <w:lvl w:ilvl="7" w:tplc="20000019" w:tentative="1">
+      <w:start w:val="1"/>
+      <w:numFmt w:val="lowerLetter"/>
+      <w:lvlText w:val="%8."/>
+      <w:lvlJc w:val="left"/>
+      <w:pPr>
+        <w:ind w:left="5760" w:hanging="360"/>
+      </w:pPr>
+    </w:lvl>
+    <w:lvl w:ilvl="8" w:tplc="2000001B" w:tentative="1">
+      <w:start w:val="1"/>
+      <w:numFmt w:val="lowerRoman"/>
+      <w:lvlText w:val="%9."/>
+      <w:lvlJc w:val="right"/>
+      <w:pPr>
+        <w:ind w:left="6480" w:hanging="180"/>
+      </w:pPr>
+    </w:lvl>
+  </w:abstractNum>
+  <w:abstractNum w:abstractNumId="6" w15:restartNumberingAfterBreak="0">
+    <w:nsid w:val="64ED20C3"/>
+    <w:multiLevelType w:val="hybridMultilevel"/>
+    <w:tmpl w:val="3EFEE998"/>
+    <w:lvl w:ilvl="0" w:tplc="04385A86">
+      <w:start w:val="1"/>
+      <w:numFmt w:val="decimal"/>
+      <w:lvlText w:val="%1."/>
+      <w:lvlJc w:val="left"/>
+      <w:pPr>
+        <w:ind w:left="1080" w:hanging="360"/>
+      </w:pPr>
+      <w:rPr>
+        <w:rFonts w:hint="default"/>
+      </w:rPr>
+    </w:lvl>
+    <w:lvl w:ilvl="1" w:tplc="20000019">
+      <w:start w:val="1"/>
+      <w:numFmt w:val="lowerLetter"/>
+      <w:lvlText w:val="%2."/>
+      <w:lvlJc w:val="left"/>
+      <w:pPr>
+        <w:ind w:left="1800" w:hanging="360"/>
+      </w:pPr>
+    </w:lvl>
+    <w:lvl w:ilvl="2" w:tplc="2000001B" w:tentative="1">
+      <w:start w:val="1"/>
+      <w:numFmt w:val="lowerRoman"/>
+      <w:lvlText w:val="%3."/>
+      <w:lvlJc w:val="right"/>
+      <w:pPr>
+        <w:ind w:left="2520" w:hanging="180"/>
+      </w:pPr>
+    </w:lvl>
+    <w:lvl w:ilvl="3" w:tplc="2000000F" w:tentative="1">
+      <w:start w:val="1"/>
+      <w:numFmt w:val="decimal"/>
+      <w:lvlText w:val="%4."/>
+      <w:lvlJc w:val="left"/>
+      <w:pPr>
+        <w:ind w:left="3240" w:hanging="360"/>
+      </w:pPr>
+    </w:lvl>
+    <w:lvl w:ilvl="4" w:tplc="20000019" w:tentative="1">
+      <w:start w:val="1"/>
+      <w:numFmt w:val="lowerLetter"/>
+      <w:lvlText w:val="%5."/>
+      <w:lvlJc w:val="left"/>
+      <w:pPr>
+        <w:ind w:left="3960" w:hanging="360"/>
+      </w:pPr>
+    </w:lvl>
+    <w:lvl w:ilvl="5" w:tplc="2000001B" w:tentative="1">
+      <w:start w:val="1"/>
+      <w:numFmt w:val="lowerRoman"/>
+      <w:lvlText w:val="%6."/>
+      <w:lvlJc w:val="right"/>
+      <w:pPr>
+        <w:ind w:left="4680" w:hanging="180"/>
+      </w:pPr>
+    </w:lvl>
+    <w:lvl w:ilvl="6" w:tplc="2000000F" w:tentative="1">
+      <w:start w:val="1"/>
+      <w:numFmt w:val="decimal"/>
+      <w:lvlText w:val="%7."/>
+      <w:lvlJc w:val="left"/>
+      <w:pPr>
+        <w:ind w:left="5400" w:hanging="360"/>
+      </w:pPr>
+    </w:lvl>
+    <w:lvl w:ilvl="7" w:tplc="20000019" w:tentative="1">
+      <w:start w:val="1"/>
+      <w:numFmt w:val="lowerLetter"/>
+      <w:lvlText w:val="%8."/>
+      <w:lvlJc w:val="left"/>
+      <w:pPr>
+        <w:ind w:left="6120" w:hanging="360"/>
+      </w:pPr>
+    </w:lvl>
+    <w:lvl w:ilvl="8" w:tplc="2000001B" w:tentative="1">
+      <w:start w:val="1"/>
+      <w:numFmt w:val="lowerRoman"/>
+      <w:lvlText w:val="%9."/>
+      <w:lvlJc w:val="right"/>
+      <w:pPr>
+        <w:ind w:left="6840" w:hanging="180"/>
+      </w:pPr>
+    </w:lvl>
+  </w:abstractNum>
+  <w:num w:numId="1" w16cid:durableId="1416123311">
+    <w:abstractNumId w:val="5"/>
+  </w:num>
+  <w:num w:numId="2" w16cid:durableId="437264488">
+    <w:abstractNumId w:val="1"/>
+  </w:num>
+  <w:num w:numId="3" w16cid:durableId="2112314040">
+    <w:abstractNumId w:val="4"/>
+  </w:num>
+  <w:num w:numId="4" w16cid:durableId="1234662527">
+    <w:abstractNumId w:val="6"/>
+  </w:num>
+  <w:num w:numId="5" w16cid:durableId="1888492527">
+    <w:abstractNumId w:val="3"/>
+  </w:num>
+  <w:num w:numId="6" w16cid:durableId="1972393769">
+    <w:abstractNumId w:val="0"/>
+  </w:num>
+  <w:num w:numId="7" w16cid:durableId="1539581268">
+    <w:abstractNumId w:val="2"/>
+  </w:num>
+</w:numbering>
 </file>
 
 <file path=word/styles.xml><?xml version="1.0" encoding="utf-8"?>

</xml_diff>

<commit_message>
Add Modeling, DAX, and Dashboard
</commit_message>
<xml_diff>
--- a/Report.docx
+++ b/Report.docx
@@ -5,6 +5,10 @@
     <w:p>
       <w:pPr>
         <w:jc w:val="center"/>
+        <w:rPr>
+          <w:b/>
+          <w:bCs/>
+        </w:rPr>
       </w:pPr>
       <w:r>
         <w:rPr>
@@ -21,8 +25,174 @@
           <w:b/>
           <w:bCs/>
         </w:rPr>
-        <w:t>Brazilian E-Commerce Public Dataset by Olist</w:t>
-      </w:r>
+        <w:t xml:space="preserve">Brazilian E-Commerce Public Dataset by </w:t>
+      </w:r>
+      <w:proofErr w:type="spellStart"/>
+      <w:r>
+        <w:rPr>
+          <w:b/>
+          <w:bCs/>
+        </w:rPr>
+        <w:t>Olist</w:t>
+      </w:r>
+      <w:proofErr w:type="spellEnd"/>
+    </w:p>
+    <w:p>
+      <w:pPr>
+        <w:jc w:val="center"/>
+      </w:pPr>
+      <w:r>
+        <w:drawing>
+          <wp:inline distT="0" distB="0" distL="0" distR="0" wp14:anchorId="047FF556" wp14:editId="51F9A525">
+            <wp:extent cx="5731510" cy="3234055"/>
+            <wp:effectExtent l="0" t="0" r="2540" b="4445"/>
+            <wp:docPr id="1035391529" name="Picture 1"/>
+            <wp:cNvGraphicFramePr>
+              <a:graphicFrameLocks xmlns:a="http://schemas.openxmlformats.org/drawingml/2006/main" noChangeAspect="1"/>
+            </wp:cNvGraphicFramePr>
+            <a:graphic xmlns:a="http://schemas.openxmlformats.org/drawingml/2006/main">
+              <a:graphicData uri="http://schemas.openxmlformats.org/drawingml/2006/picture">
+                <pic:pic xmlns:pic="http://schemas.openxmlformats.org/drawingml/2006/picture">
+                  <pic:nvPicPr>
+                    <pic:cNvPr id="1035391529" name=""/>
+                    <pic:cNvPicPr/>
+                  </pic:nvPicPr>
+                  <pic:blipFill>
+                    <a:blip r:embed="rId7"/>
+                    <a:stretch>
+                      <a:fillRect/>
+                    </a:stretch>
+                  </pic:blipFill>
+                  <pic:spPr>
+                    <a:xfrm>
+                      <a:off x="0" y="0"/>
+                      <a:ext cx="5731510" cy="3234055"/>
+                    </a:xfrm>
+                    <a:prstGeom prst="rect">
+                      <a:avLst/>
+                    </a:prstGeom>
+                  </pic:spPr>
+                </pic:pic>
+              </a:graphicData>
+            </a:graphic>
+          </wp:inline>
+        </w:drawing>
+      </w:r>
+    </w:p>
+    <w:p>
+      <w:pPr>
+        <w:jc w:val="center"/>
+      </w:pPr>
+    </w:p>
+    <w:p>
+      <w:pPr>
+        <w:jc w:val="center"/>
+      </w:pPr>
+      <w:r>
+        <w:drawing>
+          <wp:inline distT="0" distB="0" distL="0" distR="0" wp14:anchorId="48E35969" wp14:editId="1A272959">
+            <wp:extent cx="5731510" cy="3209290"/>
+            <wp:effectExtent l="0" t="0" r="2540" b="0"/>
+            <wp:docPr id="1848678257" name="Picture 1"/>
+            <wp:cNvGraphicFramePr>
+              <a:graphicFrameLocks xmlns:a="http://schemas.openxmlformats.org/drawingml/2006/main" noChangeAspect="1"/>
+            </wp:cNvGraphicFramePr>
+            <a:graphic xmlns:a="http://schemas.openxmlformats.org/drawingml/2006/main">
+              <a:graphicData uri="http://schemas.openxmlformats.org/drawingml/2006/picture">
+                <pic:pic xmlns:pic="http://schemas.openxmlformats.org/drawingml/2006/picture">
+                  <pic:nvPicPr>
+                    <pic:cNvPr id="1848678257" name=""/>
+                    <pic:cNvPicPr/>
+                  </pic:nvPicPr>
+                  <pic:blipFill>
+                    <a:blip r:embed="rId8"/>
+                    <a:stretch>
+                      <a:fillRect/>
+                    </a:stretch>
+                  </pic:blipFill>
+                  <pic:spPr>
+                    <a:xfrm>
+                      <a:off x="0" y="0"/>
+                      <a:ext cx="5731510" cy="3209290"/>
+                    </a:xfrm>
+                    <a:prstGeom prst="rect">
+                      <a:avLst/>
+                    </a:prstGeom>
+                  </pic:spPr>
+                </pic:pic>
+              </a:graphicData>
+            </a:graphic>
+          </wp:inline>
+        </w:drawing>
+      </w:r>
+    </w:p>
+    <w:p>
+      <w:pPr>
+        <w:jc w:val="center"/>
+      </w:pPr>
+    </w:p>
+    <w:p>
+      <w:pPr>
+        <w:jc w:val="center"/>
+      </w:pPr>
+      <w:r>
+        <w:lastRenderedPageBreak/>
+        <w:drawing>
+          <wp:inline distT="0" distB="0" distL="0" distR="0" wp14:anchorId="23221FE4" wp14:editId="1E119DC4">
+            <wp:extent cx="5731510" cy="3207385"/>
+            <wp:effectExtent l="0" t="0" r="2540" b="0"/>
+            <wp:docPr id="1843795613" name="Picture 1"/>
+            <wp:cNvGraphicFramePr>
+              <a:graphicFrameLocks xmlns:a="http://schemas.openxmlformats.org/drawingml/2006/main" noChangeAspect="1"/>
+            </wp:cNvGraphicFramePr>
+            <a:graphic xmlns:a="http://schemas.openxmlformats.org/drawingml/2006/main">
+              <a:graphicData uri="http://schemas.openxmlformats.org/drawingml/2006/picture">
+                <pic:pic xmlns:pic="http://schemas.openxmlformats.org/drawingml/2006/picture">
+                  <pic:nvPicPr>
+                    <pic:cNvPr id="1843795613" name=""/>
+                    <pic:cNvPicPr/>
+                  </pic:nvPicPr>
+                  <pic:blipFill>
+                    <a:blip r:embed="rId9"/>
+                    <a:stretch>
+                      <a:fillRect/>
+                    </a:stretch>
+                  </pic:blipFill>
+                  <pic:spPr>
+                    <a:xfrm>
+                      <a:off x="0" y="0"/>
+                      <a:ext cx="5731510" cy="3207385"/>
+                    </a:xfrm>
+                    <a:prstGeom prst="rect">
+                      <a:avLst/>
+                    </a:prstGeom>
+                  </pic:spPr>
+                </pic:pic>
+              </a:graphicData>
+            </a:graphic>
+          </wp:inline>
+        </w:drawing>
+      </w:r>
+    </w:p>
+    <w:p>
+      <w:pPr>
+        <w:jc w:val="center"/>
+      </w:pPr>
+    </w:p>
+    <w:p>
+      <w:r>
+        <w:br w:type="page"/>
+      </w:r>
+    </w:p>
+    <w:p>
+      <w:pPr>
+        <w:jc w:val="center"/>
+      </w:pPr>
+    </w:p>
+    <w:p>
+      <w:pPr>
+        <w:jc w:val="center"/>
+      </w:pPr>
     </w:p>
     <w:p>
       <w:r>
@@ -30,11 +200,22 @@
       </w:r>
       <w:r>
         <w:br/>
-        <w:t>Business problem: Olist management needs visibility into sales performance, delivery efficiency, customer satisfaction, and product category trends across Brazil (2016–2018) to make data-driven decisions on logistics investment, product strategy, and regional market expansion.</w:t>
-      </w:r>
-    </w:p>
-    <w:p>
-      <w:r>
+        <w:t>Business problem: </w:t>
+      </w:r>
+      <w:proofErr w:type="spellStart"/>
+      <w:r>
+        <w:t>Olist</w:t>
+      </w:r>
+      <w:proofErr w:type="spellEnd"/>
+      <w:r>
+        <w:t xml:space="preserve"> management needs visibility into sales performance, delivery efficiency, customer satisfaction, and product category trends across Brazil (2016–2018) to make data-driven decisions on logistics investment, product strategy, and regional market expansion.</w:t>
+      </w:r>
+    </w:p>
+    <w:p>
+      <w:r>
+        <w:rPr>
+          <w:noProof/>
+        </w:rPr>
         <w:drawing>
           <wp:inline distT="0" distB="0" distL="0" distR="0" wp14:anchorId="3C6CDC90" wp14:editId="37565475">
             <wp:extent cx="3762375" cy="1755719"/>
@@ -51,7 +232,7 @@
                     <pic:cNvPicPr/>
                   </pic:nvPicPr>
                   <pic:blipFill>
-                    <a:blip r:embed="rId5"/>
+                    <a:blip r:embed="rId10"/>
                     <a:stretch>
                       <a:fillRect/>
                     </a:stretch>
@@ -76,12 +257,40 @@
       <w:r>
         <w:t>URL: </w:t>
       </w:r>
-      <w:hyperlink r:id="rId6" w:history="1">
+      <w:hyperlink r:id="rId11" w:history="1">
         <w:r>
           <w:rPr>
             <w:rStyle w:val="Hyperlink"/>
           </w:rPr>
-          <w:t>kaggle.com/datasets/olistbr/brazilian-ecommerce</w:t>
+          <w:t>kaggle.com/datasets/</w:t>
+        </w:r>
+        <w:proofErr w:type="spellStart"/>
+        <w:r>
+          <w:rPr>
+            <w:rStyle w:val="Hyperlink"/>
+          </w:rPr>
+          <w:t>olistbr</w:t>
+        </w:r>
+        <w:proofErr w:type="spellEnd"/>
+        <w:r>
+          <w:rPr>
+            <w:rStyle w:val="Hyperlink"/>
+          </w:rPr>
+          <w:t>/</w:t>
+        </w:r>
+        <w:proofErr w:type="spellStart"/>
+        <w:r>
+          <w:rPr>
+            <w:rStyle w:val="Hyperlink"/>
+          </w:rPr>
+          <w:t>brazilian</w:t>
+        </w:r>
+        <w:proofErr w:type="spellEnd"/>
+        <w:r>
+          <w:rPr>
+            <w:rStyle w:val="Hyperlink"/>
+          </w:rPr>
+          <w:t>-ecommerce</w:t>
         </w:r>
       </w:hyperlink>
       <w:r>
@@ -95,29 +304,131 @@
         <w:rPr>
           <w:b/>
           <w:bCs/>
-          <w:lang w:val="en-KE"/>
-        </w:rPr>
-      </w:pPr>
-      <w:r>
-        <w:rPr>
-          <w:b/>
-          <w:bCs/>
-          <w:lang w:val="en-KE"/>
+        </w:rPr>
+      </w:pPr>
+      <w:r>
+        <w:rPr>
+          <w:b/>
+          <w:bCs/>
         </w:rPr>
         <w:t xml:space="preserve">Why this dataset is suitable </w:t>
       </w:r>
     </w:p>
     <w:p>
-      <w:pPr>
-        <w:rPr>
-          <w:lang w:val="en-KE"/>
-        </w:rPr>
-      </w:pPr>
-      <w:r>
-        <w:rPr>
-          <w:lang w:val="en-KE"/>
-        </w:rPr>
-        <w:t>The Olist dataset satisfies all advanced analysis requirements. It contains 8 related tables linked by shared keys (order_id, customer_id, product_id, geolocation_zip_code_prefix) enabling a proper star schema. The main orders table has 99,441 rows, far exceeding the 9,000 minimum. It contains both categorical variables (order_status, payment_type, customer_state, product_category, delivery_status) and numerical variables (price, freight_value, review_score, payment_installments, latitude, longitude). The order_purchase_timestamp field spans September 2016 to October 2018 enabling full time-intelligence analysis. The geolocation dataset adds real latitude and longitude coordinates enabling precise geographic mapping at zip code level — a significant analytical capability beyond simple state-level analysis.</w:t>
+      <w:r>
+        <w:t xml:space="preserve">The </w:t>
+      </w:r>
+      <w:proofErr w:type="spellStart"/>
+      <w:r>
+        <w:t>Olist</w:t>
+      </w:r>
+      <w:proofErr w:type="spellEnd"/>
+      <w:r>
+        <w:t xml:space="preserve"> dataset satisfies all advanced analysis requirements. It contains 8 related tables linked by shared keys (</w:t>
+      </w:r>
+      <w:proofErr w:type="spellStart"/>
+      <w:r>
+        <w:t>order_id</w:t>
+      </w:r>
+      <w:proofErr w:type="spellEnd"/>
+      <w:r>
+        <w:t xml:space="preserve">, </w:t>
+      </w:r>
+      <w:proofErr w:type="spellStart"/>
+      <w:r>
+        <w:t>customer_id</w:t>
+      </w:r>
+      <w:proofErr w:type="spellEnd"/>
+      <w:r>
+        <w:t xml:space="preserve">, </w:t>
+      </w:r>
+      <w:proofErr w:type="spellStart"/>
+      <w:r>
+        <w:t>product_id</w:t>
+      </w:r>
+      <w:proofErr w:type="spellEnd"/>
+      <w:r>
+        <w:t xml:space="preserve">, </w:t>
+      </w:r>
+      <w:proofErr w:type="spellStart"/>
+      <w:r>
+        <w:t>geolocation_zip_code_prefix</w:t>
+      </w:r>
+      <w:proofErr w:type="spellEnd"/>
+      <w:r>
+        <w:t>) enabling a proper star schema. The main orders table has 99,441 rows, far exceeding the 9,000 minimum. It contains both categorical variables (</w:t>
+      </w:r>
+      <w:proofErr w:type="spellStart"/>
+      <w:r>
+        <w:t>order_status</w:t>
+      </w:r>
+      <w:proofErr w:type="spellEnd"/>
+      <w:r>
+        <w:t xml:space="preserve">, </w:t>
+      </w:r>
+      <w:proofErr w:type="spellStart"/>
+      <w:r>
+        <w:t>payment_type</w:t>
+      </w:r>
+      <w:proofErr w:type="spellEnd"/>
+      <w:r>
+        <w:t xml:space="preserve">, </w:t>
+      </w:r>
+      <w:proofErr w:type="spellStart"/>
+      <w:r>
+        <w:t>customer_state</w:t>
+      </w:r>
+      <w:proofErr w:type="spellEnd"/>
+      <w:r>
+        <w:t xml:space="preserve">, </w:t>
+      </w:r>
+      <w:proofErr w:type="spellStart"/>
+      <w:r>
+        <w:t>product_category</w:t>
+      </w:r>
+      <w:proofErr w:type="spellEnd"/>
+      <w:r>
+        <w:t xml:space="preserve">, </w:t>
+      </w:r>
+      <w:proofErr w:type="spellStart"/>
+      <w:r>
+        <w:t>delivery_status</w:t>
+      </w:r>
+      <w:proofErr w:type="spellEnd"/>
+      <w:r>
+        <w:t xml:space="preserve">) and numerical variables (price, </w:t>
+      </w:r>
+      <w:proofErr w:type="spellStart"/>
+      <w:r>
+        <w:t>freight_value</w:t>
+      </w:r>
+      <w:proofErr w:type="spellEnd"/>
+      <w:r>
+        <w:t xml:space="preserve">, </w:t>
+      </w:r>
+      <w:proofErr w:type="spellStart"/>
+      <w:r>
+        <w:t>review_score</w:t>
+      </w:r>
+      <w:proofErr w:type="spellEnd"/>
+      <w:r>
+        <w:t xml:space="preserve">, </w:t>
+      </w:r>
+      <w:proofErr w:type="spellStart"/>
+      <w:r>
+        <w:t>payment_installments</w:t>
+      </w:r>
+      <w:proofErr w:type="spellEnd"/>
+      <w:r>
+        <w:t xml:space="preserve">, latitude, longitude). The </w:t>
+      </w:r>
+      <w:proofErr w:type="spellStart"/>
+      <w:r>
+        <w:t>order_purchase_timestamp</w:t>
+      </w:r>
+      <w:proofErr w:type="spellEnd"/>
+      <w:r>
+        <w:t xml:space="preserve"> field spans September 2016 to October 2018 enabling full time-intelligence analysis. The geolocation dataset adds real latitude and longitude coordinates enabling precise geographic mapping at zip code level — a significant analytical capability beyond simple state-level analysis.</w:t>
       </w:r>
     </w:p>
     <w:p/>
@@ -148,14 +459,12 @@
         <w:rPr>
           <w:b/>
           <w:bCs/>
-          <w:lang w:val="en-KE"/>
-        </w:rPr>
-      </w:pPr>
-      <w:r>
-        <w:rPr>
-          <w:b/>
-          <w:bCs/>
-          <w:lang w:val="en-KE"/>
+        </w:rPr>
+      </w:pPr>
+      <w:r>
+        <w:rPr>
+          <w:b/>
+          <w:bCs/>
         </w:rPr>
         <w:t>olist_orders_dataset.csv</w:t>
       </w:r>
@@ -165,14 +474,13 @@
         <w:rPr>
           <w:b/>
           <w:bCs/>
-          <w:lang w:val="en-KE"/>
-        </w:rPr>
-      </w:pPr>
-      <w:r>
-        <w:rPr>
-          <w:b/>
-          <w:bCs/>
-          <w:lang w:val="en-KE"/>
+        </w:rPr>
+      </w:pPr>
+      <w:r>
+        <w:rPr>
+          <w:b/>
+          <w:bCs/>
+          <w:noProof/>
         </w:rPr>
         <w:drawing>
           <wp:inline distT="0" distB="0" distL="0" distR="0" wp14:anchorId="59279651" wp14:editId="5ADBCBD6">
@@ -190,7 +498,7 @@
                     <pic:cNvPicPr/>
                   </pic:nvPicPr>
                   <pic:blipFill>
-                    <a:blip r:embed="rId7"/>
+                    <a:blip r:embed="rId12"/>
                     <a:stretch>
                       <a:fillRect/>
                     </a:stretch>
@@ -216,14 +524,12 @@
         <w:rPr>
           <w:b/>
           <w:bCs/>
-          <w:lang w:val="en-KE"/>
-        </w:rPr>
-      </w:pPr>
-      <w:r>
-        <w:rPr>
-          <w:b/>
-          <w:bCs/>
-          <w:lang w:val="en-KE"/>
+        </w:rPr>
+      </w:pPr>
+      <w:r>
+        <w:rPr>
+          <w:b/>
+          <w:bCs/>
         </w:rPr>
         <w:t>olist_order_items_dataset.csv</w:t>
       </w:r>
@@ -231,7 +537,6 @@
         <w:rPr>
           <w:b/>
           <w:bCs/>
-          <w:lang w:val="en-KE"/>
         </w:rPr>
         <w:t xml:space="preserve">  </w:t>
       </w:r>
@@ -241,14 +546,13 @@
         <w:rPr>
           <w:b/>
           <w:bCs/>
-          <w:lang w:val="en-KE"/>
-        </w:rPr>
-      </w:pPr>
-      <w:r>
-        <w:rPr>
-          <w:b/>
-          <w:bCs/>
-          <w:lang w:val="en-KE"/>
+        </w:rPr>
+      </w:pPr>
+      <w:r>
+        <w:rPr>
+          <w:b/>
+          <w:bCs/>
+          <w:noProof/>
         </w:rPr>
         <w:lastRenderedPageBreak/>
         <w:drawing>
@@ -267,7 +571,7 @@
                     <pic:cNvPicPr/>
                   </pic:nvPicPr>
                   <pic:blipFill>
-                    <a:blip r:embed="rId8"/>
+                    <a:blip r:embed="rId13"/>
                     <a:stretch>
                       <a:fillRect/>
                     </a:stretch>
@@ -293,14 +597,12 @@
         <w:rPr>
           <w:b/>
           <w:bCs/>
-          <w:lang w:val="en-KE"/>
-        </w:rPr>
-      </w:pPr>
-      <w:r>
-        <w:rPr>
-          <w:b/>
-          <w:bCs/>
-          <w:lang w:val="en-KE"/>
+        </w:rPr>
+      </w:pPr>
+      <w:r>
+        <w:rPr>
+          <w:b/>
+          <w:bCs/>
         </w:rPr>
         <w:t>olist_order_payments_dataset.</w:t>
       </w:r>
@@ -308,7 +610,6 @@
         <w:rPr>
           <w:b/>
           <w:bCs/>
-          <w:lang w:val="en-KE"/>
         </w:rPr>
         <w:t>csv</w:t>
       </w:r>
@@ -318,14 +619,13 @@
         <w:rPr>
           <w:b/>
           <w:bCs/>
-          <w:lang w:val="en-KE"/>
-        </w:rPr>
-      </w:pPr>
-      <w:r>
-        <w:rPr>
-          <w:b/>
-          <w:bCs/>
-          <w:lang w:val="en-KE"/>
+        </w:rPr>
+      </w:pPr>
+      <w:r>
+        <w:rPr>
+          <w:b/>
+          <w:bCs/>
+          <w:noProof/>
         </w:rPr>
         <w:drawing>
           <wp:inline distT="0" distB="0" distL="0" distR="0" wp14:anchorId="0F97F632" wp14:editId="1D2E8EFE">
@@ -343,7 +643,7 @@
                     <pic:cNvPicPr/>
                   </pic:nvPicPr>
                   <pic:blipFill>
-                    <a:blip r:embed="rId9"/>
+                    <a:blip r:embed="rId14"/>
                     <a:stretch>
                       <a:fillRect/>
                     </a:stretch>
@@ -369,14 +669,12 @@
         <w:rPr>
           <w:b/>
           <w:bCs/>
-          <w:lang w:val="en-KE"/>
-        </w:rPr>
-      </w:pPr>
-      <w:r>
-        <w:rPr>
-          <w:b/>
-          <w:bCs/>
-          <w:lang w:val="en-KE"/>
+        </w:rPr>
+      </w:pPr>
+      <w:r>
+        <w:rPr>
+          <w:b/>
+          <w:bCs/>
         </w:rPr>
         <w:t>olist_order_reviews_dataset.csv</w:t>
       </w:r>
@@ -384,7 +682,6 @@
         <w:rPr>
           <w:b/>
           <w:bCs/>
-          <w:lang w:val="en-KE"/>
         </w:rPr>
         <w:t xml:space="preserve"> </w:t>
       </w:r>
@@ -394,14 +691,13 @@
         <w:rPr>
           <w:b/>
           <w:bCs/>
-          <w:lang w:val="en-KE"/>
-        </w:rPr>
-      </w:pPr>
-      <w:r>
-        <w:rPr>
-          <w:b/>
-          <w:bCs/>
-          <w:lang w:val="en-KE"/>
+        </w:rPr>
+      </w:pPr>
+      <w:r>
+        <w:rPr>
+          <w:b/>
+          <w:bCs/>
+          <w:noProof/>
         </w:rPr>
         <w:drawing>
           <wp:inline distT="0" distB="0" distL="0" distR="0" wp14:anchorId="64E6FED9" wp14:editId="6F980456">
@@ -419,7 +715,7 @@
                     <pic:cNvPicPr/>
                   </pic:nvPicPr>
                   <pic:blipFill>
-                    <a:blip r:embed="rId10"/>
+                    <a:blip r:embed="rId15"/>
                     <a:stretch>
                       <a:fillRect/>
                     </a:stretch>
@@ -445,14 +741,12 @@
         <w:rPr>
           <w:b/>
           <w:bCs/>
-          <w:lang w:val="en-KE"/>
-        </w:rPr>
-      </w:pPr>
-      <w:r>
-        <w:rPr>
-          <w:b/>
-          <w:bCs/>
-          <w:lang w:val="en-KE"/>
+        </w:rPr>
+      </w:pPr>
+      <w:r>
+        <w:rPr>
+          <w:b/>
+          <w:bCs/>
         </w:rPr>
         <w:t>olist_products_dataset.csv</w:t>
       </w:r>
@@ -460,7 +754,6 @@
         <w:rPr>
           <w:b/>
           <w:bCs/>
-          <w:lang w:val="en-KE"/>
         </w:rPr>
         <w:t xml:space="preserve"> </w:t>
       </w:r>
@@ -470,14 +763,13 @@
         <w:rPr>
           <w:b/>
           <w:bCs/>
-          <w:lang w:val="en-KE"/>
-        </w:rPr>
-      </w:pPr>
-      <w:r>
-        <w:rPr>
-          <w:b/>
-          <w:bCs/>
-          <w:lang w:val="en-KE"/>
+        </w:rPr>
+      </w:pPr>
+      <w:r>
+        <w:rPr>
+          <w:b/>
+          <w:bCs/>
+          <w:noProof/>
         </w:rPr>
         <w:drawing>
           <wp:inline distT="0" distB="0" distL="0" distR="0" wp14:anchorId="6567EE1F" wp14:editId="0E008E7B">
@@ -495,7 +787,7 @@
                     <pic:cNvPicPr/>
                   </pic:nvPicPr>
                   <pic:blipFill>
-                    <a:blip r:embed="rId11"/>
+                    <a:blip r:embed="rId16"/>
                     <a:stretch>
                       <a:fillRect/>
                     </a:stretch>
@@ -521,14 +813,12 @@
         <w:rPr>
           <w:b/>
           <w:bCs/>
-          <w:lang w:val="en-KE"/>
-        </w:rPr>
-      </w:pPr>
-      <w:r>
-        <w:rPr>
-          <w:b/>
-          <w:bCs/>
-          <w:lang w:val="en-KE"/>
+        </w:rPr>
+      </w:pPr>
+      <w:r>
+        <w:rPr>
+          <w:b/>
+          <w:bCs/>
         </w:rPr>
         <w:t>olist_customers_dataset.csv</w:t>
       </w:r>
@@ -538,14 +828,13 @@
         <w:rPr>
           <w:b/>
           <w:bCs/>
-          <w:lang w:val="en-KE"/>
-        </w:rPr>
-      </w:pPr>
-      <w:r>
-        <w:rPr>
-          <w:b/>
-          <w:bCs/>
-          <w:lang w:val="en-KE"/>
+        </w:rPr>
+      </w:pPr>
+      <w:r>
+        <w:rPr>
+          <w:b/>
+          <w:bCs/>
+          <w:noProof/>
         </w:rPr>
         <w:drawing>
           <wp:inline distT="0" distB="0" distL="0" distR="0" wp14:anchorId="3662BBF0" wp14:editId="5C08E9A6">
@@ -563,7 +852,7 @@
                     <pic:cNvPicPr/>
                   </pic:nvPicPr>
                   <pic:blipFill>
-                    <a:blip r:embed="rId12"/>
+                    <a:blip r:embed="rId17"/>
                     <a:stretch>
                       <a:fillRect/>
                     </a:stretch>
@@ -589,14 +878,12 @@
         <w:rPr>
           <w:b/>
           <w:bCs/>
-          <w:lang w:val="en-KE"/>
-        </w:rPr>
-      </w:pPr>
-      <w:r>
-        <w:rPr>
-          <w:b/>
-          <w:bCs/>
-          <w:lang w:val="en-KE"/>
+        </w:rPr>
+      </w:pPr>
+      <w:r>
+        <w:rPr>
+          <w:b/>
+          <w:bCs/>
         </w:rPr>
         <w:t>product_category_name_translation.csv</w:t>
       </w:r>
@@ -604,7 +891,6 @@
         <w:rPr>
           <w:b/>
           <w:bCs/>
-          <w:lang w:val="en-KE"/>
         </w:rPr>
         <w:t xml:space="preserve"> </w:t>
       </w:r>
@@ -620,6 +906,7 @@
         <w:rPr>
           <w:b/>
           <w:bCs/>
+          <w:noProof/>
         </w:rPr>
         <w:drawing>
           <wp:inline distT="0" distB="0" distL="0" distR="0" wp14:anchorId="2A197760" wp14:editId="74479D18">
@@ -637,7 +924,7 @@
                     <pic:cNvPicPr/>
                   </pic:nvPicPr>
                   <pic:blipFill>
-                    <a:blip r:embed="rId13"/>
+                    <a:blip r:embed="rId18"/>
                     <a:stretch>
                       <a:fillRect/>
                     </a:stretch>
@@ -665,62 +952,6 @@
           <w:bCs/>
         </w:rPr>
       </w:pPr>
-      <w:r>
-        <w:rPr>
-          <w:b/>
-          <w:bCs/>
-        </w:rPr>
-        <w:t>olist_geolocation_dataset.csv</w:t>
-      </w:r>
-    </w:p>
-    <w:p>
-      <w:pPr>
-        <w:rPr>
-          <w:b/>
-          <w:bCs/>
-        </w:rPr>
-      </w:pPr>
-      <w:r>
-        <w:rPr>
-          <w:b/>
-          <w:bCs/>
-        </w:rPr>
-        <w:drawing>
-          <wp:inline distT="0" distB="0" distL="0" distR="0" wp14:anchorId="43E68EDF" wp14:editId="2E21DFB9">
-            <wp:extent cx="4857750" cy="895557"/>
-            <wp:effectExtent l="0" t="0" r="0" b="0"/>
-            <wp:docPr id="182328515" name="Picture 1"/>
-            <wp:cNvGraphicFramePr>
-              <a:graphicFrameLocks xmlns:a="http://schemas.openxmlformats.org/drawingml/2006/main" noChangeAspect="1"/>
-            </wp:cNvGraphicFramePr>
-            <a:graphic xmlns:a="http://schemas.openxmlformats.org/drawingml/2006/main">
-              <a:graphicData uri="http://schemas.openxmlformats.org/drawingml/2006/picture">
-                <pic:pic xmlns:pic="http://schemas.openxmlformats.org/drawingml/2006/picture">
-                  <pic:nvPicPr>
-                    <pic:cNvPr id="182328515" name=""/>
-                    <pic:cNvPicPr/>
-                  </pic:nvPicPr>
-                  <pic:blipFill>
-                    <a:blip r:embed="rId14"/>
-                    <a:stretch>
-                      <a:fillRect/>
-                    </a:stretch>
-                  </pic:blipFill>
-                  <pic:spPr>
-                    <a:xfrm>
-                      <a:off x="0" y="0"/>
-                      <a:ext cx="4867163" cy="897292"/>
-                    </a:xfrm>
-                    <a:prstGeom prst="rect">
-                      <a:avLst/>
-                    </a:prstGeom>
-                  </pic:spPr>
-                </pic:pic>
-              </a:graphicData>
-            </a:graphic>
-          </wp:inline>
-        </w:drawing>
-      </w:r>
     </w:p>
     <w:p>
       <w:pPr>
@@ -753,6 +984,7 @@
           <w:bCs/>
         </w:rPr>
       </w:pPr>
+      <w:proofErr w:type="spellStart"/>
       <w:r>
         <w:rPr>
           <w:b/>
@@ -760,19 +992,21 @@
         </w:rPr>
         <w:t>FactOrders</w:t>
       </w:r>
-    </w:p>
-    <w:p>
-      <w:pPr>
-        <w:rPr>
-          <w:b/>
-          <w:bCs/>
-        </w:rPr>
-      </w:pPr>
-      <w:r>
-        <w:rPr>
-          <w:b/>
-          <w:bCs/>
-        </w:rPr>
+      <w:proofErr w:type="spellEnd"/>
+    </w:p>
+    <w:p>
+      <w:pPr>
+        <w:rPr>
+          <w:b/>
+          <w:bCs/>
+        </w:rPr>
+      </w:pPr>
+      <w:r>
+        <w:rPr>
+          <w:b/>
+          <w:bCs/>
+        </w:rPr>
+        <w:lastRenderedPageBreak/>
         <w:t>Steps Pane:</w:t>
       </w:r>
     </w:p>
@@ -787,6 +1021,7 @@
         <w:rPr>
           <w:b/>
           <w:bCs/>
+          <w:noProof/>
         </w:rPr>
         <w:drawing>
           <wp:inline distT="0" distB="0" distL="0" distR="0" wp14:anchorId="5AC7C981" wp14:editId="4AFB281A">
@@ -804,7 +1039,7 @@
                     <pic:cNvPicPr/>
                   </pic:nvPicPr>
                   <pic:blipFill>
-                    <a:blip r:embed="rId15"/>
+                    <a:blip r:embed="rId19"/>
                     <a:stretch>
                       <a:fillRect/>
                     </a:stretch>
@@ -851,6 +1086,7 @@
         <w:rPr>
           <w:b/>
           <w:bCs/>
+          <w:noProof/>
         </w:rPr>
         <w:drawing>
           <wp:inline distT="0" distB="0" distL="0" distR="0" wp14:anchorId="496B0279" wp14:editId="371FF76D">
@@ -868,7 +1104,7 @@
                     <pic:cNvPicPr/>
                   </pic:nvPicPr>
                   <pic:blipFill>
-                    <a:blip r:embed="rId16"/>
+                    <a:blip r:embed="rId20"/>
                     <a:stretch>
                       <a:fillRect/>
                     </a:stretch>
@@ -892,6 +1128,7 @@
         <w:rPr>
           <w:b/>
           <w:bCs/>
+          <w:noProof/>
         </w:rPr>
         <w:drawing>
           <wp:inline distT="0" distB="0" distL="0" distR="0" wp14:anchorId="33D87838" wp14:editId="0EB22C64">
@@ -909,7 +1146,7 @@
                     <pic:cNvPicPr/>
                   </pic:nvPicPr>
                   <pic:blipFill rotWithShape="1">
-                    <a:blip r:embed="rId17"/>
+                    <a:blip r:embed="rId21"/>
                     <a:srcRect l="83" t="-38" r="57" b="6442"/>
                     <a:stretch>
                       <a:fillRect/>
@@ -965,6 +1202,7 @@
         <w:rPr>
           <w:b/>
           <w:bCs/>
+          <w:noProof/>
         </w:rPr>
         <w:drawing>
           <wp:inline distT="0" distB="0" distL="0" distR="0" wp14:anchorId="1D952FAF" wp14:editId="6CFAEFCA">
@@ -982,7 +1220,7 @@
                     <pic:cNvPicPr/>
                   </pic:nvPicPr>
                   <pic:blipFill>
-                    <a:blip r:embed="rId18"/>
+                    <a:blip r:embed="rId22"/>
                     <a:stretch>
                       <a:fillRect/>
                     </a:stretch>
@@ -1006,6 +1244,7 @@
         <w:rPr>
           <w:b/>
           <w:bCs/>
+          <w:noProof/>
         </w:rPr>
         <w:drawing>
           <wp:inline distT="0" distB="0" distL="0" distR="0" wp14:anchorId="52507D38" wp14:editId="2EFBECBC">
@@ -1023,7 +1262,7 @@
                     <pic:cNvPicPr/>
                   </pic:nvPicPr>
                   <pic:blipFill>
-                    <a:blip r:embed="rId19"/>
+                    <a:blip r:embed="rId23"/>
                     <a:stretch>
                       <a:fillRect/>
                     </a:stretch>
@@ -1102,13 +1341,31 @@
           <w:bCs/>
         </w:rPr>
       </w:pPr>
-      <w:r>
-        <w:rPr>
-          <w:b/>
-          <w:bCs/>
-        </w:rPr>
-        <w:t>order_approved_at and order_delivered_carrier_date</w:t>
-      </w:r>
+      <w:proofErr w:type="spellStart"/>
+      <w:r>
+        <w:rPr>
+          <w:b/>
+          <w:bCs/>
+        </w:rPr>
+        <w:t>order_approved_at</w:t>
+      </w:r>
+      <w:proofErr w:type="spellEnd"/>
+      <w:r>
+        <w:rPr>
+          <w:b/>
+          <w:bCs/>
+        </w:rPr>
+        <w:t xml:space="preserve"> and </w:t>
+      </w:r>
+      <w:proofErr w:type="spellStart"/>
+      <w:r>
+        <w:rPr>
+          <w:b/>
+          <w:bCs/>
+        </w:rPr>
+        <w:t>order_delivered_carrier_date</w:t>
+      </w:r>
+      <w:proofErr w:type="spellEnd"/>
     </w:p>
     <w:p>
       <w:pPr>
@@ -1133,6 +1390,7 @@
         <w:rPr>
           <w:b/>
           <w:bCs/>
+          <w:noProof/>
         </w:rPr>
         <w:drawing>
           <wp:inline distT="0" distB="0" distL="0" distR="0" wp14:anchorId="5B2AD13D" wp14:editId="4927263E">
@@ -1150,7 +1408,7 @@
                     <pic:cNvPicPr/>
                   </pic:nvPicPr>
                   <pic:blipFill>
-                    <a:blip r:embed="rId20"/>
+                    <a:blip r:embed="rId24"/>
                     <a:stretch>
                       <a:fillRect/>
                     </a:stretch>
@@ -1223,6 +1481,7 @@
         <w:rPr>
           <w:b/>
           <w:bCs/>
+          <w:noProof/>
         </w:rPr>
         <w:drawing>
           <wp:inline distT="0" distB="0" distL="0" distR="0" wp14:anchorId="1911887F" wp14:editId="6711B63E">
@@ -1240,7 +1499,7 @@
                     <pic:cNvPicPr/>
                   </pic:nvPicPr>
                   <pic:blipFill>
-                    <a:blip r:embed="rId21"/>
+                    <a:blip r:embed="rId25"/>
                     <a:stretch>
                       <a:fillRect/>
                     </a:stretch>
@@ -1291,26 +1550,44 @@
         <w:pStyle w:val="ListParagraph"/>
       </w:pPr>
       <w:r>
-        <w:lastRenderedPageBreak/>
-        <w:t>A small number of "delivered" rows still have a null delivery date</w:t>
+        <w:t xml:space="preserve">A small number of "delivered" rows still have a null delivery </w:t>
+      </w:r>
+      <w:proofErr w:type="gramStart"/>
+      <w:r>
+        <w:t>date</w:t>
       </w:r>
       <w:r>
         <w:t xml:space="preserve">, </w:t>
       </w:r>
       <w:r>
-        <w:t xml:space="preserve"> data entry errors. These prevent DeliveryDays from calculating.</w:t>
-      </w:r>
-    </w:p>
-    <w:p>
-      <w:pPr>
-        <w:pStyle w:val="ListParagraph"/>
-      </w:pPr>
-    </w:p>
-    <w:p>
-      <w:pPr>
-        <w:pStyle w:val="ListParagraph"/>
-      </w:pPr>
-      <w:r>
+        <w:t xml:space="preserve"> data</w:t>
+      </w:r>
+      <w:proofErr w:type="gramEnd"/>
+      <w:r>
+        <w:t xml:space="preserve"> entry errors. These prevent </w:t>
+      </w:r>
+      <w:proofErr w:type="spellStart"/>
+      <w:r>
+        <w:t>DeliveryDays</w:t>
+      </w:r>
+      <w:proofErr w:type="spellEnd"/>
+      <w:r>
+        <w:t xml:space="preserve"> from calculating.</w:t>
+      </w:r>
+    </w:p>
+    <w:p>
+      <w:pPr>
+        <w:pStyle w:val="ListParagraph"/>
+      </w:pPr>
+    </w:p>
+    <w:p>
+      <w:pPr>
+        <w:pStyle w:val="ListParagraph"/>
+      </w:pPr>
+      <w:r>
+        <w:rPr>
+          <w:noProof/>
+        </w:rPr>
         <w:drawing>
           <wp:inline distT="0" distB="0" distL="0" distR="0" wp14:anchorId="7AF93454" wp14:editId="04110E28">
             <wp:extent cx="5731510" cy="309245"/>
@@ -1327,7 +1604,7 @@
                     <pic:cNvPicPr/>
                   </pic:nvPicPr>
                   <pic:blipFill>
-                    <a:blip r:embed="rId22"/>
+                    <a:blip r:embed="rId26"/>
                     <a:stretch>
                       <a:fillRect/>
                     </a:stretch>
@@ -1370,7 +1647,23 @@
           <w:b/>
           <w:bCs/>
         </w:rPr>
-        <w:t> Create DeliveryDays custom column</w:t>
+        <w:t xml:space="preserve"> Create </w:t>
+      </w:r>
+      <w:proofErr w:type="spellStart"/>
+      <w:r>
+        <w:rPr>
+          <w:b/>
+          <w:bCs/>
+        </w:rPr>
+        <w:t>DeliveryDays</w:t>
+      </w:r>
+      <w:proofErr w:type="spellEnd"/>
+      <w:r>
+        <w:rPr>
+          <w:b/>
+          <w:bCs/>
+        </w:rPr>
+        <w:t xml:space="preserve"> custom column</w:t>
       </w:r>
     </w:p>
     <w:p>
@@ -1393,6 +1686,7 @@
         <w:rPr>
           <w:b/>
           <w:bCs/>
+          <w:noProof/>
         </w:rPr>
         <w:drawing>
           <wp:inline distT="0" distB="0" distL="0" distR="0" wp14:anchorId="5520270D" wp14:editId="2616124D">
@@ -1410,7 +1704,7 @@
                     <pic:cNvPicPr/>
                   </pic:nvPicPr>
                   <pic:blipFill>
-                    <a:blip r:embed="rId23"/>
+                    <a:blip r:embed="rId27"/>
                     <a:stretch>
                       <a:fillRect/>
                     </a:stretch>
@@ -1457,7 +1751,23 @@
           <w:b/>
           <w:bCs/>
         </w:rPr>
-        <w:t>Create DeliveryStatus conditional column</w:t>
+        <w:t xml:space="preserve">Create </w:t>
+      </w:r>
+      <w:proofErr w:type="spellStart"/>
+      <w:r>
+        <w:rPr>
+          <w:b/>
+          <w:bCs/>
+        </w:rPr>
+        <w:t>DeliveryStatus</w:t>
+      </w:r>
+      <w:proofErr w:type="spellEnd"/>
+      <w:r>
+        <w:rPr>
+          <w:b/>
+          <w:bCs/>
+        </w:rPr>
+        <w:t xml:space="preserve"> conditional column</w:t>
       </w:r>
     </w:p>
     <w:p>
@@ -1487,6 +1797,7 @@
         <w:rPr>
           <w:b/>
           <w:bCs/>
+          <w:noProof/>
         </w:rPr>
         <w:drawing>
           <wp:inline distT="0" distB="0" distL="0" distR="0" wp14:anchorId="57E158AD" wp14:editId="07388042">
@@ -1504,7 +1815,7 @@
                     <pic:cNvPicPr/>
                   </pic:nvPicPr>
                   <pic:blipFill>
-                    <a:blip r:embed="rId24"/>
+                    <a:blip r:embed="rId28"/>
                     <a:stretch>
                       <a:fillRect/>
                     </a:stretch>
@@ -1551,35 +1862,62 @@
           <w:b/>
           <w:bCs/>
         </w:rPr>
-        <w:t>Extract PurchaseDate from timestamp</w:t>
-      </w:r>
-    </w:p>
-    <w:p>
-      <w:pPr>
-        <w:pStyle w:val="ListParagraph"/>
-      </w:pPr>
-      <w:r>
-        <w:t>DimDate contains Date values with no time component. The relationship requires both sides to be the same type</w:t>
+        <w:t xml:space="preserve">Extract </w:t>
+      </w:r>
+      <w:proofErr w:type="spellStart"/>
+      <w:r>
+        <w:rPr>
+          <w:b/>
+          <w:bCs/>
+        </w:rPr>
+        <w:t>PurchaseDate</w:t>
+      </w:r>
+      <w:proofErr w:type="spellEnd"/>
+      <w:r>
+        <w:rPr>
+          <w:b/>
+          <w:bCs/>
+        </w:rPr>
+        <w:t xml:space="preserve"> from timestamp</w:t>
+      </w:r>
+    </w:p>
+    <w:p>
+      <w:pPr>
+        <w:pStyle w:val="ListParagraph"/>
+      </w:pPr>
+      <w:proofErr w:type="spellStart"/>
+      <w:r>
+        <w:t>DimDate</w:t>
+      </w:r>
+      <w:proofErr w:type="spellEnd"/>
+      <w:r>
+        <w:t xml:space="preserve"> contains Date values with no time component. The relationship requires both sides to be the same type</w:t>
       </w:r>
       <w:r>
         <w:t xml:space="preserve">, </w:t>
       </w:r>
-      <w:r>
-        <w:t>Date.From strips the time part.</w:t>
-      </w:r>
-    </w:p>
-    <w:p>
-      <w:pPr>
-        <w:pStyle w:val="ListParagraph"/>
-        <w:rPr>
-          <w:b/>
-          <w:bCs/>
-        </w:rPr>
-      </w:pPr>
-      <w:r>
-        <w:rPr>
-          <w:b/>
-          <w:bCs/>
+      <w:proofErr w:type="spellStart"/>
+      <w:r>
+        <w:t>Date.From</w:t>
+      </w:r>
+      <w:proofErr w:type="spellEnd"/>
+      <w:r>
+        <w:t xml:space="preserve"> strips the time part.</w:t>
+      </w:r>
+    </w:p>
+    <w:p>
+      <w:pPr>
+        <w:pStyle w:val="ListParagraph"/>
+        <w:rPr>
+          <w:b/>
+          <w:bCs/>
+        </w:rPr>
+      </w:pPr>
+      <w:r>
+        <w:rPr>
+          <w:b/>
+          <w:bCs/>
+          <w:noProof/>
         </w:rPr>
         <w:drawing>
           <wp:inline distT="0" distB="0" distL="0" distR="0" wp14:anchorId="4CB56456" wp14:editId="5C66F526">
@@ -1597,7 +1935,7 @@
                     <pic:cNvPicPr/>
                   </pic:nvPicPr>
                   <pic:blipFill>
-                    <a:blip r:embed="rId25"/>
+                    <a:blip r:embed="rId29"/>
                     <a:stretch>
                       <a:fillRect/>
                     </a:stretch>
@@ -1626,6 +1964,7 @@
           <w:bCs/>
         </w:rPr>
       </w:pPr>
+      <w:proofErr w:type="spellStart"/>
       <w:r>
         <w:rPr>
           <w:b/>
@@ -1633,6 +1972,7 @@
         </w:rPr>
         <w:t>CategoryTranslation</w:t>
       </w:r>
+      <w:proofErr w:type="spellEnd"/>
     </w:p>
     <w:p>
       <w:pPr>
@@ -1660,6 +2000,7 @@
         <w:rPr>
           <w:b/>
           <w:bCs/>
+          <w:noProof/>
         </w:rPr>
         <w:drawing>
           <wp:inline distT="0" distB="0" distL="0" distR="0" wp14:anchorId="6362E550" wp14:editId="3F7BB4A7">
@@ -1677,7 +2018,7 @@
                     <pic:cNvPicPr/>
                   </pic:nvPicPr>
                   <pic:blipFill>
-                    <a:blip r:embed="rId26"/>
+                    <a:blip r:embed="rId30"/>
                     <a:stretch>
                       <a:fillRect/>
                     </a:stretch>
@@ -1724,6 +2065,7 @@
         <w:rPr>
           <w:b/>
           <w:bCs/>
+          <w:noProof/>
         </w:rPr>
         <w:drawing>
           <wp:inline distT="0" distB="0" distL="0" distR="0" wp14:anchorId="54924199" wp14:editId="7D70B0F7">
@@ -1741,7 +2083,7 @@
                     <pic:cNvPicPr/>
                   </pic:nvPicPr>
                   <pic:blipFill rotWithShape="1">
-                    <a:blip r:embed="rId27"/>
+                    <a:blip r:embed="rId31"/>
                     <a:srcRect r="-10" b="28241"/>
                     <a:stretch>
                       <a:fillRect/>
@@ -1788,7 +2130,9 @@
     </w:p>
     <w:p>
       <w:r>
-        <w:lastRenderedPageBreak/>
+        <w:rPr>
+          <w:noProof/>
+        </w:rPr>
         <w:drawing>
           <wp:inline distT="0" distB="0" distL="0" distR="0" wp14:anchorId="3C9CB3AC" wp14:editId="145ACCDD">
             <wp:extent cx="2620370" cy="1399892"/>
@@ -1805,7 +2149,7 @@
                     <pic:cNvPicPr/>
                   </pic:nvPicPr>
                   <pic:blipFill>
-                    <a:blip r:embed="rId28"/>
+                    <a:blip r:embed="rId32"/>
                     <a:stretch>
                       <a:fillRect/>
                     </a:stretch>
@@ -1865,6 +2209,7 @@
         <w:rPr>
           <w:b/>
           <w:bCs/>
+          <w:noProof/>
         </w:rPr>
         <w:drawing>
           <wp:inline distT="0" distB="0" distL="0" distR="0" wp14:anchorId="4BF31FC5" wp14:editId="49169AD6">
@@ -1882,7 +2227,7 @@
                     <pic:cNvPicPr/>
                   </pic:nvPicPr>
                   <pic:blipFill>
-                    <a:blip r:embed="rId29"/>
+                    <a:blip r:embed="rId33"/>
                     <a:stretch>
                       <a:fillRect/>
                     </a:stretch>
@@ -1918,6 +2263,7 @@
           <w:bCs/>
         </w:rPr>
       </w:pPr>
+      <w:proofErr w:type="spellStart"/>
       <w:r>
         <w:rPr>
           <w:b/>
@@ -1925,6 +2271,7 @@
         </w:rPr>
         <w:t>DimProducts</w:t>
       </w:r>
+      <w:proofErr w:type="spellEnd"/>
     </w:p>
     <w:p>
       <w:pPr>
@@ -1952,6 +2299,7 @@
         <w:rPr>
           <w:b/>
           <w:bCs/>
+          <w:noProof/>
         </w:rPr>
         <w:drawing>
           <wp:inline distT="0" distB="0" distL="0" distR="0" wp14:anchorId="7CF5AE39" wp14:editId="1E9873F6">
@@ -1969,7 +2317,7 @@
                     <pic:cNvPicPr/>
                   </pic:nvPicPr>
                   <pic:blipFill>
-                    <a:blip r:embed="rId30"/>
+                    <a:blip r:embed="rId34"/>
                     <a:stretch>
                       <a:fillRect/>
                     </a:stretch>
@@ -2016,6 +2364,7 @@
         <w:rPr>
           <w:b/>
           <w:bCs/>
+          <w:noProof/>
         </w:rPr>
         <w:drawing>
           <wp:inline distT="0" distB="0" distL="0" distR="0" wp14:anchorId="6745D5F1" wp14:editId="1795ED71">
@@ -2033,7 +2382,7 @@
                     <pic:cNvPicPr/>
                   </pic:nvPicPr>
                   <pic:blipFill>
-                    <a:blip r:embed="rId31"/>
+                    <a:blip r:embed="rId35"/>
                     <a:stretch>
                       <a:fillRect/>
                     </a:stretch>
@@ -2057,6 +2406,7 @@
         <w:rPr>
           <w:b/>
           <w:bCs/>
+          <w:noProof/>
         </w:rPr>
         <w:drawing>
           <wp:inline distT="0" distB="0" distL="0" distR="0" wp14:anchorId="01CEDC12" wp14:editId="719D710C">
@@ -2074,7 +2424,7 @@
                     <pic:cNvPicPr/>
                   </pic:nvPicPr>
                   <pic:blipFill>
-                    <a:blip r:embed="rId32"/>
+                    <a:blip r:embed="rId36"/>
                     <a:stretch>
                       <a:fillRect/>
                     </a:stretch>
@@ -2121,6 +2471,7 @@
         <w:rPr>
           <w:b/>
           <w:bCs/>
+          <w:noProof/>
         </w:rPr>
         <w:drawing>
           <wp:inline distT="0" distB="0" distL="0" distR="0" wp14:anchorId="697F9498" wp14:editId="7E94484D">
@@ -2138,7 +2489,7 @@
                     <pic:cNvPicPr/>
                   </pic:nvPicPr>
                   <pic:blipFill>
-                    <a:blip r:embed="rId33"/>
+                    <a:blip r:embed="rId37"/>
                     <a:stretch>
                       <a:fillRect/>
                     </a:stretch>
@@ -2162,6 +2513,7 @@
         <w:rPr>
           <w:b/>
           <w:bCs/>
+          <w:noProof/>
         </w:rPr>
         <w:drawing>
           <wp:inline distT="0" distB="0" distL="0" distR="0" wp14:anchorId="740E29F3" wp14:editId="6CF506AE">
@@ -2179,7 +2531,7 @@
                     <pic:cNvPicPr/>
                   </pic:nvPicPr>
                   <pic:blipFill>
-                    <a:blip r:embed="rId34"/>
+                    <a:blip r:embed="rId38"/>
                     <a:stretch>
                       <a:fillRect/>
                     </a:stretch>
@@ -2203,6 +2555,7 @@
         <w:rPr>
           <w:b/>
           <w:bCs/>
+          <w:noProof/>
         </w:rPr>
         <w:drawing>
           <wp:inline distT="0" distB="0" distL="0" distR="0" wp14:anchorId="397B3FAE" wp14:editId="6DCEB5FD">
@@ -2220,7 +2573,7 @@
                     <pic:cNvPicPr/>
                   </pic:nvPicPr>
                   <pic:blipFill>
-                    <a:blip r:embed="rId35"/>
+                    <a:blip r:embed="rId39"/>
                     <a:stretch>
                       <a:fillRect/>
                     </a:stretch>
@@ -2282,6 +2635,7 @@
         <w:rPr>
           <w:b/>
           <w:bCs/>
+          <w:noProof/>
         </w:rPr>
         <w:drawing>
           <wp:inline distT="0" distB="0" distL="0" distR="0" wp14:anchorId="158DFC28" wp14:editId="14FA2967">
@@ -2299,7 +2653,7 @@
                     <pic:cNvPicPr/>
                   </pic:nvPicPr>
                   <pic:blipFill>
-                    <a:blip r:embed="rId36"/>
+                    <a:blip r:embed="rId40"/>
                     <a:stretch>
                       <a:fillRect/>
                     </a:stretch>
@@ -2352,6 +2706,7 @@
         <w:rPr>
           <w:b/>
           <w:bCs/>
+          <w:noProof/>
         </w:rPr>
         <w:drawing>
           <wp:inline distT="0" distB="0" distL="0" distR="0" wp14:anchorId="33AA94D5" wp14:editId="296ADDAA">
@@ -2369,7 +2724,7 @@
                     <pic:cNvPicPr/>
                   </pic:nvPicPr>
                   <pic:blipFill>
-                    <a:blip r:embed="rId37"/>
+                    <a:blip r:embed="rId41"/>
                     <a:stretch>
                       <a:fillRect/>
                     </a:stretch>
@@ -2416,8 +2771,23 @@
           <w:b/>
           <w:bCs/>
         </w:rPr>
-        <w:lastRenderedPageBreak/>
-        <w:t>Merge CategoryTranslation into Products </w:t>
+        <w:t xml:space="preserve">Merge </w:t>
+      </w:r>
+      <w:proofErr w:type="spellStart"/>
+      <w:r>
+        <w:rPr>
+          <w:b/>
+          <w:bCs/>
+        </w:rPr>
+        <w:t>CategoryTranslation</w:t>
+      </w:r>
+      <w:proofErr w:type="spellEnd"/>
+      <w:r>
+        <w:rPr>
+          <w:b/>
+          <w:bCs/>
+        </w:rPr>
+        <w:t xml:space="preserve"> into Products </w:t>
       </w:r>
     </w:p>
     <w:p>
@@ -2461,6 +2831,7 @@
         <w:rPr>
           <w:b/>
           <w:bCs/>
+          <w:noProof/>
         </w:rPr>
         <w:drawing>
           <wp:inline distT="0" distB="0" distL="0" distR="0" wp14:anchorId="3E84B8B3" wp14:editId="5B9FD523">
@@ -2478,7 +2849,7 @@
                     <pic:cNvPicPr/>
                   </pic:nvPicPr>
                   <pic:blipFill>
-                    <a:blip r:embed="rId38"/>
+                    <a:blip r:embed="rId42"/>
                     <a:stretch>
                       <a:fillRect/>
                     </a:stretch>
@@ -2532,7 +2903,9 @@
         <w:rPr>
           <w:b/>
           <w:bCs/>
-        </w:rPr>
+          <w:noProof/>
+        </w:rPr>
+        <w:lastRenderedPageBreak/>
         <w:drawing>
           <wp:inline distT="0" distB="0" distL="0" distR="0" wp14:anchorId="40361285" wp14:editId="6D917681">
             <wp:extent cx="5731510" cy="384175"/>
@@ -2549,7 +2922,7 @@
                     <pic:cNvPicPr/>
                   </pic:nvPicPr>
                   <pic:blipFill>
-                    <a:blip r:embed="rId39"/>
+                    <a:blip r:embed="rId43"/>
                     <a:stretch>
                       <a:fillRect/>
                     </a:stretch>
@@ -2585,13 +2958,23 @@
           <w:bCs/>
         </w:rPr>
       </w:pPr>
-      <w:r>
-        <w:rPr>
-          <w:b/>
-          <w:bCs/>
-        </w:rPr>
-        <w:t>DimGeoLocation</w:t>
-      </w:r>
+    </w:p>
+    <w:p>
+      <w:pPr>
+        <w:rPr>
+          <w:b/>
+          <w:bCs/>
+        </w:rPr>
+      </w:pPr>
+      <w:proofErr w:type="spellStart"/>
+      <w:r>
+        <w:rPr>
+          <w:b/>
+          <w:bCs/>
+        </w:rPr>
+        <w:t>DimOrderPayments</w:t>
+      </w:r>
+      <w:proofErr w:type="spellEnd"/>
     </w:p>
     <w:p>
       <w:pPr>
@@ -2619,350 +3002,7 @@
         <w:rPr>
           <w:b/>
           <w:bCs/>
-        </w:rPr>
-        <w:drawing>
-          <wp:inline distT="0" distB="0" distL="0" distR="0" wp14:anchorId="062CE393" wp14:editId="5F0B1796">
-            <wp:extent cx="2088107" cy="906046"/>
-            <wp:effectExtent l="0" t="0" r="7620" b="8890"/>
-            <wp:docPr id="376073883" name="Picture 1"/>
-            <wp:cNvGraphicFramePr>
-              <a:graphicFrameLocks xmlns:a="http://schemas.openxmlformats.org/drawingml/2006/main" noChangeAspect="1"/>
-            </wp:cNvGraphicFramePr>
-            <a:graphic xmlns:a="http://schemas.openxmlformats.org/drawingml/2006/main">
-              <a:graphicData uri="http://schemas.openxmlformats.org/drawingml/2006/picture">
-                <pic:pic xmlns:pic="http://schemas.openxmlformats.org/drawingml/2006/picture">
-                  <pic:nvPicPr>
-                    <pic:cNvPr id="376073883" name=""/>
-                    <pic:cNvPicPr/>
-                  </pic:nvPicPr>
-                  <pic:blipFill>
-                    <a:blip r:embed="rId40"/>
-                    <a:stretch>
-                      <a:fillRect/>
-                    </a:stretch>
-                  </pic:blipFill>
-                  <pic:spPr>
-                    <a:xfrm>
-                      <a:off x="0" y="0"/>
-                      <a:ext cx="2098173" cy="910414"/>
-                    </a:xfrm>
-                    <a:prstGeom prst="rect">
-                      <a:avLst/>
-                    </a:prstGeom>
-                  </pic:spPr>
-                </pic:pic>
-              </a:graphicData>
-            </a:graphic>
-          </wp:inline>
-        </w:drawing>
-      </w:r>
-    </w:p>
-    <w:p>
-      <w:pPr>
-        <w:rPr>
-          <w:b/>
-          <w:bCs/>
-        </w:rPr>
-      </w:pPr>
-      <w:r>
-        <w:rPr>
-          <w:b/>
-          <w:bCs/>
-        </w:rPr>
-        <w:t>Before:</w:t>
-      </w:r>
-    </w:p>
-    <w:p>
-      <w:pPr>
-        <w:rPr>
-          <w:b/>
-          <w:bCs/>
-        </w:rPr>
-      </w:pPr>
-      <w:r>
-        <w:rPr>
-          <w:b/>
-          <w:bCs/>
-        </w:rPr>
-        <w:drawing>
-          <wp:inline distT="0" distB="0" distL="0" distR="0" wp14:anchorId="0F710BF2" wp14:editId="7AC43754">
-            <wp:extent cx="3070746" cy="1172368"/>
-            <wp:effectExtent l="0" t="0" r="0" b="8890"/>
-            <wp:docPr id="1893638321" name="Picture 1"/>
-            <wp:cNvGraphicFramePr>
-              <a:graphicFrameLocks xmlns:a="http://schemas.openxmlformats.org/drawingml/2006/main" noChangeAspect="1"/>
-            </wp:cNvGraphicFramePr>
-            <a:graphic xmlns:a="http://schemas.openxmlformats.org/drawingml/2006/main">
-              <a:graphicData uri="http://schemas.openxmlformats.org/drawingml/2006/picture">
-                <pic:pic xmlns:pic="http://schemas.openxmlformats.org/drawingml/2006/picture">
-                  <pic:nvPicPr>
-                    <pic:cNvPr id="1893638321" name=""/>
-                    <pic:cNvPicPr/>
-                  </pic:nvPicPr>
-                  <pic:blipFill>
-                    <a:blip r:embed="rId41"/>
-                    <a:stretch>
-                      <a:fillRect/>
-                    </a:stretch>
-                  </pic:blipFill>
-                  <pic:spPr>
-                    <a:xfrm>
-                      <a:off x="0" y="0"/>
-                      <a:ext cx="3085222" cy="1177895"/>
-                    </a:xfrm>
-                    <a:prstGeom prst="rect">
-                      <a:avLst/>
-                    </a:prstGeom>
-                  </pic:spPr>
-                </pic:pic>
-              </a:graphicData>
-            </a:graphic>
-          </wp:inline>
-        </w:drawing>
-      </w:r>
-    </w:p>
-    <w:p>
-      <w:pPr>
-        <w:rPr>
-          <w:b/>
-          <w:bCs/>
-        </w:rPr>
-      </w:pPr>
-      <w:r>
-        <w:rPr>
-          <w:b/>
-          <w:bCs/>
-        </w:rPr>
-        <w:t>After:</w:t>
-      </w:r>
-    </w:p>
-    <w:p>
-      <w:pPr>
-        <w:rPr>
-          <w:b/>
-          <w:bCs/>
-        </w:rPr>
-      </w:pPr>
-      <w:r>
-        <w:rPr>
-          <w:b/>
-          <w:bCs/>
-        </w:rPr>
-        <w:drawing>
-          <wp:inline distT="0" distB="0" distL="0" distR="0" wp14:anchorId="736777FF" wp14:editId="0D9D710B">
-            <wp:extent cx="2863390" cy="1658203"/>
-            <wp:effectExtent l="0" t="0" r="0" b="0"/>
-            <wp:docPr id="278772635" name="Picture 1"/>
-            <wp:cNvGraphicFramePr>
-              <a:graphicFrameLocks xmlns:a="http://schemas.openxmlformats.org/drawingml/2006/main" noChangeAspect="1"/>
-            </wp:cNvGraphicFramePr>
-            <a:graphic xmlns:a="http://schemas.openxmlformats.org/drawingml/2006/main">
-              <a:graphicData uri="http://schemas.openxmlformats.org/drawingml/2006/picture">
-                <pic:pic xmlns:pic="http://schemas.openxmlformats.org/drawingml/2006/picture">
-                  <pic:nvPicPr>
-                    <pic:cNvPr id="278772635" name=""/>
-                    <pic:cNvPicPr/>
-                  </pic:nvPicPr>
-                  <pic:blipFill>
-                    <a:blip r:embed="rId42"/>
-                    <a:stretch>
-                      <a:fillRect/>
-                    </a:stretch>
-                  </pic:blipFill>
-                  <pic:spPr>
-                    <a:xfrm>
-                      <a:off x="0" y="0"/>
-                      <a:ext cx="2866082" cy="1659762"/>
-                    </a:xfrm>
-                    <a:prstGeom prst="rect">
-                      <a:avLst/>
-                    </a:prstGeom>
-                  </pic:spPr>
-                </pic:pic>
-              </a:graphicData>
-            </a:graphic>
-          </wp:inline>
-        </w:drawing>
-      </w:r>
-    </w:p>
-    <w:p>
-      <w:pPr>
-        <w:rPr>
-          <w:b/>
-          <w:bCs/>
-        </w:rPr>
-      </w:pPr>
-    </w:p>
-    <w:p>
-      <w:pPr>
-        <w:pStyle w:val="ListParagraph"/>
-        <w:numPr>
-          <w:ilvl w:val="0"/>
-          <w:numId w:val="7"/>
-        </w:numPr>
-        <w:rPr>
-          <w:b/>
-          <w:bCs/>
-        </w:rPr>
-      </w:pPr>
-      <w:r>
-        <w:rPr>
-          <w:b/>
-          <w:bCs/>
-        </w:rPr>
-        <w:t>Deduplicate Geolocation on zip code </w:t>
-      </w:r>
-    </w:p>
-    <w:p>
-      <w:pPr>
-        <w:pStyle w:val="ListParagraph"/>
-        <w:rPr>
-          <w:b/>
-          <w:bCs/>
-        </w:rPr>
-      </w:pPr>
-      <w:r>
-        <w:rPr>
-          <w:b/>
-          <w:bCs/>
-        </w:rPr>
-        <w:drawing>
-          <wp:inline distT="0" distB="0" distL="0" distR="0" wp14:anchorId="44A8726E" wp14:editId="79020F4A">
-            <wp:extent cx="5731510" cy="338455"/>
-            <wp:effectExtent l="0" t="0" r="2540" b="4445"/>
-            <wp:docPr id="1886696018" name="Picture 1"/>
-            <wp:cNvGraphicFramePr>
-              <a:graphicFrameLocks xmlns:a="http://schemas.openxmlformats.org/drawingml/2006/main" noChangeAspect="1"/>
-            </wp:cNvGraphicFramePr>
-            <a:graphic xmlns:a="http://schemas.openxmlformats.org/drawingml/2006/main">
-              <a:graphicData uri="http://schemas.openxmlformats.org/drawingml/2006/picture">
-                <pic:pic xmlns:pic="http://schemas.openxmlformats.org/drawingml/2006/picture">
-                  <pic:nvPicPr>
-                    <pic:cNvPr id="1886696018" name=""/>
-                    <pic:cNvPicPr/>
-                  </pic:nvPicPr>
-                  <pic:blipFill>
-                    <a:blip r:embed="rId43"/>
-                    <a:stretch>
-                      <a:fillRect/>
-                    </a:stretch>
-                  </pic:blipFill>
-                  <pic:spPr>
-                    <a:xfrm>
-                      <a:off x="0" y="0"/>
-                      <a:ext cx="5731510" cy="338455"/>
-                    </a:xfrm>
-                    <a:prstGeom prst="rect">
-                      <a:avLst/>
-                    </a:prstGeom>
-                  </pic:spPr>
-                </pic:pic>
-              </a:graphicData>
-            </a:graphic>
-          </wp:inline>
-        </w:drawing>
-      </w:r>
-    </w:p>
-    <w:p>
-      <w:pPr>
-        <w:pStyle w:val="ListParagraph"/>
-        <w:rPr>
-          <w:b/>
-          <w:bCs/>
-        </w:rPr>
-      </w:pPr>
-      <w:r>
-        <w:rPr>
-          <w:b/>
-          <w:bCs/>
-        </w:rPr>
-        <w:drawing>
-          <wp:inline distT="0" distB="0" distL="0" distR="0" wp14:anchorId="16132B5D" wp14:editId="1E217546">
-            <wp:extent cx="4924425" cy="290250"/>
-            <wp:effectExtent l="0" t="0" r="0" b="0"/>
-            <wp:docPr id="1533638546" name="Picture 1"/>
-            <wp:cNvGraphicFramePr>
-              <a:graphicFrameLocks xmlns:a="http://schemas.openxmlformats.org/drawingml/2006/main" noChangeAspect="1"/>
-            </wp:cNvGraphicFramePr>
-            <a:graphic xmlns:a="http://schemas.openxmlformats.org/drawingml/2006/main">
-              <a:graphicData uri="http://schemas.openxmlformats.org/drawingml/2006/picture">
-                <pic:pic xmlns:pic="http://schemas.openxmlformats.org/drawingml/2006/picture">
-                  <pic:nvPicPr>
-                    <pic:cNvPr id="1533638546" name=""/>
-                    <pic:cNvPicPr/>
-                  </pic:nvPicPr>
-                  <pic:blipFill>
-                    <a:blip r:embed="rId44"/>
-                    <a:stretch>
-                      <a:fillRect/>
-                    </a:stretch>
-                  </pic:blipFill>
-                  <pic:spPr>
-                    <a:xfrm>
-                      <a:off x="0" y="0"/>
-                      <a:ext cx="5039036" cy="297005"/>
-                    </a:xfrm>
-                    <a:prstGeom prst="rect">
-                      <a:avLst/>
-                    </a:prstGeom>
-                  </pic:spPr>
-                </pic:pic>
-              </a:graphicData>
-            </a:graphic>
-          </wp:inline>
-        </w:drawing>
-      </w:r>
-    </w:p>
-    <w:p>
-      <w:pPr>
-        <w:rPr>
-          <w:b/>
-          <w:bCs/>
-        </w:rPr>
-      </w:pPr>
-    </w:p>
-    <w:p>
-      <w:pPr>
-        <w:rPr>
-          <w:b/>
-          <w:bCs/>
-        </w:rPr>
-      </w:pPr>
-      <w:r>
-        <w:rPr>
-          <w:b/>
-          <w:bCs/>
-        </w:rPr>
-        <w:lastRenderedPageBreak/>
-        <w:t>DimOrderPayments</w:t>
-      </w:r>
-    </w:p>
-    <w:p>
-      <w:pPr>
-        <w:rPr>
-          <w:b/>
-          <w:bCs/>
-        </w:rPr>
-      </w:pPr>
-      <w:r>
-        <w:rPr>
-          <w:b/>
-          <w:bCs/>
-        </w:rPr>
-        <w:t>Steps Pane:</w:t>
-      </w:r>
-    </w:p>
-    <w:p>
-      <w:pPr>
-        <w:rPr>
-          <w:b/>
-          <w:bCs/>
-        </w:rPr>
-      </w:pPr>
-      <w:r>
-        <w:rPr>
-          <w:b/>
-          <w:bCs/>
+          <w:noProof/>
         </w:rPr>
         <w:drawing>
           <wp:inline distT="0" distB="0" distL="0" distR="0" wp14:anchorId="283BCEBC" wp14:editId="69343954">
@@ -2980,7 +3020,7 @@
                     <pic:cNvPicPr/>
                   </pic:nvPicPr>
                   <pic:blipFill>
-                    <a:blip r:embed="rId45"/>
+                    <a:blip r:embed="rId44"/>
                     <a:stretch>
                       <a:fillRect/>
                     </a:stretch>
@@ -3027,6 +3067,7 @@
         <w:rPr>
           <w:b/>
           <w:bCs/>
+          <w:noProof/>
         </w:rPr>
         <w:drawing>
           <wp:inline distT="0" distB="0" distL="0" distR="0" wp14:anchorId="55348058" wp14:editId="7A799D65">
@@ -3044,7 +3085,7 @@
                     <pic:cNvPicPr/>
                   </pic:nvPicPr>
                   <pic:blipFill>
-                    <a:blip r:embed="rId46"/>
+                    <a:blip r:embed="rId45"/>
                     <a:stretch>
                       <a:fillRect/>
                     </a:stretch>
@@ -3091,6 +3132,7 @@
         <w:rPr>
           <w:b/>
           <w:bCs/>
+          <w:noProof/>
         </w:rPr>
         <w:drawing>
           <wp:inline distT="0" distB="0" distL="0" distR="0" wp14:anchorId="41B747B5" wp14:editId="5EEFA1E7">
@@ -3108,7 +3150,7 @@
                     <pic:cNvPicPr/>
                   </pic:nvPicPr>
                   <pic:blipFill>
-                    <a:blip r:embed="rId47"/>
+                    <a:blip r:embed="rId46"/>
                     <a:stretch>
                       <a:fillRect/>
                     </a:stretch>
@@ -3169,26 +3211,35 @@
         <w:t> </w:t>
       </w:r>
       <w:r>
-        <w:t>The Payments table has multiple rows per order_id. Without aggregation the relationship to Orders would be many-to-many, corrupting all payment measures.</w:t>
-      </w:r>
-    </w:p>
-    <w:p>
-      <w:pPr>
-        <w:pStyle w:val="ListParagraph"/>
-      </w:pPr>
-    </w:p>
-    <w:p>
-      <w:pPr>
-        <w:pStyle w:val="ListParagraph"/>
-        <w:rPr>
-          <w:b/>
-          <w:bCs/>
-        </w:rPr>
-      </w:pPr>
-      <w:r>
-        <w:rPr>
-          <w:b/>
-          <w:bCs/>
+        <w:t xml:space="preserve">The Payments table has multiple rows per </w:t>
+      </w:r>
+      <w:proofErr w:type="spellStart"/>
+      <w:r>
+        <w:t>order_id</w:t>
+      </w:r>
+      <w:proofErr w:type="spellEnd"/>
+      <w:r>
+        <w:t>. Without aggregation the relationship to Orders would be many-to-many, corrupting all payment measures.</w:t>
+      </w:r>
+    </w:p>
+    <w:p>
+      <w:pPr>
+        <w:pStyle w:val="ListParagraph"/>
+      </w:pPr>
+    </w:p>
+    <w:p>
+      <w:pPr>
+        <w:pStyle w:val="ListParagraph"/>
+        <w:rPr>
+          <w:b/>
+          <w:bCs/>
+        </w:rPr>
+      </w:pPr>
+      <w:r>
+        <w:rPr>
+          <w:b/>
+          <w:bCs/>
+          <w:noProof/>
         </w:rPr>
         <w:drawing>
           <wp:inline distT="0" distB="0" distL="0" distR="0" wp14:anchorId="2B0B265C" wp14:editId="2AAB612C">
@@ -3206,7 +3257,7 @@
                     <pic:cNvPicPr/>
                   </pic:nvPicPr>
                   <pic:blipFill>
-                    <a:blip r:embed="rId48"/>
+                    <a:blip r:embed="rId47"/>
                     <a:stretch>
                       <a:fillRect/>
                     </a:stretch>
@@ -3242,6 +3293,7 @@
           <w:bCs/>
         </w:rPr>
       </w:pPr>
+      <w:proofErr w:type="spellStart"/>
       <w:r>
         <w:rPr>
           <w:b/>
@@ -3249,6 +3301,7 @@
         </w:rPr>
         <w:t>DimOrderReviews</w:t>
       </w:r>
+      <w:proofErr w:type="spellEnd"/>
     </w:p>
     <w:p>
       <w:pPr>
@@ -3276,7 +3329,9 @@
         <w:rPr>
           <w:b/>
           <w:bCs/>
-        </w:rPr>
+          <w:noProof/>
+        </w:rPr>
+        <w:lastRenderedPageBreak/>
         <w:drawing>
           <wp:inline distT="0" distB="0" distL="0" distR="0" wp14:anchorId="12107A98" wp14:editId="7E8482D9">
             <wp:extent cx="1960474" cy="968839"/>
@@ -3293,7 +3348,7 @@
                     <pic:cNvPicPr/>
                   </pic:nvPicPr>
                   <pic:blipFill>
-                    <a:blip r:embed="rId49"/>
+                    <a:blip r:embed="rId48"/>
                     <a:stretch>
                       <a:fillRect/>
                     </a:stretch>
@@ -3340,8 +3395,8 @@
         <w:rPr>
           <w:b/>
           <w:bCs/>
-        </w:rPr>
-        <w:lastRenderedPageBreak/>
+          <w:noProof/>
+        </w:rPr>
         <w:drawing>
           <wp:inline distT="0" distB="0" distL="0" distR="0" wp14:anchorId="122F0751" wp14:editId="4B2D5D4C">
             <wp:extent cx="2801722" cy="1215239"/>
@@ -3358,7 +3413,7 @@
                     <pic:cNvPicPr/>
                   </pic:nvPicPr>
                   <pic:blipFill>
-                    <a:blip r:embed="rId50"/>
+                    <a:blip r:embed="rId49"/>
                     <a:stretch>
                       <a:fillRect/>
                     </a:stretch>
@@ -3382,6 +3437,7 @@
         <w:rPr>
           <w:b/>
           <w:bCs/>
+          <w:noProof/>
         </w:rPr>
         <w:drawing>
           <wp:inline distT="0" distB="0" distL="0" distR="0" wp14:anchorId="4687CDD4" wp14:editId="5D0F67CD">
@@ -3399,7 +3455,7 @@
                     <pic:cNvPicPr/>
                   </pic:nvPicPr>
                   <pic:blipFill rotWithShape="1">
-                    <a:blip r:embed="rId51"/>
+                    <a:blip r:embed="rId50"/>
                     <a:srcRect b="16701"/>
                     <a:stretch>
                       <a:fillRect/>
@@ -3455,6 +3511,7 @@
         <w:rPr>
           <w:b/>
           <w:bCs/>
+          <w:noProof/>
         </w:rPr>
         <w:drawing>
           <wp:inline distT="0" distB="0" distL="0" distR="0" wp14:anchorId="4666712D" wp14:editId="108D7C73">
@@ -3472,7 +3529,7 @@
                     <pic:cNvPicPr/>
                   </pic:nvPicPr>
                   <pic:blipFill>
-                    <a:blip r:embed="rId52"/>
+                    <a:blip r:embed="rId51"/>
                     <a:stretch>
                       <a:fillRect/>
                     </a:stretch>
@@ -3496,6 +3553,7 @@
         <w:rPr>
           <w:b/>
           <w:bCs/>
+          <w:noProof/>
         </w:rPr>
         <w:drawing>
           <wp:inline distT="0" distB="0" distL="0" distR="0" wp14:anchorId="6E16DD22" wp14:editId="0EFF04AB">
@@ -3513,7 +3571,7 @@
                     <pic:cNvPicPr/>
                   </pic:nvPicPr>
                   <pic:blipFill>
-                    <a:blip r:embed="rId53"/>
+                    <a:blip r:embed="rId52"/>
                     <a:stretch>
                       <a:fillRect/>
                     </a:stretch>
@@ -3595,6 +3653,7 @@
         <w:rPr>
           <w:b/>
           <w:bCs/>
+          <w:noProof/>
         </w:rPr>
         <w:drawing>
           <wp:inline distT="0" distB="0" distL="0" distR="0" wp14:anchorId="31C221EC" wp14:editId="455A7480">
@@ -3612,7 +3671,7 @@
                     <pic:cNvPicPr/>
                   </pic:nvPicPr>
                   <pic:blipFill>
-                    <a:blip r:embed="rId54"/>
+                    <a:blip r:embed="rId53"/>
                     <a:stretch>
                       <a:fillRect/>
                     </a:stretch>
@@ -3666,6 +3725,7 @@
         <w:rPr>
           <w:b/>
           <w:bCs/>
+          <w:noProof/>
         </w:rPr>
         <w:drawing>
           <wp:inline distT="0" distB="0" distL="0" distR="0" wp14:anchorId="427C29D4" wp14:editId="35DA2173">
@@ -3683,7 +3743,7 @@
                     <pic:cNvPicPr/>
                   </pic:nvPicPr>
                   <pic:blipFill>
-                    <a:blip r:embed="rId55"/>
+                    <a:blip r:embed="rId54"/>
                     <a:stretch>
                       <a:fillRect/>
                     </a:stretch>
@@ -3704,6 +3764,1425 @@
         </w:drawing>
       </w:r>
     </w:p>
+    <w:p>
+      <w:pPr>
+        <w:jc w:val="center"/>
+        <w:rPr>
+          <w:b/>
+          <w:bCs/>
+        </w:rPr>
+      </w:pPr>
+    </w:p>
+    <w:p>
+      <w:pPr>
+        <w:rPr>
+          <w:b/>
+          <w:bCs/>
+        </w:rPr>
+      </w:pPr>
+      <w:proofErr w:type="spellStart"/>
+      <w:r>
+        <w:rPr>
+          <w:b/>
+          <w:bCs/>
+        </w:rPr>
+        <w:t>DimDate</w:t>
+      </w:r>
+      <w:proofErr w:type="spellEnd"/>
+    </w:p>
+    <w:p>
+      <w:pPr>
+        <w:jc w:val="center"/>
+        <w:rPr>
+          <w:b/>
+          <w:bCs/>
+        </w:rPr>
+      </w:pPr>
+      <w:r>
+        <w:rPr>
+          <w:b/>
+          <w:bCs/>
+        </w:rPr>
+        <w:drawing>
+          <wp:inline distT="0" distB="0" distL="0" distR="0" wp14:anchorId="15C34F86" wp14:editId="03BB73D7">
+            <wp:extent cx="5731510" cy="2043430"/>
+            <wp:effectExtent l="0" t="0" r="2540" b="0"/>
+            <wp:docPr id="1463465551" name="Picture 1"/>
+            <wp:cNvGraphicFramePr>
+              <a:graphicFrameLocks xmlns:a="http://schemas.openxmlformats.org/drawingml/2006/main" noChangeAspect="1"/>
+            </wp:cNvGraphicFramePr>
+            <a:graphic xmlns:a="http://schemas.openxmlformats.org/drawingml/2006/main">
+              <a:graphicData uri="http://schemas.openxmlformats.org/drawingml/2006/picture">
+                <pic:pic xmlns:pic="http://schemas.openxmlformats.org/drawingml/2006/picture">
+                  <pic:nvPicPr>
+                    <pic:cNvPr id="1463465551" name=""/>
+                    <pic:cNvPicPr/>
+                  </pic:nvPicPr>
+                  <pic:blipFill>
+                    <a:blip r:embed="rId55"/>
+                    <a:stretch>
+                      <a:fillRect/>
+                    </a:stretch>
+                  </pic:blipFill>
+                  <pic:spPr>
+                    <a:xfrm>
+                      <a:off x="0" y="0"/>
+                      <a:ext cx="5731510" cy="2043430"/>
+                    </a:xfrm>
+                    <a:prstGeom prst="rect">
+                      <a:avLst/>
+                    </a:prstGeom>
+                  </pic:spPr>
+                </pic:pic>
+              </a:graphicData>
+            </a:graphic>
+          </wp:inline>
+        </w:drawing>
+      </w:r>
+    </w:p>
+    <w:p>
+      <w:pPr>
+        <w:jc w:val="center"/>
+        <w:rPr>
+          <w:b/>
+          <w:bCs/>
+        </w:rPr>
+      </w:pPr>
+      <w:r>
+        <w:rPr>
+          <w:b/>
+          <w:bCs/>
+        </w:rPr>
+        <w:lastRenderedPageBreak/>
+        <w:t>Data Modelling</w:t>
+      </w:r>
+    </w:p>
+    <w:p>
+      <w:pPr>
+        <w:jc w:val="center"/>
+        <w:rPr>
+          <w:b/>
+          <w:bCs/>
+        </w:rPr>
+      </w:pPr>
+      <w:r>
+        <w:rPr>
+          <w:b/>
+          <w:bCs/>
+        </w:rPr>
+        <w:t>,</w:t>
+      </w:r>
+    </w:p>
+    <w:p>
+      <w:pPr>
+        <w:jc w:val="center"/>
+        <w:rPr>
+          <w:b/>
+          <w:bCs/>
+        </w:rPr>
+      </w:pPr>
+      <w:r>
+        <w:rPr>
+          <w:b/>
+          <w:bCs/>
+        </w:rPr>
+        <w:drawing>
+          <wp:inline distT="0" distB="0" distL="0" distR="0" wp14:anchorId="77FC01C8" wp14:editId="0C41F4E0">
+            <wp:extent cx="4561668" cy="2442328"/>
+            <wp:effectExtent l="0" t="0" r="0" b="0"/>
+            <wp:docPr id="2076154022" name="Picture 1"/>
+            <wp:cNvGraphicFramePr>
+              <a:graphicFrameLocks xmlns:a="http://schemas.openxmlformats.org/drawingml/2006/main" noChangeAspect="1"/>
+            </wp:cNvGraphicFramePr>
+            <a:graphic xmlns:a="http://schemas.openxmlformats.org/drawingml/2006/main">
+              <a:graphicData uri="http://schemas.openxmlformats.org/drawingml/2006/picture">
+                <pic:pic xmlns:pic="http://schemas.openxmlformats.org/drawingml/2006/picture">
+                  <pic:nvPicPr>
+                    <pic:cNvPr id="2076154022" name=""/>
+                    <pic:cNvPicPr/>
+                  </pic:nvPicPr>
+                  <pic:blipFill rotWithShape="1">
+                    <a:blip r:embed="rId56"/>
+                    <a:srcRect b="14332"/>
+                    <a:stretch>
+                      <a:fillRect/>
+                    </a:stretch>
+                  </pic:blipFill>
+                  <pic:spPr bwMode="auto">
+                    <a:xfrm>
+                      <a:off x="0" y="0"/>
+                      <a:ext cx="4571237" cy="2447451"/>
+                    </a:xfrm>
+                    <a:prstGeom prst="rect">
+                      <a:avLst/>
+                    </a:prstGeom>
+                    <a:ln>
+                      <a:noFill/>
+                    </a:ln>
+                    <a:extLst>
+                      <a:ext uri="{53640926-AAD7-44D8-BBD7-CCE9431645EC}">
+                        <a14:shadowObscured xmlns:a14="http://schemas.microsoft.com/office/drawing/2010/main"/>
+                      </a:ext>
+                    </a:extLst>
+                  </pic:spPr>
+                </pic:pic>
+              </a:graphicData>
+            </a:graphic>
+          </wp:inline>
+        </w:drawing>
+      </w:r>
+    </w:p>
+    <w:p>
+      <w:pPr>
+        <w:rPr>
+          <w:b/>
+          <w:bCs/>
+        </w:rPr>
+      </w:pPr>
+    </w:p>
+    <w:p>
+      <w:pPr>
+        <w:pStyle w:val="ListParagraph"/>
+        <w:rPr>
+          <w:b/>
+          <w:bCs/>
+        </w:rPr>
+      </w:pPr>
+    </w:p>
+    <w:p>
+      <w:pPr>
+        <w:pStyle w:val="ListParagraph"/>
+        <w:rPr>
+          <w:b/>
+          <w:bCs/>
+        </w:rPr>
+      </w:pPr>
+      <w:r>
+        <w:rPr>
+          <w:b/>
+          <w:bCs/>
+        </w:rPr>
+        <w:t>Relationships</w:t>
+      </w:r>
+    </w:p>
+    <w:p>
+      <w:pPr>
+        <w:pStyle w:val="ListParagraph"/>
+        <w:rPr>
+          <w:b/>
+          <w:bCs/>
+        </w:rPr>
+      </w:pPr>
+      <w:r>
+        <w:rPr>
+          <w:b/>
+          <w:bCs/>
+        </w:rPr>
+        <w:drawing>
+          <wp:inline distT="0" distB="0" distL="0" distR="0" wp14:anchorId="5D971451" wp14:editId="7C5C4375">
+            <wp:extent cx="3321803" cy="2248639"/>
+            <wp:effectExtent l="0" t="0" r="0" b="0"/>
+            <wp:docPr id="1194796082" name="Picture 1"/>
+            <wp:cNvGraphicFramePr>
+              <a:graphicFrameLocks xmlns:a="http://schemas.openxmlformats.org/drawingml/2006/main" noChangeAspect="1"/>
+            </wp:cNvGraphicFramePr>
+            <a:graphic xmlns:a="http://schemas.openxmlformats.org/drawingml/2006/main">
+              <a:graphicData uri="http://schemas.openxmlformats.org/drawingml/2006/picture">
+                <pic:pic xmlns:pic="http://schemas.openxmlformats.org/drawingml/2006/picture">
+                  <pic:nvPicPr>
+                    <pic:cNvPr id="1194796082" name=""/>
+                    <pic:cNvPicPr/>
+                  </pic:nvPicPr>
+                  <pic:blipFill>
+                    <a:blip r:embed="rId57"/>
+                    <a:stretch>
+                      <a:fillRect/>
+                    </a:stretch>
+                  </pic:blipFill>
+                  <pic:spPr>
+                    <a:xfrm>
+                      <a:off x="0" y="0"/>
+                      <a:ext cx="3329950" cy="2254154"/>
+                    </a:xfrm>
+                    <a:prstGeom prst="rect">
+                      <a:avLst/>
+                    </a:prstGeom>
+                  </pic:spPr>
+                </pic:pic>
+              </a:graphicData>
+            </a:graphic>
+          </wp:inline>
+        </w:drawing>
+      </w:r>
+    </w:p>
+    <w:p>
+      <w:pPr>
+        <w:pStyle w:val="ListParagraph"/>
+        <w:rPr>
+          <w:b/>
+          <w:bCs/>
+        </w:rPr>
+      </w:pPr>
+    </w:p>
+    <w:p>
+      <w:pPr>
+        <w:pStyle w:val="ListParagraph"/>
+        <w:rPr>
+          <w:b/>
+          <w:bCs/>
+        </w:rPr>
+      </w:pPr>
+      <w:r>
+        <w:rPr>
+          <w:b/>
+          <w:bCs/>
+        </w:rPr>
+        <w:drawing>
+          <wp:inline distT="0" distB="0" distL="0" distR="0" wp14:anchorId="1E099094" wp14:editId="617113C1">
+            <wp:extent cx="3603812" cy="2434350"/>
+            <wp:effectExtent l="0" t="0" r="0" b="4445"/>
+            <wp:docPr id="846269090" name="Picture 1"/>
+            <wp:cNvGraphicFramePr>
+              <a:graphicFrameLocks xmlns:a="http://schemas.openxmlformats.org/drawingml/2006/main" noChangeAspect="1"/>
+            </wp:cNvGraphicFramePr>
+            <a:graphic xmlns:a="http://schemas.openxmlformats.org/drawingml/2006/main">
+              <a:graphicData uri="http://schemas.openxmlformats.org/drawingml/2006/picture">
+                <pic:pic xmlns:pic="http://schemas.openxmlformats.org/drawingml/2006/picture">
+                  <pic:nvPicPr>
+                    <pic:cNvPr id="846269090" name=""/>
+                    <pic:cNvPicPr/>
+                  </pic:nvPicPr>
+                  <pic:blipFill>
+                    <a:blip r:embed="rId58"/>
+                    <a:stretch>
+                      <a:fillRect/>
+                    </a:stretch>
+                  </pic:blipFill>
+                  <pic:spPr>
+                    <a:xfrm>
+                      <a:off x="0" y="0"/>
+                      <a:ext cx="3608584" cy="2437574"/>
+                    </a:xfrm>
+                    <a:prstGeom prst="rect">
+                      <a:avLst/>
+                    </a:prstGeom>
+                  </pic:spPr>
+                </pic:pic>
+              </a:graphicData>
+            </a:graphic>
+          </wp:inline>
+        </w:drawing>
+      </w:r>
+    </w:p>
+    <w:p>
+      <w:pPr>
+        <w:pStyle w:val="ListParagraph"/>
+        <w:rPr>
+          <w:b/>
+          <w:bCs/>
+        </w:rPr>
+      </w:pPr>
+    </w:p>
+    <w:p>
+      <w:pPr>
+        <w:pStyle w:val="ListParagraph"/>
+        <w:rPr>
+          <w:b/>
+          <w:bCs/>
+        </w:rPr>
+      </w:pPr>
+      <w:r>
+        <w:rPr>
+          <w:b/>
+          <w:bCs/>
+        </w:rPr>
+        <w:lastRenderedPageBreak/>
+        <w:drawing>
+          <wp:inline distT="0" distB="0" distL="0" distR="0" wp14:anchorId="323B5162" wp14:editId="1FE95189">
+            <wp:extent cx="3646842" cy="2479578"/>
+            <wp:effectExtent l="0" t="0" r="0" b="0"/>
+            <wp:docPr id="681917382" name="Picture 1"/>
+            <wp:cNvGraphicFramePr>
+              <a:graphicFrameLocks xmlns:a="http://schemas.openxmlformats.org/drawingml/2006/main" noChangeAspect="1"/>
+            </wp:cNvGraphicFramePr>
+            <a:graphic xmlns:a="http://schemas.openxmlformats.org/drawingml/2006/main">
+              <a:graphicData uri="http://schemas.openxmlformats.org/drawingml/2006/picture">
+                <pic:pic xmlns:pic="http://schemas.openxmlformats.org/drawingml/2006/picture">
+                  <pic:nvPicPr>
+                    <pic:cNvPr id="681917382" name=""/>
+                    <pic:cNvPicPr/>
+                  </pic:nvPicPr>
+                  <pic:blipFill>
+                    <a:blip r:embed="rId59"/>
+                    <a:stretch>
+                      <a:fillRect/>
+                    </a:stretch>
+                  </pic:blipFill>
+                  <pic:spPr>
+                    <a:xfrm>
+                      <a:off x="0" y="0"/>
+                      <a:ext cx="3651736" cy="2482906"/>
+                    </a:xfrm>
+                    <a:prstGeom prst="rect">
+                      <a:avLst/>
+                    </a:prstGeom>
+                  </pic:spPr>
+                </pic:pic>
+              </a:graphicData>
+            </a:graphic>
+          </wp:inline>
+        </w:drawing>
+      </w:r>
+    </w:p>
+    <w:p>
+      <w:pPr>
+        <w:pStyle w:val="ListParagraph"/>
+        <w:rPr>
+          <w:b/>
+          <w:bCs/>
+        </w:rPr>
+      </w:pPr>
+      <w:r>
+        <w:rPr>
+          <w:b/>
+          <w:bCs/>
+        </w:rPr>
+        <w:drawing>
+          <wp:inline distT="0" distB="0" distL="0" distR="0" wp14:anchorId="0B89EB94" wp14:editId="3BC3B317">
+            <wp:extent cx="3702442" cy="2528047"/>
+            <wp:effectExtent l="0" t="0" r="0" b="5715"/>
+            <wp:docPr id="1769298153" name="Picture 1"/>
+            <wp:cNvGraphicFramePr>
+              <a:graphicFrameLocks xmlns:a="http://schemas.openxmlformats.org/drawingml/2006/main" noChangeAspect="1"/>
+            </wp:cNvGraphicFramePr>
+            <a:graphic xmlns:a="http://schemas.openxmlformats.org/drawingml/2006/main">
+              <a:graphicData uri="http://schemas.openxmlformats.org/drawingml/2006/picture">
+                <pic:pic xmlns:pic="http://schemas.openxmlformats.org/drawingml/2006/picture">
+                  <pic:nvPicPr>
+                    <pic:cNvPr id="1769298153" name=""/>
+                    <pic:cNvPicPr/>
+                  </pic:nvPicPr>
+                  <pic:blipFill>
+                    <a:blip r:embed="rId60"/>
+                    <a:stretch>
+                      <a:fillRect/>
+                    </a:stretch>
+                  </pic:blipFill>
+                  <pic:spPr>
+                    <a:xfrm>
+                      <a:off x="0" y="0"/>
+                      <a:ext cx="3707258" cy="2531335"/>
+                    </a:xfrm>
+                    <a:prstGeom prst="rect">
+                      <a:avLst/>
+                    </a:prstGeom>
+                  </pic:spPr>
+                </pic:pic>
+              </a:graphicData>
+            </a:graphic>
+          </wp:inline>
+        </w:drawing>
+      </w:r>
+    </w:p>
+    <w:p>
+      <w:pPr>
+        <w:pStyle w:val="ListParagraph"/>
+        <w:rPr>
+          <w:b/>
+          <w:bCs/>
+        </w:rPr>
+      </w:pPr>
+    </w:p>
+    <w:p>
+      <w:pPr>
+        <w:pStyle w:val="ListParagraph"/>
+        <w:rPr>
+          <w:b/>
+          <w:bCs/>
+        </w:rPr>
+      </w:pPr>
+      <w:r>
+        <w:rPr>
+          <w:b/>
+          <w:bCs/>
+        </w:rPr>
+        <w:drawing>
+          <wp:inline distT="0" distB="0" distL="0" distR="0" wp14:anchorId="38223427" wp14:editId="3DE5C113">
+            <wp:extent cx="3646805" cy="2460159"/>
+            <wp:effectExtent l="0" t="0" r="0" b="0"/>
+            <wp:docPr id="1559885764" name="Picture 1"/>
+            <wp:cNvGraphicFramePr>
+              <a:graphicFrameLocks xmlns:a="http://schemas.openxmlformats.org/drawingml/2006/main" noChangeAspect="1"/>
+            </wp:cNvGraphicFramePr>
+            <a:graphic xmlns:a="http://schemas.openxmlformats.org/drawingml/2006/main">
+              <a:graphicData uri="http://schemas.openxmlformats.org/drawingml/2006/picture">
+                <pic:pic xmlns:pic="http://schemas.openxmlformats.org/drawingml/2006/picture">
+                  <pic:nvPicPr>
+                    <pic:cNvPr id="1559885764" name=""/>
+                    <pic:cNvPicPr/>
+                  </pic:nvPicPr>
+                  <pic:blipFill>
+                    <a:blip r:embed="rId61"/>
+                    <a:stretch>
+                      <a:fillRect/>
+                    </a:stretch>
+                  </pic:blipFill>
+                  <pic:spPr>
+                    <a:xfrm>
+                      <a:off x="0" y="0"/>
+                      <a:ext cx="3664396" cy="2472026"/>
+                    </a:xfrm>
+                    <a:prstGeom prst="rect">
+                      <a:avLst/>
+                    </a:prstGeom>
+                  </pic:spPr>
+                </pic:pic>
+              </a:graphicData>
+            </a:graphic>
+          </wp:inline>
+        </w:drawing>
+      </w:r>
+    </w:p>
+    <w:p>
+      <w:pPr>
+        <w:pStyle w:val="ListParagraph"/>
+        <w:rPr>
+          <w:b/>
+          <w:bCs/>
+        </w:rPr>
+      </w:pPr>
+    </w:p>
+    <w:p>
+      <w:pPr>
+        <w:pStyle w:val="ListParagraph"/>
+        <w:rPr>
+          <w:b/>
+          <w:bCs/>
+        </w:rPr>
+      </w:pPr>
+      <w:r>
+        <w:rPr>
+          <w:b/>
+          <w:bCs/>
+        </w:rPr>
+        <w:lastRenderedPageBreak/>
+        <w:drawing>
+          <wp:inline distT="0" distB="0" distL="0" distR="0" wp14:anchorId="2A2058B7" wp14:editId="08A14A26">
+            <wp:extent cx="4079900" cy="2840019"/>
+            <wp:effectExtent l="0" t="0" r="0" b="0"/>
+            <wp:docPr id="1475656360" name="Picture 1"/>
+            <wp:cNvGraphicFramePr>
+              <a:graphicFrameLocks xmlns:a="http://schemas.openxmlformats.org/drawingml/2006/main" noChangeAspect="1"/>
+            </wp:cNvGraphicFramePr>
+            <a:graphic xmlns:a="http://schemas.openxmlformats.org/drawingml/2006/main">
+              <a:graphicData uri="http://schemas.openxmlformats.org/drawingml/2006/picture">
+                <pic:pic xmlns:pic="http://schemas.openxmlformats.org/drawingml/2006/picture">
+                  <pic:nvPicPr>
+                    <pic:cNvPr id="1475656360" name=""/>
+                    <pic:cNvPicPr/>
+                  </pic:nvPicPr>
+                  <pic:blipFill>
+                    <a:blip r:embed="rId62"/>
+                    <a:stretch>
+                      <a:fillRect/>
+                    </a:stretch>
+                  </pic:blipFill>
+                  <pic:spPr>
+                    <a:xfrm>
+                      <a:off x="0" y="0"/>
+                      <a:ext cx="4090072" cy="2847100"/>
+                    </a:xfrm>
+                    <a:prstGeom prst="rect">
+                      <a:avLst/>
+                    </a:prstGeom>
+                  </pic:spPr>
+                </pic:pic>
+              </a:graphicData>
+            </a:graphic>
+          </wp:inline>
+        </w:drawing>
+      </w:r>
+    </w:p>
+    <w:p>
+      <w:pPr>
+        <w:pStyle w:val="ListParagraph"/>
+        <w:rPr>
+          <w:b/>
+          <w:bCs/>
+        </w:rPr>
+      </w:pPr>
+      <w:r>
+        <w:rPr>
+          <w:b/>
+          <w:bCs/>
+        </w:rPr>
+        <w:drawing>
+          <wp:inline distT="0" distB="0" distL="0" distR="0" wp14:anchorId="3DDF9008" wp14:editId="5BB011B3">
+            <wp:extent cx="4339248" cy="2969111"/>
+            <wp:effectExtent l="0" t="0" r="4445" b="3175"/>
+            <wp:docPr id="713523222" name="Picture 1"/>
+            <wp:cNvGraphicFramePr>
+              <a:graphicFrameLocks xmlns:a="http://schemas.openxmlformats.org/drawingml/2006/main" noChangeAspect="1"/>
+            </wp:cNvGraphicFramePr>
+            <a:graphic xmlns:a="http://schemas.openxmlformats.org/drawingml/2006/main">
+              <a:graphicData uri="http://schemas.openxmlformats.org/drawingml/2006/picture">
+                <pic:pic xmlns:pic="http://schemas.openxmlformats.org/drawingml/2006/picture">
+                  <pic:nvPicPr>
+                    <pic:cNvPr id="713523222" name=""/>
+                    <pic:cNvPicPr/>
+                  </pic:nvPicPr>
+                  <pic:blipFill>
+                    <a:blip r:embed="rId63"/>
+                    <a:stretch>
+                      <a:fillRect/>
+                    </a:stretch>
+                  </pic:blipFill>
+                  <pic:spPr>
+                    <a:xfrm>
+                      <a:off x="0" y="0"/>
+                      <a:ext cx="4347735" cy="2974918"/>
+                    </a:xfrm>
+                    <a:prstGeom prst="rect">
+                      <a:avLst/>
+                    </a:prstGeom>
+                  </pic:spPr>
+                </pic:pic>
+              </a:graphicData>
+            </a:graphic>
+          </wp:inline>
+        </w:drawing>
+      </w:r>
+    </w:p>
+    <w:p>
+      <w:pPr>
+        <w:pStyle w:val="ListParagraph"/>
+        <w:rPr>
+          <w:b/>
+          <w:bCs/>
+        </w:rPr>
+      </w:pPr>
+    </w:p>
+    <w:p>
+      <w:pPr>
+        <w:pStyle w:val="ListParagraph"/>
+        <w:rPr>
+          <w:b/>
+          <w:bCs/>
+        </w:rPr>
+      </w:pPr>
+    </w:p>
+    <w:p>
+      <w:pPr>
+        <w:rPr>
+          <w:b/>
+          <w:bCs/>
+        </w:rPr>
+      </w:pPr>
+      <w:r>
+        <w:rPr>
+          <w:b/>
+          <w:bCs/>
+        </w:rPr>
+        <w:br w:type="page"/>
+      </w:r>
+    </w:p>
+    <w:p>
+      <w:pPr>
+        <w:pStyle w:val="ListParagraph"/>
+        <w:jc w:val="center"/>
+        <w:rPr>
+          <w:b/>
+          <w:bCs/>
+        </w:rPr>
+      </w:pPr>
+      <w:r>
+        <w:rPr>
+          <w:b/>
+          <w:bCs/>
+        </w:rPr>
+        <w:lastRenderedPageBreak/>
+        <w:t>DAX Measures and Calculated Columns</w:t>
+      </w:r>
+    </w:p>
+    <w:p>
+      <w:pPr>
+        <w:pStyle w:val="ListParagraph"/>
+        <w:rPr>
+          <w:b/>
+          <w:bCs/>
+        </w:rPr>
+      </w:pPr>
+      <w:r>
+        <w:rPr>
+          <w:b/>
+          <w:bCs/>
+        </w:rPr>
+        <w:drawing>
+          <wp:inline distT="0" distB="0" distL="0" distR="0" wp14:anchorId="7FD6FE46" wp14:editId="46BD7E6E">
+            <wp:extent cx="4324349" cy="314325"/>
+            <wp:effectExtent l="0" t="0" r="635" b="0"/>
+            <wp:docPr id="1102159799" name="Picture 1"/>
+            <wp:cNvGraphicFramePr>
+              <a:graphicFrameLocks xmlns:a="http://schemas.openxmlformats.org/drawingml/2006/main" noChangeAspect="1"/>
+            </wp:cNvGraphicFramePr>
+            <a:graphic xmlns:a="http://schemas.openxmlformats.org/drawingml/2006/main">
+              <a:graphicData uri="http://schemas.openxmlformats.org/drawingml/2006/picture">
+                <pic:pic xmlns:pic="http://schemas.openxmlformats.org/drawingml/2006/picture">
+                  <pic:nvPicPr>
+                    <pic:cNvPr id="1102159799" name=""/>
+                    <pic:cNvPicPr/>
+                  </pic:nvPicPr>
+                  <pic:blipFill>
+                    <a:blip r:embed="rId64"/>
+                    <a:stretch>
+                      <a:fillRect/>
+                    </a:stretch>
+                  </pic:blipFill>
+                  <pic:spPr>
+                    <a:xfrm>
+                      <a:off x="0" y="0"/>
+                      <a:ext cx="4479698" cy="325617"/>
+                    </a:xfrm>
+                    <a:prstGeom prst="rect">
+                      <a:avLst/>
+                    </a:prstGeom>
+                  </pic:spPr>
+                </pic:pic>
+              </a:graphicData>
+            </a:graphic>
+          </wp:inline>
+        </w:drawing>
+      </w:r>
+    </w:p>
+    <w:p>
+      <w:pPr>
+        <w:pStyle w:val="ListParagraph"/>
+        <w:rPr>
+          <w:b/>
+          <w:bCs/>
+        </w:rPr>
+      </w:pPr>
+    </w:p>
+    <w:p>
+      <w:pPr>
+        <w:pStyle w:val="ListParagraph"/>
+        <w:rPr>
+          <w:b/>
+          <w:bCs/>
+        </w:rPr>
+      </w:pPr>
+      <w:r>
+        <w:rPr>
+          <w:b/>
+          <w:bCs/>
+        </w:rPr>
+        <w:drawing>
+          <wp:inline distT="0" distB="0" distL="0" distR="0" wp14:anchorId="249B35A5" wp14:editId="7165BCA7">
+            <wp:extent cx="5468113" cy="295316"/>
+            <wp:effectExtent l="0" t="0" r="0" b="9525"/>
+            <wp:docPr id="174901667" name="Picture 1"/>
+            <wp:cNvGraphicFramePr>
+              <a:graphicFrameLocks xmlns:a="http://schemas.openxmlformats.org/drawingml/2006/main" noChangeAspect="1"/>
+            </wp:cNvGraphicFramePr>
+            <a:graphic xmlns:a="http://schemas.openxmlformats.org/drawingml/2006/main">
+              <a:graphicData uri="http://schemas.openxmlformats.org/drawingml/2006/picture">
+                <pic:pic xmlns:pic="http://schemas.openxmlformats.org/drawingml/2006/picture">
+                  <pic:nvPicPr>
+                    <pic:cNvPr id="174901667" name=""/>
+                    <pic:cNvPicPr/>
+                  </pic:nvPicPr>
+                  <pic:blipFill>
+                    <a:blip r:embed="rId65"/>
+                    <a:stretch>
+                      <a:fillRect/>
+                    </a:stretch>
+                  </pic:blipFill>
+                  <pic:spPr>
+                    <a:xfrm>
+                      <a:off x="0" y="0"/>
+                      <a:ext cx="5468113" cy="295316"/>
+                    </a:xfrm>
+                    <a:prstGeom prst="rect">
+                      <a:avLst/>
+                    </a:prstGeom>
+                  </pic:spPr>
+                </pic:pic>
+              </a:graphicData>
+            </a:graphic>
+          </wp:inline>
+        </w:drawing>
+      </w:r>
+    </w:p>
+    <w:p>
+      <w:pPr>
+        <w:pStyle w:val="ListParagraph"/>
+        <w:rPr>
+          <w:b/>
+          <w:bCs/>
+        </w:rPr>
+      </w:pPr>
+    </w:p>
+    <w:p>
+      <w:pPr>
+        <w:pStyle w:val="ListParagraph"/>
+        <w:rPr>
+          <w:b/>
+          <w:bCs/>
+        </w:rPr>
+      </w:pPr>
+      <w:r>
+        <w:rPr>
+          <w:b/>
+          <w:bCs/>
+        </w:rPr>
+        <w:drawing>
+          <wp:inline distT="0" distB="0" distL="0" distR="0" wp14:anchorId="461F849C" wp14:editId="422F3D1F">
+            <wp:extent cx="5306165" cy="390580"/>
+            <wp:effectExtent l="0" t="0" r="0" b="9525"/>
+            <wp:docPr id="261293235" name="Picture 1"/>
+            <wp:cNvGraphicFramePr>
+              <a:graphicFrameLocks xmlns:a="http://schemas.openxmlformats.org/drawingml/2006/main" noChangeAspect="1"/>
+            </wp:cNvGraphicFramePr>
+            <a:graphic xmlns:a="http://schemas.openxmlformats.org/drawingml/2006/main">
+              <a:graphicData uri="http://schemas.openxmlformats.org/drawingml/2006/picture">
+                <pic:pic xmlns:pic="http://schemas.openxmlformats.org/drawingml/2006/picture">
+                  <pic:nvPicPr>
+                    <pic:cNvPr id="261293235" name=""/>
+                    <pic:cNvPicPr/>
+                  </pic:nvPicPr>
+                  <pic:blipFill>
+                    <a:blip r:embed="rId66"/>
+                    <a:stretch>
+                      <a:fillRect/>
+                    </a:stretch>
+                  </pic:blipFill>
+                  <pic:spPr>
+                    <a:xfrm>
+                      <a:off x="0" y="0"/>
+                      <a:ext cx="5306165" cy="390580"/>
+                    </a:xfrm>
+                    <a:prstGeom prst="rect">
+                      <a:avLst/>
+                    </a:prstGeom>
+                  </pic:spPr>
+                </pic:pic>
+              </a:graphicData>
+            </a:graphic>
+          </wp:inline>
+        </w:drawing>
+      </w:r>
+    </w:p>
+    <w:p>
+      <w:pPr>
+        <w:pStyle w:val="ListParagraph"/>
+        <w:rPr>
+          <w:b/>
+          <w:bCs/>
+        </w:rPr>
+      </w:pPr>
+    </w:p>
+    <w:p>
+      <w:pPr>
+        <w:pStyle w:val="ListParagraph"/>
+        <w:rPr>
+          <w:b/>
+          <w:bCs/>
+        </w:rPr>
+      </w:pPr>
+      <w:r>
+        <w:rPr>
+          <w:b/>
+          <w:bCs/>
+        </w:rPr>
+        <w:drawing>
+          <wp:inline distT="0" distB="0" distL="0" distR="0" wp14:anchorId="13D0D081" wp14:editId="4CDBB376">
+            <wp:extent cx="4239217" cy="552527"/>
+            <wp:effectExtent l="0" t="0" r="9525" b="0"/>
+            <wp:docPr id="1676800649" name="Picture 1"/>
+            <wp:cNvGraphicFramePr>
+              <a:graphicFrameLocks xmlns:a="http://schemas.openxmlformats.org/drawingml/2006/main" noChangeAspect="1"/>
+            </wp:cNvGraphicFramePr>
+            <a:graphic xmlns:a="http://schemas.openxmlformats.org/drawingml/2006/main">
+              <a:graphicData uri="http://schemas.openxmlformats.org/drawingml/2006/picture">
+                <pic:pic xmlns:pic="http://schemas.openxmlformats.org/drawingml/2006/picture">
+                  <pic:nvPicPr>
+                    <pic:cNvPr id="1676800649" name=""/>
+                    <pic:cNvPicPr/>
+                  </pic:nvPicPr>
+                  <pic:blipFill>
+                    <a:blip r:embed="rId67"/>
+                    <a:stretch>
+                      <a:fillRect/>
+                    </a:stretch>
+                  </pic:blipFill>
+                  <pic:spPr>
+                    <a:xfrm>
+                      <a:off x="0" y="0"/>
+                      <a:ext cx="4239217" cy="552527"/>
+                    </a:xfrm>
+                    <a:prstGeom prst="rect">
+                      <a:avLst/>
+                    </a:prstGeom>
+                  </pic:spPr>
+                </pic:pic>
+              </a:graphicData>
+            </a:graphic>
+          </wp:inline>
+        </w:drawing>
+      </w:r>
+    </w:p>
+    <w:p>
+      <w:pPr>
+        <w:pStyle w:val="ListParagraph"/>
+        <w:rPr>
+          <w:b/>
+          <w:bCs/>
+        </w:rPr>
+      </w:pPr>
+    </w:p>
+    <w:p>
+      <w:pPr>
+        <w:pStyle w:val="ListParagraph"/>
+        <w:rPr>
+          <w:b/>
+          <w:bCs/>
+        </w:rPr>
+      </w:pPr>
+      <w:r>
+        <w:rPr>
+          <w:b/>
+          <w:bCs/>
+        </w:rPr>
+        <w:drawing>
+          <wp:inline distT="0" distB="0" distL="0" distR="0" wp14:anchorId="089FC995" wp14:editId="750508A1">
+            <wp:extent cx="5668166" cy="400106"/>
+            <wp:effectExtent l="0" t="0" r="0" b="0"/>
+            <wp:docPr id="1437468528" name="Picture 1"/>
+            <wp:cNvGraphicFramePr>
+              <a:graphicFrameLocks xmlns:a="http://schemas.openxmlformats.org/drawingml/2006/main" noChangeAspect="1"/>
+            </wp:cNvGraphicFramePr>
+            <a:graphic xmlns:a="http://schemas.openxmlformats.org/drawingml/2006/main">
+              <a:graphicData uri="http://schemas.openxmlformats.org/drawingml/2006/picture">
+                <pic:pic xmlns:pic="http://schemas.openxmlformats.org/drawingml/2006/picture">
+                  <pic:nvPicPr>
+                    <pic:cNvPr id="1437468528" name=""/>
+                    <pic:cNvPicPr/>
+                  </pic:nvPicPr>
+                  <pic:blipFill>
+                    <a:blip r:embed="rId68"/>
+                    <a:stretch>
+                      <a:fillRect/>
+                    </a:stretch>
+                  </pic:blipFill>
+                  <pic:spPr>
+                    <a:xfrm>
+                      <a:off x="0" y="0"/>
+                      <a:ext cx="5668166" cy="400106"/>
+                    </a:xfrm>
+                    <a:prstGeom prst="rect">
+                      <a:avLst/>
+                    </a:prstGeom>
+                  </pic:spPr>
+                </pic:pic>
+              </a:graphicData>
+            </a:graphic>
+          </wp:inline>
+        </w:drawing>
+      </w:r>
+    </w:p>
+    <w:p>
+      <w:pPr>
+        <w:pStyle w:val="ListParagraph"/>
+        <w:rPr>
+          <w:b/>
+          <w:bCs/>
+        </w:rPr>
+      </w:pPr>
+    </w:p>
+    <w:p>
+      <w:pPr>
+        <w:pStyle w:val="ListParagraph"/>
+        <w:rPr>
+          <w:b/>
+          <w:bCs/>
+        </w:rPr>
+      </w:pPr>
+    </w:p>
+    <w:p>
+      <w:pPr>
+        <w:pStyle w:val="ListParagraph"/>
+        <w:rPr>
+          <w:b/>
+          <w:bCs/>
+        </w:rPr>
+      </w:pPr>
+      <w:r>
+        <w:rPr>
+          <w:b/>
+          <w:bCs/>
+        </w:rPr>
+        <w:drawing>
+          <wp:inline distT="0" distB="0" distL="0" distR="0" wp14:anchorId="1E01BD52" wp14:editId="43C8C00A">
+            <wp:extent cx="5239481" cy="371527"/>
+            <wp:effectExtent l="0" t="0" r="0" b="9525"/>
+            <wp:docPr id="2103260680" name="Picture 1"/>
+            <wp:cNvGraphicFramePr>
+              <a:graphicFrameLocks xmlns:a="http://schemas.openxmlformats.org/drawingml/2006/main" noChangeAspect="1"/>
+            </wp:cNvGraphicFramePr>
+            <a:graphic xmlns:a="http://schemas.openxmlformats.org/drawingml/2006/main">
+              <a:graphicData uri="http://schemas.openxmlformats.org/drawingml/2006/picture">
+                <pic:pic xmlns:pic="http://schemas.openxmlformats.org/drawingml/2006/picture">
+                  <pic:nvPicPr>
+                    <pic:cNvPr id="2103260680" name=""/>
+                    <pic:cNvPicPr/>
+                  </pic:nvPicPr>
+                  <pic:blipFill>
+                    <a:blip r:embed="rId69"/>
+                    <a:stretch>
+                      <a:fillRect/>
+                    </a:stretch>
+                  </pic:blipFill>
+                  <pic:spPr>
+                    <a:xfrm>
+                      <a:off x="0" y="0"/>
+                      <a:ext cx="5239481" cy="371527"/>
+                    </a:xfrm>
+                    <a:prstGeom prst="rect">
+                      <a:avLst/>
+                    </a:prstGeom>
+                  </pic:spPr>
+                </pic:pic>
+              </a:graphicData>
+            </a:graphic>
+          </wp:inline>
+        </w:drawing>
+      </w:r>
+    </w:p>
+    <w:p>
+      <w:pPr>
+        <w:pStyle w:val="ListParagraph"/>
+        <w:rPr>
+          <w:b/>
+          <w:bCs/>
+        </w:rPr>
+      </w:pPr>
+    </w:p>
+    <w:p>
+      <w:pPr>
+        <w:pStyle w:val="ListParagraph"/>
+        <w:rPr>
+          <w:b/>
+          <w:bCs/>
+        </w:rPr>
+      </w:pPr>
+      <w:r>
+        <w:rPr>
+          <w:b/>
+          <w:bCs/>
+        </w:rPr>
+        <w:drawing>
+          <wp:inline distT="0" distB="0" distL="0" distR="0" wp14:anchorId="6126D3F0" wp14:editId="299D8956">
+            <wp:extent cx="4248743" cy="571580"/>
+            <wp:effectExtent l="0" t="0" r="0" b="0"/>
+            <wp:docPr id="678711457" name="Picture 1"/>
+            <wp:cNvGraphicFramePr>
+              <a:graphicFrameLocks xmlns:a="http://schemas.openxmlformats.org/drawingml/2006/main" noChangeAspect="1"/>
+            </wp:cNvGraphicFramePr>
+            <a:graphic xmlns:a="http://schemas.openxmlformats.org/drawingml/2006/main">
+              <a:graphicData uri="http://schemas.openxmlformats.org/drawingml/2006/picture">
+                <pic:pic xmlns:pic="http://schemas.openxmlformats.org/drawingml/2006/picture">
+                  <pic:nvPicPr>
+                    <pic:cNvPr id="678711457" name=""/>
+                    <pic:cNvPicPr/>
+                  </pic:nvPicPr>
+                  <pic:blipFill>
+                    <a:blip r:embed="rId70"/>
+                    <a:stretch>
+                      <a:fillRect/>
+                    </a:stretch>
+                  </pic:blipFill>
+                  <pic:spPr>
+                    <a:xfrm>
+                      <a:off x="0" y="0"/>
+                      <a:ext cx="4248743" cy="571580"/>
+                    </a:xfrm>
+                    <a:prstGeom prst="rect">
+                      <a:avLst/>
+                    </a:prstGeom>
+                  </pic:spPr>
+                </pic:pic>
+              </a:graphicData>
+            </a:graphic>
+          </wp:inline>
+        </w:drawing>
+      </w:r>
+    </w:p>
+    <w:p>
+      <w:pPr>
+        <w:pStyle w:val="ListParagraph"/>
+        <w:rPr>
+          <w:b/>
+          <w:bCs/>
+        </w:rPr>
+      </w:pPr>
+    </w:p>
+    <w:p>
+      <w:pPr>
+        <w:pStyle w:val="ListParagraph"/>
+        <w:rPr>
+          <w:b/>
+          <w:bCs/>
+        </w:rPr>
+      </w:pPr>
+      <w:r>
+        <w:rPr>
+          <w:b/>
+          <w:bCs/>
+        </w:rPr>
+        <w:drawing>
+          <wp:inline distT="0" distB="0" distL="0" distR="0" wp14:anchorId="4BAE4517" wp14:editId="779D5AA5">
+            <wp:extent cx="4829849" cy="1343212"/>
+            <wp:effectExtent l="0" t="0" r="8890" b="9525"/>
+            <wp:docPr id="570483953" name="Picture 1"/>
+            <wp:cNvGraphicFramePr>
+              <a:graphicFrameLocks xmlns:a="http://schemas.openxmlformats.org/drawingml/2006/main" noChangeAspect="1"/>
+            </wp:cNvGraphicFramePr>
+            <a:graphic xmlns:a="http://schemas.openxmlformats.org/drawingml/2006/main">
+              <a:graphicData uri="http://schemas.openxmlformats.org/drawingml/2006/picture">
+                <pic:pic xmlns:pic="http://schemas.openxmlformats.org/drawingml/2006/picture">
+                  <pic:nvPicPr>
+                    <pic:cNvPr id="570483953" name=""/>
+                    <pic:cNvPicPr/>
+                  </pic:nvPicPr>
+                  <pic:blipFill>
+                    <a:blip r:embed="rId71"/>
+                    <a:stretch>
+                      <a:fillRect/>
+                    </a:stretch>
+                  </pic:blipFill>
+                  <pic:spPr>
+                    <a:xfrm>
+                      <a:off x="0" y="0"/>
+                      <a:ext cx="4829849" cy="1343212"/>
+                    </a:xfrm>
+                    <a:prstGeom prst="rect">
+                      <a:avLst/>
+                    </a:prstGeom>
+                  </pic:spPr>
+                </pic:pic>
+              </a:graphicData>
+            </a:graphic>
+          </wp:inline>
+        </w:drawing>
+      </w:r>
+    </w:p>
+    <w:p>
+      <w:pPr>
+        <w:pStyle w:val="ListParagraph"/>
+        <w:rPr>
+          <w:b/>
+          <w:bCs/>
+        </w:rPr>
+      </w:pPr>
+    </w:p>
+    <w:p>
+      <w:pPr>
+        <w:pStyle w:val="ListParagraph"/>
+        <w:rPr>
+          <w:b/>
+          <w:bCs/>
+        </w:rPr>
+      </w:pPr>
+    </w:p>
+    <w:p>
+      <w:pPr>
+        <w:pStyle w:val="ListParagraph"/>
+        <w:rPr>
+          <w:b/>
+          <w:bCs/>
+        </w:rPr>
+      </w:pPr>
+      <w:r>
+        <w:rPr>
+          <w:b/>
+          <w:bCs/>
+        </w:rPr>
+        <w:drawing>
+          <wp:inline distT="0" distB="0" distL="0" distR="0" wp14:anchorId="76E36FB1" wp14:editId="0E40D828">
+            <wp:extent cx="5287113" cy="1648055"/>
+            <wp:effectExtent l="0" t="0" r="8890" b="9525"/>
+            <wp:docPr id="462785240" name="Picture 1"/>
+            <wp:cNvGraphicFramePr>
+              <a:graphicFrameLocks xmlns:a="http://schemas.openxmlformats.org/drawingml/2006/main" noChangeAspect="1"/>
+            </wp:cNvGraphicFramePr>
+            <a:graphic xmlns:a="http://schemas.openxmlformats.org/drawingml/2006/main">
+              <a:graphicData uri="http://schemas.openxmlformats.org/drawingml/2006/picture">
+                <pic:pic xmlns:pic="http://schemas.openxmlformats.org/drawingml/2006/picture">
+                  <pic:nvPicPr>
+                    <pic:cNvPr id="462785240" name=""/>
+                    <pic:cNvPicPr/>
+                  </pic:nvPicPr>
+                  <pic:blipFill>
+                    <a:blip r:embed="rId72"/>
+                    <a:stretch>
+                      <a:fillRect/>
+                    </a:stretch>
+                  </pic:blipFill>
+                  <pic:spPr>
+                    <a:xfrm>
+                      <a:off x="0" y="0"/>
+                      <a:ext cx="5287113" cy="1648055"/>
+                    </a:xfrm>
+                    <a:prstGeom prst="rect">
+                      <a:avLst/>
+                    </a:prstGeom>
+                  </pic:spPr>
+                </pic:pic>
+              </a:graphicData>
+            </a:graphic>
+          </wp:inline>
+        </w:drawing>
+      </w:r>
+    </w:p>
+    <w:p>
+      <w:pPr>
+        <w:pStyle w:val="ListParagraph"/>
+        <w:rPr>
+          <w:b/>
+          <w:bCs/>
+        </w:rPr>
+      </w:pPr>
+    </w:p>
+    <w:p>
+      <w:pPr>
+        <w:pStyle w:val="ListParagraph"/>
+        <w:rPr>
+          <w:b/>
+          <w:bCs/>
+        </w:rPr>
+      </w:pPr>
+      <w:r>
+        <w:rPr>
+          <w:b/>
+          <w:bCs/>
+        </w:rPr>
+        <w:lastRenderedPageBreak/>
+        <w:drawing>
+          <wp:inline distT="0" distB="0" distL="0" distR="0" wp14:anchorId="0CE8ABB8" wp14:editId="049BFDEF">
+            <wp:extent cx="5731510" cy="1146175"/>
+            <wp:effectExtent l="0" t="0" r="2540" b="0"/>
+            <wp:docPr id="980249213" name="Picture 1"/>
+            <wp:cNvGraphicFramePr>
+              <a:graphicFrameLocks xmlns:a="http://schemas.openxmlformats.org/drawingml/2006/main" noChangeAspect="1"/>
+            </wp:cNvGraphicFramePr>
+            <a:graphic xmlns:a="http://schemas.openxmlformats.org/drawingml/2006/main">
+              <a:graphicData uri="http://schemas.openxmlformats.org/drawingml/2006/picture">
+                <pic:pic xmlns:pic="http://schemas.openxmlformats.org/drawingml/2006/picture">
+                  <pic:nvPicPr>
+                    <pic:cNvPr id="980249213" name=""/>
+                    <pic:cNvPicPr/>
+                  </pic:nvPicPr>
+                  <pic:blipFill>
+                    <a:blip r:embed="rId73"/>
+                    <a:stretch>
+                      <a:fillRect/>
+                    </a:stretch>
+                  </pic:blipFill>
+                  <pic:spPr>
+                    <a:xfrm>
+                      <a:off x="0" y="0"/>
+                      <a:ext cx="5731510" cy="1146175"/>
+                    </a:xfrm>
+                    <a:prstGeom prst="rect">
+                      <a:avLst/>
+                    </a:prstGeom>
+                  </pic:spPr>
+                </pic:pic>
+              </a:graphicData>
+            </a:graphic>
+          </wp:inline>
+        </w:drawing>
+      </w:r>
+    </w:p>
+    <w:p>
+      <w:pPr>
+        <w:pStyle w:val="ListParagraph"/>
+        <w:rPr>
+          <w:b/>
+          <w:bCs/>
+        </w:rPr>
+      </w:pPr>
+    </w:p>
+    <w:p>
+      <w:pPr>
+        <w:pStyle w:val="ListParagraph"/>
+        <w:rPr>
+          <w:b/>
+          <w:bCs/>
+        </w:rPr>
+      </w:pPr>
+      <w:r>
+        <w:rPr>
+          <w:b/>
+          <w:bCs/>
+        </w:rPr>
+        <w:drawing>
+          <wp:inline distT="0" distB="0" distL="0" distR="0" wp14:anchorId="50F26648" wp14:editId="7E4ABB95">
+            <wp:extent cx="5630061" cy="2086266"/>
+            <wp:effectExtent l="0" t="0" r="8890" b="9525"/>
+            <wp:docPr id="347144444" name="Picture 1"/>
+            <wp:cNvGraphicFramePr>
+              <a:graphicFrameLocks xmlns:a="http://schemas.openxmlformats.org/drawingml/2006/main" noChangeAspect="1"/>
+            </wp:cNvGraphicFramePr>
+            <a:graphic xmlns:a="http://schemas.openxmlformats.org/drawingml/2006/main">
+              <a:graphicData uri="http://schemas.openxmlformats.org/drawingml/2006/picture">
+                <pic:pic xmlns:pic="http://schemas.openxmlformats.org/drawingml/2006/picture">
+                  <pic:nvPicPr>
+                    <pic:cNvPr id="347144444" name=""/>
+                    <pic:cNvPicPr/>
+                  </pic:nvPicPr>
+                  <pic:blipFill>
+                    <a:blip r:embed="rId74"/>
+                    <a:stretch>
+                      <a:fillRect/>
+                    </a:stretch>
+                  </pic:blipFill>
+                  <pic:spPr>
+                    <a:xfrm>
+                      <a:off x="0" y="0"/>
+                      <a:ext cx="5630061" cy="2086266"/>
+                    </a:xfrm>
+                    <a:prstGeom prst="rect">
+                      <a:avLst/>
+                    </a:prstGeom>
+                  </pic:spPr>
+                </pic:pic>
+              </a:graphicData>
+            </a:graphic>
+          </wp:inline>
+        </w:drawing>
+      </w:r>
+    </w:p>
+    <w:p>
+      <w:pPr>
+        <w:pStyle w:val="ListParagraph"/>
+        <w:rPr>
+          <w:b/>
+          <w:bCs/>
+        </w:rPr>
+      </w:pPr>
+    </w:p>
+    <w:p>
+      <w:pPr>
+        <w:pStyle w:val="ListParagraph"/>
+        <w:rPr>
+          <w:b/>
+          <w:bCs/>
+        </w:rPr>
+      </w:pPr>
+      <w:r>
+        <w:rPr>
+          <w:b/>
+          <w:bCs/>
+        </w:rPr>
+        <w:drawing>
+          <wp:inline distT="0" distB="0" distL="0" distR="0" wp14:anchorId="20BBCCDF" wp14:editId="7EDB4DDA">
+            <wp:extent cx="5731510" cy="2428875"/>
+            <wp:effectExtent l="0" t="0" r="2540" b="9525"/>
+            <wp:docPr id="1530430018" name="Picture 1"/>
+            <wp:cNvGraphicFramePr>
+              <a:graphicFrameLocks xmlns:a="http://schemas.openxmlformats.org/drawingml/2006/main" noChangeAspect="1"/>
+            </wp:cNvGraphicFramePr>
+            <a:graphic xmlns:a="http://schemas.openxmlformats.org/drawingml/2006/main">
+              <a:graphicData uri="http://schemas.openxmlformats.org/drawingml/2006/picture">
+                <pic:pic xmlns:pic="http://schemas.openxmlformats.org/drawingml/2006/picture">
+                  <pic:nvPicPr>
+                    <pic:cNvPr id="1530430018" name=""/>
+                    <pic:cNvPicPr/>
+                  </pic:nvPicPr>
+                  <pic:blipFill>
+                    <a:blip r:embed="rId75"/>
+                    <a:stretch>
+                      <a:fillRect/>
+                    </a:stretch>
+                  </pic:blipFill>
+                  <pic:spPr>
+                    <a:xfrm>
+                      <a:off x="0" y="0"/>
+                      <a:ext cx="5731510" cy="2428875"/>
+                    </a:xfrm>
+                    <a:prstGeom prst="rect">
+                      <a:avLst/>
+                    </a:prstGeom>
+                  </pic:spPr>
+                </pic:pic>
+              </a:graphicData>
+            </a:graphic>
+          </wp:inline>
+        </w:drawing>
+      </w:r>
+    </w:p>
+    <w:p>
+      <w:pPr>
+        <w:pStyle w:val="ListParagraph"/>
+        <w:rPr>
+          <w:b/>
+          <w:bCs/>
+        </w:rPr>
+      </w:pPr>
+    </w:p>
+    <w:p>
+      <w:pPr>
+        <w:rPr>
+          <w:b/>
+          <w:bCs/>
+        </w:rPr>
+      </w:pPr>
+      <w:r>
+        <w:rPr>
+          <w:b/>
+          <w:bCs/>
+        </w:rPr>
+        <w:br w:type="page"/>
+      </w:r>
+    </w:p>
+    <w:p>
+      <w:pPr>
+        <w:pStyle w:val="ListParagraph"/>
+        <w:jc w:val="center"/>
+        <w:rPr>
+          <w:b/>
+          <w:bCs/>
+        </w:rPr>
+      </w:pPr>
+      <w:r>
+        <w:rPr>
+          <w:b/>
+          <w:bCs/>
+        </w:rPr>
+        <w:lastRenderedPageBreak/>
+        <w:t>Dashboard Design and Visualization</w:t>
+      </w:r>
+    </w:p>
+    <w:p>
+      <w:pPr>
+        <w:pStyle w:val="ListParagraph"/>
+        <w:jc w:val="center"/>
+        <w:rPr>
+          <w:b/>
+          <w:bCs/>
+        </w:rPr>
+      </w:pPr>
+    </w:p>
+    <w:p>
+      <w:pPr>
+        <w:pStyle w:val="ListParagraph"/>
+        <w:rPr>
+          <w:b/>
+          <w:bCs/>
+        </w:rPr>
+      </w:pPr>
+    </w:p>
     <w:sectPr>
       <w:pgSz w:w="11906" w:h="16838"/>
       <w:pgMar w:top="1440" w:right="1440" w:bottom="1440" w:left="1440" w:header="708" w:footer="708" w:gutter="0"/>
@@ -3714,6 +5193,56 @@
 </w:document>
 </file>
 
+<file path=word/endnotes.xml><?xml version="1.0" encoding="utf-8"?>
+<w:endnotes xmlns:wpc="http://schemas.microsoft.com/office/word/2010/wordprocessingCanvas" xmlns:cx="http://schemas.microsoft.com/office/drawing/2014/chartex" xmlns:cx1="http://schemas.microsoft.com/office/drawing/2015/9/8/chartex" xmlns:cx2="http://schemas.microsoft.com/office/drawing/2015/10/21/chartex" xmlns:cx3="http://schemas.microsoft.com/office/drawing/2016/5/9/chartex" xmlns:cx4="http://schemas.microsoft.com/office/drawing/2016/5/10/chartex" xmlns:cx5="http://schemas.microsoft.com/office/drawing/2016/5/11/chartex" xmlns:cx6="http://schemas.microsoft.com/office/drawing/2016/5/12/chartex" xmlns:cx7="http://schemas.microsoft.com/office/drawing/2016/5/13/chartex" xmlns:cx8="http://schemas.microsoft.com/office/drawing/2016/5/14/chartex" xmlns:mc="http://schemas.openxmlformats.org/markup-compatibility/2006" xmlns:aink="http://schemas.microsoft.com/office/drawing/2016/ink" xmlns:am3d="http://schemas.microsoft.com/office/drawing/2017/model3d" xmlns:o="urn:schemas-microsoft-com:office:office" xmlns:oel="http://schemas.microsoft.com/office/2019/extlst" xmlns:r="http://schemas.openxmlformats.org/officeDocument/2006/relationships" xmlns:m="http://schemas.openxmlformats.org/officeDocument/2006/math" xmlns:v="urn:schemas-microsoft-com:vml" xmlns:wp14="http://schemas.microsoft.com/office/word/2010/wordprocessingDrawing" xmlns:wp="http://schemas.openxmlformats.org/drawingml/2006/wordprocessingDrawing" xmlns:w10="urn:schemas-microsoft-com:office:word" xmlns:w="http://schemas.openxmlformats.org/wordprocessingml/2006/main" xmlns:w14="http://schemas.microsoft.com/office/word/2010/wordml" xmlns:w15="http://schemas.microsoft.com/office/word/2012/wordml" xmlns:w16cex="http://schemas.microsoft.com/office/word/2018/wordml/cex" xmlns:w16cid="http://schemas.microsoft.com/office/word/2016/wordml/cid" xmlns:w16="http://schemas.microsoft.com/office/word/2018/wordml" xmlns:w16du="http://schemas.microsoft.com/office/word/2023/wordml/word16du" xmlns:w16sdtdh="http://schemas.microsoft.com/office/word/2020/wordml/sdtdatahash" xmlns:w16sdtfl="http://schemas.microsoft.com/office/word/2024/wordml/sdtformatlock" xmlns:w16se="http://schemas.microsoft.com/office/word/2015/wordml/symex" xmlns:wpg="http://schemas.microsoft.com/office/word/2010/wordprocessingGroup" xmlns:wpi="http://schemas.microsoft.com/office/word/2010/wordprocessingInk" xmlns:wne="http://schemas.microsoft.com/office/word/2006/wordml" xmlns:wps="http://schemas.microsoft.com/office/word/2010/wordprocessingShape" mc:Ignorable="w14 w15 w16se w16cid w16 w16cex w16sdtdh w16sdtfl w16du wp14">
+  <w:endnote w:type="separator" w:id="-1">
+    <w:p>
+      <w:pPr>
+        <w:spacing w:after="0" w:line="240" w:lineRule="auto"/>
+      </w:pPr>
+      <w:r>
+        <w:separator/>
+      </w:r>
+    </w:p>
+  </w:endnote>
+  <w:endnote w:type="continuationSeparator" w:id="0">
+    <w:p>
+      <w:pPr>
+        <w:spacing w:after="0" w:line="240" w:lineRule="auto"/>
+      </w:pPr>
+      <w:r>
+        <w:continuationSeparator/>
+      </w:r>
+    </w:p>
+  </w:endnote>
+</w:endnotes>
+</file>
+
+<file path=word/footnotes.xml><?xml version="1.0" encoding="utf-8"?>
+<w:footnotes xmlns:wpc="http://schemas.microsoft.com/office/word/2010/wordprocessingCanvas" xmlns:cx="http://schemas.microsoft.com/office/drawing/2014/chartex" xmlns:cx1="http://schemas.microsoft.com/office/drawing/2015/9/8/chartex" xmlns:cx2="http://schemas.microsoft.com/office/drawing/2015/10/21/chartex" xmlns:cx3="http://schemas.microsoft.com/office/drawing/2016/5/9/chartex" xmlns:cx4="http://schemas.microsoft.com/office/drawing/2016/5/10/chartex" xmlns:cx5="http://schemas.microsoft.com/office/drawing/2016/5/11/chartex" xmlns:cx6="http://schemas.microsoft.com/office/drawing/2016/5/12/chartex" xmlns:cx7="http://schemas.microsoft.com/office/drawing/2016/5/13/chartex" xmlns:cx8="http://schemas.microsoft.com/office/drawing/2016/5/14/chartex" xmlns:mc="http://schemas.openxmlformats.org/markup-compatibility/2006" xmlns:aink="http://schemas.microsoft.com/office/drawing/2016/ink" xmlns:am3d="http://schemas.microsoft.com/office/drawing/2017/model3d" xmlns:o="urn:schemas-microsoft-com:office:office" xmlns:oel="http://schemas.microsoft.com/office/2019/extlst" xmlns:r="http://schemas.openxmlformats.org/officeDocument/2006/relationships" xmlns:m="http://schemas.openxmlformats.org/officeDocument/2006/math" xmlns:v="urn:schemas-microsoft-com:vml" xmlns:wp14="http://schemas.microsoft.com/office/word/2010/wordprocessingDrawing" xmlns:wp="http://schemas.openxmlformats.org/drawingml/2006/wordprocessingDrawing" xmlns:w10="urn:schemas-microsoft-com:office:word" xmlns:w="http://schemas.openxmlformats.org/wordprocessingml/2006/main" xmlns:w14="http://schemas.microsoft.com/office/word/2010/wordml" xmlns:w15="http://schemas.microsoft.com/office/word/2012/wordml" xmlns:w16cex="http://schemas.microsoft.com/office/word/2018/wordml/cex" xmlns:w16cid="http://schemas.microsoft.com/office/word/2016/wordml/cid" xmlns:w16="http://schemas.microsoft.com/office/word/2018/wordml" xmlns:w16du="http://schemas.microsoft.com/office/word/2023/wordml/word16du" xmlns:w16sdtdh="http://schemas.microsoft.com/office/word/2020/wordml/sdtdatahash" xmlns:w16sdtfl="http://schemas.microsoft.com/office/word/2024/wordml/sdtformatlock" xmlns:w16se="http://schemas.microsoft.com/office/word/2015/wordml/symex" xmlns:wpg="http://schemas.microsoft.com/office/word/2010/wordprocessingGroup" xmlns:wpi="http://schemas.microsoft.com/office/word/2010/wordprocessingInk" xmlns:wne="http://schemas.microsoft.com/office/word/2006/wordml" xmlns:wps="http://schemas.microsoft.com/office/word/2010/wordprocessingShape" mc:Ignorable="w14 w15 w16se w16cid w16 w16cex w16sdtdh w16sdtfl w16du wp14">
+  <w:footnote w:type="separator" w:id="-1">
+    <w:p>
+      <w:pPr>
+        <w:spacing w:after="0" w:line="240" w:lineRule="auto"/>
+      </w:pPr>
+      <w:r>
+        <w:separator/>
+      </w:r>
+    </w:p>
+  </w:footnote>
+  <w:footnote w:type="continuationSeparator" w:id="0">
+    <w:p>
+      <w:pPr>
+        <w:spacing w:after="0" w:line="240" w:lineRule="auto"/>
+      </w:pPr>
+      <w:r>
+        <w:continuationSeparator/>
+      </w:r>
+    </w:p>
+  </w:footnote>
+</w:footnotes>
+</file>
+
 <file path=word/numbering.xml><?xml version="1.0" encoding="utf-8"?>
 <w:numbering xmlns:wpc="http://schemas.microsoft.com/office/word/2010/wordprocessingCanvas" xmlns:cx="http://schemas.microsoft.com/office/drawing/2014/chartex" xmlns:cx1="http://schemas.microsoft.com/office/drawing/2015/9/8/chartex" xmlns:cx2="http://schemas.microsoft.com/office/drawing/2015/10/21/chartex" xmlns:cx3="http://schemas.microsoft.com/office/drawing/2016/5/9/chartex" xmlns:cx4="http://schemas.microsoft.com/office/drawing/2016/5/10/chartex" xmlns:cx5="http://schemas.microsoft.com/office/drawing/2016/5/11/chartex" xmlns:cx6="http://schemas.microsoft.com/office/drawing/2016/5/12/chartex" xmlns:cx7="http://schemas.microsoft.com/office/drawing/2016/5/13/chartex" xmlns:cx8="http://schemas.microsoft.com/office/drawing/2016/5/14/chartex" xmlns:mc="http://schemas.openxmlformats.org/markup-compatibility/2006" xmlns:aink="http://schemas.microsoft.com/office/drawing/2016/ink" xmlns:am3d="http://schemas.microsoft.com/office/drawing/2017/model3d" xmlns:o="urn:schemas-microsoft-com:office:office" xmlns:oel="http://schemas.microsoft.com/office/2019/extlst" xmlns:r="http://schemas.openxmlformats.org/officeDocument/2006/relationships" xmlns:m="http://schemas.openxmlformats.org/officeDocument/2006/math" xmlns:v="urn:schemas-microsoft-com:vml" xmlns:wp14="http://schemas.microsoft.com/office/word/2010/wordprocessingDrawing" xmlns:wp="http://schemas.openxmlformats.org/drawingml/2006/wordprocessingDrawing" xmlns:w10="urn:schemas-microsoft-com:office:word" xmlns:w="http://schemas.openxmlformats.org/wordprocessingml/2006/main" xmlns:w14="http://schemas.microsoft.com/office/word/2010/wordml" xmlns:w15="http://schemas.microsoft.com/office/word/2012/wordml" xmlns:w16cex="http://schemas.microsoft.com/office/word/2018/wordml/cex" xmlns:w16cid="http://schemas.microsoft.com/office/word/2016/wordml/cid" xmlns:w16="http://schemas.microsoft.com/office/word/2018/wordml" xmlns:w16du="http://schemas.microsoft.com/office/word/2023/wordml/word16du" xmlns:w16sdtdh="http://schemas.microsoft.com/office/word/2020/wordml/sdtdatahash" xmlns:w16sdtfl="http://schemas.microsoft.com/office/word/2024/wordml/sdtformatlock" xmlns:w16se="http://schemas.microsoft.com/office/word/2015/wordml/symex" xmlns:wpg="http://schemas.microsoft.com/office/word/2010/wordprocessingGroup" xmlns:wpi="http://schemas.microsoft.com/office/word/2010/wordprocessingInk" xmlns:wne="http://schemas.microsoft.com/office/word/2006/wordml" xmlns:wps="http://schemas.microsoft.com/office/word/2010/wordprocessingShape" mc:Ignorable="w14 w15 w16se w16cid w16 w16cex w16sdtdh w16sdtfl w16du wp14">
   <w:abstractNum w:abstractNumId="0" w15:restartNumberingAfterBreak="0">
@@ -4251,6 +5780,95 @@
     </w:lvl>
   </w:abstractNum>
   <w:abstractNum w:abstractNumId="6" w15:restartNumberingAfterBreak="0">
+    <w:nsid w:val="641D6A56"/>
+    <w:multiLevelType w:val="hybridMultilevel"/>
+    <w:tmpl w:val="020016B2"/>
+    <w:lvl w:ilvl="0" w:tplc="2000000F">
+      <w:start w:val="1"/>
+      <w:numFmt w:val="decimal"/>
+      <w:lvlText w:val="%1."/>
+      <w:lvlJc w:val="left"/>
+      <w:pPr>
+        <w:ind w:left="720" w:hanging="360"/>
+      </w:pPr>
+      <w:rPr>
+        <w:rFonts w:hint="default"/>
+      </w:rPr>
+    </w:lvl>
+    <w:lvl w:ilvl="1" w:tplc="20000019" w:tentative="1">
+      <w:start w:val="1"/>
+      <w:numFmt w:val="lowerLetter"/>
+      <w:lvlText w:val="%2."/>
+      <w:lvlJc w:val="left"/>
+      <w:pPr>
+        <w:ind w:left="1440" w:hanging="360"/>
+      </w:pPr>
+    </w:lvl>
+    <w:lvl w:ilvl="2" w:tplc="2000001B" w:tentative="1">
+      <w:start w:val="1"/>
+      <w:numFmt w:val="lowerRoman"/>
+      <w:lvlText w:val="%3."/>
+      <w:lvlJc w:val="right"/>
+      <w:pPr>
+        <w:ind w:left="2160" w:hanging="180"/>
+      </w:pPr>
+    </w:lvl>
+    <w:lvl w:ilvl="3" w:tplc="2000000F" w:tentative="1">
+      <w:start w:val="1"/>
+      <w:numFmt w:val="decimal"/>
+      <w:lvlText w:val="%4."/>
+      <w:lvlJc w:val="left"/>
+      <w:pPr>
+        <w:ind w:left="2880" w:hanging="360"/>
+      </w:pPr>
+    </w:lvl>
+    <w:lvl w:ilvl="4" w:tplc="20000019" w:tentative="1">
+      <w:start w:val="1"/>
+      <w:numFmt w:val="lowerLetter"/>
+      <w:lvlText w:val="%5."/>
+      <w:lvlJc w:val="left"/>
+      <w:pPr>
+        <w:ind w:left="3600" w:hanging="360"/>
+      </w:pPr>
+    </w:lvl>
+    <w:lvl w:ilvl="5" w:tplc="2000001B" w:tentative="1">
+      <w:start w:val="1"/>
+      <w:numFmt w:val="lowerRoman"/>
+      <w:lvlText w:val="%6."/>
+      <w:lvlJc w:val="right"/>
+      <w:pPr>
+        <w:ind w:left="4320" w:hanging="180"/>
+      </w:pPr>
+    </w:lvl>
+    <w:lvl w:ilvl="6" w:tplc="2000000F" w:tentative="1">
+      <w:start w:val="1"/>
+      <w:numFmt w:val="decimal"/>
+      <w:lvlText w:val="%7."/>
+      <w:lvlJc w:val="left"/>
+      <w:pPr>
+        <w:ind w:left="5040" w:hanging="360"/>
+      </w:pPr>
+    </w:lvl>
+    <w:lvl w:ilvl="7" w:tplc="20000019" w:tentative="1">
+      <w:start w:val="1"/>
+      <w:numFmt w:val="lowerLetter"/>
+      <w:lvlText w:val="%8."/>
+      <w:lvlJc w:val="left"/>
+      <w:pPr>
+        <w:ind w:left="5760" w:hanging="360"/>
+      </w:pPr>
+    </w:lvl>
+    <w:lvl w:ilvl="8" w:tplc="2000001B" w:tentative="1">
+      <w:start w:val="1"/>
+      <w:numFmt w:val="lowerRoman"/>
+      <w:lvlText w:val="%9."/>
+      <w:lvlJc w:val="right"/>
+      <w:pPr>
+        <w:ind w:left="6480" w:hanging="180"/>
+      </w:pPr>
+    </w:lvl>
+  </w:abstractNum>
+  <w:abstractNum w:abstractNumId="7" w15:restartNumberingAfterBreak="0">
     <w:nsid w:val="64ED20C3"/>
     <w:multiLevelType w:val="hybridMultilevel"/>
     <w:tmpl w:val="3EFEE998"/>
@@ -4336,6 +5954,95 @@
       <w:lvlJc w:val="right"/>
       <w:pPr>
         <w:ind w:left="6840" w:hanging="180"/>
+      </w:pPr>
+    </w:lvl>
+  </w:abstractNum>
+  <w:abstractNum w:abstractNumId="8" w15:restartNumberingAfterBreak="0">
+    <w:nsid w:val="71256140"/>
+    <w:multiLevelType w:val="hybridMultilevel"/>
+    <w:tmpl w:val="388A6F14"/>
+    <w:lvl w:ilvl="0" w:tplc="2000000F">
+      <w:start w:val="1"/>
+      <w:numFmt w:val="decimal"/>
+      <w:lvlText w:val="%1."/>
+      <w:lvlJc w:val="left"/>
+      <w:pPr>
+        <w:ind w:left="720" w:hanging="360"/>
+      </w:pPr>
+      <w:rPr>
+        <w:rFonts w:hint="default"/>
+      </w:rPr>
+    </w:lvl>
+    <w:lvl w:ilvl="1" w:tplc="20000019" w:tentative="1">
+      <w:start w:val="1"/>
+      <w:numFmt w:val="lowerLetter"/>
+      <w:lvlText w:val="%2."/>
+      <w:lvlJc w:val="left"/>
+      <w:pPr>
+        <w:ind w:left="1440" w:hanging="360"/>
+      </w:pPr>
+    </w:lvl>
+    <w:lvl w:ilvl="2" w:tplc="2000001B" w:tentative="1">
+      <w:start w:val="1"/>
+      <w:numFmt w:val="lowerRoman"/>
+      <w:lvlText w:val="%3."/>
+      <w:lvlJc w:val="right"/>
+      <w:pPr>
+        <w:ind w:left="2160" w:hanging="180"/>
+      </w:pPr>
+    </w:lvl>
+    <w:lvl w:ilvl="3" w:tplc="2000000F" w:tentative="1">
+      <w:start w:val="1"/>
+      <w:numFmt w:val="decimal"/>
+      <w:lvlText w:val="%4."/>
+      <w:lvlJc w:val="left"/>
+      <w:pPr>
+        <w:ind w:left="2880" w:hanging="360"/>
+      </w:pPr>
+    </w:lvl>
+    <w:lvl w:ilvl="4" w:tplc="20000019" w:tentative="1">
+      <w:start w:val="1"/>
+      <w:numFmt w:val="lowerLetter"/>
+      <w:lvlText w:val="%5."/>
+      <w:lvlJc w:val="left"/>
+      <w:pPr>
+        <w:ind w:left="3600" w:hanging="360"/>
+      </w:pPr>
+    </w:lvl>
+    <w:lvl w:ilvl="5" w:tplc="2000001B" w:tentative="1">
+      <w:start w:val="1"/>
+      <w:numFmt w:val="lowerRoman"/>
+      <w:lvlText w:val="%6."/>
+      <w:lvlJc w:val="right"/>
+      <w:pPr>
+        <w:ind w:left="4320" w:hanging="180"/>
+      </w:pPr>
+    </w:lvl>
+    <w:lvl w:ilvl="6" w:tplc="2000000F" w:tentative="1">
+      <w:start w:val="1"/>
+      <w:numFmt w:val="decimal"/>
+      <w:lvlText w:val="%7."/>
+      <w:lvlJc w:val="left"/>
+      <w:pPr>
+        <w:ind w:left="5040" w:hanging="360"/>
+      </w:pPr>
+    </w:lvl>
+    <w:lvl w:ilvl="7" w:tplc="20000019" w:tentative="1">
+      <w:start w:val="1"/>
+      <w:numFmt w:val="lowerLetter"/>
+      <w:lvlText w:val="%8."/>
+      <w:lvlJc w:val="left"/>
+      <w:pPr>
+        <w:ind w:left="5760" w:hanging="360"/>
+      </w:pPr>
+    </w:lvl>
+    <w:lvl w:ilvl="8" w:tplc="2000001B" w:tentative="1">
+      <w:start w:val="1"/>
+      <w:numFmt w:val="lowerRoman"/>
+      <w:lvlText w:val="%9."/>
+      <w:lvlJc w:val="right"/>
+      <w:pPr>
+        <w:ind w:left="6480" w:hanging="180"/>
       </w:pPr>
     </w:lvl>
   </w:abstractNum>
@@ -4349,7 +6056,7 @@
     <w:abstractNumId w:val="4"/>
   </w:num>
   <w:num w:numId="4" w16cid:durableId="1234662527">
-    <w:abstractNumId w:val="6"/>
+    <w:abstractNumId w:val="7"/>
   </w:num>
   <w:num w:numId="5" w16cid:durableId="1888492527">
     <w:abstractNumId w:val="3"/>
@@ -4359,6 +6066,12 @@
   </w:num>
   <w:num w:numId="7" w16cid:durableId="1539581268">
     <w:abstractNumId w:val="2"/>
+  </w:num>
+  <w:num w:numId="8" w16cid:durableId="923762570">
+    <w:abstractNumId w:val="8"/>
+  </w:num>
+  <w:num w:numId="9" w16cid:durableId="1917548731">
+    <w:abstractNumId w:val="6"/>
   </w:num>
 </w:numbering>
 </file>
@@ -5302,6 +7015,50 @@
       <w:shd w:val="clear" w:color="auto" w:fill="E1DFDD"/>
     </w:rPr>
   </w:style>
+  <w:style w:type="paragraph" w:styleId="Header">
+    <w:name w:val="header"/>
+    <w:basedOn w:val="Normal"/>
+    <w:link w:val="HeaderChar"/>
+    <w:uiPriority w:val="99"/>
+    <w:unhideWhenUsed/>
+    <w:rsid w:val="009E3D3D"/>
+    <w:pPr>
+      <w:tabs>
+        <w:tab w:val="center" w:pos="4513"/>
+        <w:tab w:val="right" w:pos="9026"/>
+      </w:tabs>
+      <w:spacing w:after="0" w:line="240" w:lineRule="auto"/>
+    </w:pPr>
+  </w:style>
+  <w:style w:type="character" w:customStyle="1" w:styleId="HeaderChar">
+    <w:name w:val="Header Char"/>
+    <w:basedOn w:val="DefaultParagraphFont"/>
+    <w:link w:val="Header"/>
+    <w:uiPriority w:val="99"/>
+    <w:rsid w:val="009E3D3D"/>
+  </w:style>
+  <w:style w:type="paragraph" w:styleId="Footer">
+    <w:name w:val="footer"/>
+    <w:basedOn w:val="Normal"/>
+    <w:link w:val="FooterChar"/>
+    <w:uiPriority w:val="99"/>
+    <w:unhideWhenUsed/>
+    <w:rsid w:val="009E3D3D"/>
+    <w:pPr>
+      <w:tabs>
+        <w:tab w:val="center" w:pos="4513"/>
+        <w:tab w:val="right" w:pos="9026"/>
+      </w:tabs>
+      <w:spacing w:after="0" w:line="240" w:lineRule="auto"/>
+    </w:pPr>
+  </w:style>
+  <w:style w:type="character" w:customStyle="1" w:styleId="FooterChar">
+    <w:name w:val="Footer Char"/>
+    <w:basedOn w:val="DefaultParagraphFont"/>
+    <w:link w:val="Footer"/>
+    <w:uiPriority w:val="99"/>
+    <w:rsid w:val="009E3D3D"/>
+  </w:style>
 </w:styles>
 </file>
 

</xml_diff>